<commit_message>
data injected to document from section lv
</commit_message>
<xml_diff>
--- a/public/medical-rerpot-template.docx
+++ b/public/medical-rerpot-template.docx
@@ -446,7 +446,6 @@
                 <w:bCs/>
                 <w:sz w:val="28"/>
                 <w:szCs w:val="28"/>
-                <w:lang w:val="en-US"/>
               </w:rPr>
               <w:t xml:space="preserve">Talla: </w:t>
             </w:r>
@@ -455,7 +454,6 @@
                 <w:sz w:val="28"/>
                 <w:szCs w:val="28"/>
                 <w:u w:val="single"/>
-                <w:lang w:val="en-US"/>
               </w:rPr>
               <w:t>{height}</w:t>
             </w:r>
@@ -464,7 +462,6 @@
                 <w:sz w:val="28"/>
                 <w:szCs w:val="28"/>
                 <w:u w:val="single"/>
-                <w:lang w:val="en-US"/>
               </w:rPr>
               <w:t xml:space="preserve"> mts.</w:t>
             </w:r>
@@ -472,7 +469,6 @@
               <w:rPr>
                 <w:sz w:val="28"/>
                 <w:szCs w:val="28"/>
-                <w:lang w:val="en-US"/>
               </w:rPr>
               <w:t xml:space="preserve"> </w:t>
             </w:r>
@@ -480,7 +476,6 @@
               <w:rPr>
                 <w:sz w:val="28"/>
                 <w:szCs w:val="28"/>
-                <w:lang w:val="en-US"/>
               </w:rPr>
               <w:t xml:space="preserve"> </w:t>
             </w:r>
@@ -1032,13 +1027,27 @@
         <w:rPr>
           <w:lang w:val="es-ES"/>
         </w:rPr>
-        <w:t xml:space="preserve"> indexado 2.</w:t>
-      </w:r>
-      <w:r>
-        <w:rPr>
-          <w:lang w:val="es-ES"/>
-        </w:rPr>
-        <w:t>40</w:t>
+        <w:t xml:space="preserve"> indexado </w:t>
+      </w:r>
+      <w:r>
+        <w:rPr>
+          <w:lang w:val="es-ES"/>
+        </w:rPr>
+        <w:t>{</w:t>
+      </w:r>
+      <w:proofErr w:type="spellStart"/>
+      <w:r>
+        <w:rPr>
+          <w:lang w:val="es-ES"/>
+        </w:rPr>
+        <w:t>ilvedd</w:t>
+      </w:r>
+      <w:proofErr w:type="spellEnd"/>
+      <w:r>
+        <w:rPr>
+          <w:lang w:val="es-ES"/>
+        </w:rPr>
+        <w:t>}</w:t>
       </w:r>
       <w:r>
         <w:rPr>
@@ -1077,13 +1086,21 @@
         <w:rPr>
           <w:lang w:val="es-ES"/>
         </w:rPr>
-        <w:t>54</w:t>
-      </w:r>
-      <w:r>
-        <w:rPr>
-          <w:lang w:val="es-ES"/>
-        </w:rPr>
-        <w:t>.4</w:t>
+        <w:t>{</w:t>
+      </w:r>
+      <w:proofErr w:type="spellStart"/>
+      <w:r>
+        <w:rPr>
+          <w:lang w:val="es-ES"/>
+        </w:rPr>
+        <w:t>ilvedv</w:t>
+      </w:r>
+      <w:proofErr w:type="spellEnd"/>
+      <w:r>
+        <w:rPr>
+          <w:lang w:val="es-ES"/>
+        </w:rPr>
+        <w:t>}</w:t>
       </w:r>
       <w:r>
         <w:rPr>
@@ -1108,7 +1125,21 @@
         <w:rPr>
           <w:lang w:val="es-ES"/>
         </w:rPr>
-        <w:t>57.5</w:t>
+        <w:t>{</w:t>
+      </w:r>
+      <w:proofErr w:type="spellStart"/>
+      <w:r>
+        <w:rPr>
+          <w:lang w:val="es-ES"/>
+        </w:rPr>
+        <w:t>ilvmass</w:t>
+      </w:r>
+      <w:proofErr w:type="spellEnd"/>
+      <w:r>
+        <w:rPr>
+          <w:lang w:val="es-ES"/>
+        </w:rPr>
+        <w:t>}</w:t>
       </w:r>
       <w:r>
         <w:rPr>
@@ -1147,7 +1178,21 @@
         <w:rPr>
           <w:lang w:val="es-ES"/>
         </w:rPr>
-        <w:t>0.80</w:t>
+        <w:t>{</w:t>
+      </w:r>
+      <w:proofErr w:type="spellStart"/>
+      <w:r>
+        <w:rPr>
+          <w:lang w:val="es-ES"/>
+        </w:rPr>
+        <w:t>ivsd</w:t>
+      </w:r>
+      <w:proofErr w:type="spellEnd"/>
+      <w:r>
+        <w:rPr>
+          <w:lang w:val="es-ES"/>
+        </w:rPr>
+        <w:t>}</w:t>
       </w:r>
       <w:r>
         <w:rPr>
@@ -1167,13 +1212,27 @@
         <w:rPr>
           <w:lang w:val="es-ES"/>
         </w:rPr>
-        <w:t>: 4.</w:t>
-      </w:r>
-      <w:r>
-        <w:rPr>
-          <w:lang w:val="es-ES"/>
-        </w:rPr>
-        <w:t>2</w:t>
+        <w:t xml:space="preserve">: </w:t>
+      </w:r>
+      <w:r>
+        <w:rPr>
+          <w:lang w:val="es-ES"/>
+        </w:rPr>
+        <w:t>{</w:t>
+      </w:r>
+      <w:proofErr w:type="spellStart"/>
+      <w:r>
+        <w:rPr>
+          <w:lang w:val="es-ES"/>
+        </w:rPr>
+        <w:t>lvided</w:t>
+      </w:r>
+      <w:proofErr w:type="spellEnd"/>
+      <w:r>
+        <w:rPr>
+          <w:lang w:val="es-ES"/>
+        </w:rPr>
+        <w:t>}</w:t>
       </w:r>
       <w:r>
         <w:rPr>
@@ -1199,19 +1258,47 @@
         <w:rPr>
           <w:lang w:val="es-ES"/>
         </w:rPr>
-        <w:t>0.78</w:t>
-      </w:r>
-      <w:r>
-        <w:rPr>
-          <w:lang w:val="es-ES"/>
-        </w:rPr>
-        <w:t xml:space="preserve"> cm, grosor parietal relativo 0.</w:t>
-      </w:r>
-      <w:r>
-        <w:rPr>
-          <w:lang w:val="es-ES"/>
-        </w:rPr>
-        <w:t>37</w:t>
+        <w:t>{</w:t>
+      </w:r>
+      <w:proofErr w:type="spellStart"/>
+      <w:r>
+        <w:rPr>
+          <w:lang w:val="es-ES"/>
+        </w:rPr>
+        <w:t>lvpwd</w:t>
+      </w:r>
+      <w:proofErr w:type="spellEnd"/>
+      <w:r>
+        <w:rPr>
+          <w:lang w:val="es-ES"/>
+        </w:rPr>
+        <w:t>}</w:t>
+      </w:r>
+      <w:r>
+        <w:rPr>
+          <w:lang w:val="es-ES"/>
+        </w:rPr>
+        <w:t xml:space="preserve"> cm, grosor parietal relativo </w:t>
+      </w:r>
+      <w:r>
+        <w:rPr>
+          <w:lang w:val="es-ES"/>
+        </w:rPr>
+        <w:t>{</w:t>
+      </w:r>
+      <w:proofErr w:type="spellStart"/>
+      <w:r>
+        <w:rPr>
+          <w:lang w:val="es-ES"/>
+        </w:rPr>
+        <w:t>lvrwt</w:t>
+      </w:r>
+      <w:proofErr w:type="spellEnd"/>
+      <w:r>
+        <w:rPr>
+          <w:lang w:val="es-ES"/>
+        </w:rPr>
+        <w:t>}</w:t>
       </w:r>
       <w:r>
         <w:rPr>
@@ -1237,7 +1324,19 @@
         <w:rPr>
           <w:lang w:val="es-ES"/>
         </w:rPr>
-        <w:t>94.17</w:t>
+        <w:t>{</w:t>
+      </w:r>
+      <w:r>
+        <w:rPr>
+          <w:lang w:val="es-ES"/>
+        </w:rPr>
+        <w:t>lvedv</w:t>
+      </w:r>
+      <w:r>
+        <w:rPr>
+          <w:lang w:val="es-ES"/>
+        </w:rPr>
+        <w:t>}</w:t>
       </w:r>
       <w:r>
         <w:rPr>
@@ -1263,31 +1362,65 @@
         <w:rPr>
           <w:lang w:val="es-ES"/>
         </w:rPr>
-        <w:t>28.87</w:t>
-      </w:r>
-      <w:r>
-        <w:rPr>
-          <w:lang w:val="es-ES"/>
-        </w:rPr>
-        <w:t xml:space="preserve"> ml, FEVI: 6</w:t>
-      </w:r>
-      <w:r>
-        <w:rPr>
-          <w:lang w:val="es-ES"/>
-        </w:rPr>
-        <w:t>9.48</w:t>
-      </w:r>
-      <w:r>
-        <w:rPr>
-          <w:lang w:val="es-ES"/>
-        </w:rPr>
-        <w:t xml:space="preserve"> % por método biplano. Flujograma </w:t>
+        <w:t>{</w:t>
       </w:r>
       <w:proofErr w:type="spellStart"/>
       <w:r>
         <w:rPr>
           <w:lang w:val="es-ES"/>
         </w:rPr>
+        <w:t>lvesv</w:t>
+      </w:r>
+      <w:proofErr w:type="spellEnd"/>
+      <w:r>
+        <w:rPr>
+          <w:lang w:val="es-ES"/>
+        </w:rPr>
+        <w:t>}</w:t>
+      </w:r>
+      <w:r>
+        <w:rPr>
+          <w:lang w:val="es-ES"/>
+        </w:rPr>
+        <w:t xml:space="preserve"> ml, FEVI: </w:t>
+      </w:r>
+      <w:r>
+        <w:rPr>
+          <w:lang w:val="es-ES"/>
+        </w:rPr>
+        <w:t>{</w:t>
+      </w:r>
+      <w:proofErr w:type="spellStart"/>
+      <w:r>
+        <w:rPr>
+          <w:lang w:val="es-ES"/>
+        </w:rPr>
+        <w:t>lvef</w:t>
+      </w:r>
+      <w:proofErr w:type="spellEnd"/>
+      <w:r>
+        <w:rPr>
+          <w:lang w:val="es-ES"/>
+        </w:rPr>
+        <w:t>}</w:t>
+      </w:r>
+      <w:r>
+        <w:rPr>
+          <w:lang w:val="es-ES"/>
+        </w:rPr>
+        <w:t xml:space="preserve"> </w:t>
+      </w:r>
+      <w:r>
+        <w:rPr>
+          <w:lang w:val="es-ES"/>
+        </w:rPr>
+        <w:t xml:space="preserve">% por método biplano. Flujograma </w:t>
+      </w:r>
+      <w:proofErr w:type="spellStart"/>
+      <w:r>
+        <w:rPr>
+          <w:lang w:val="es-ES"/>
+        </w:rPr>
         <w:t>transmitral</w:t>
       </w:r>
       <w:proofErr w:type="spellEnd"/>
@@ -1301,294 +1434,480 @@
         <w:rPr>
           <w:lang w:val="es-ES"/>
         </w:rPr>
-        <w:t>4</w:t>
-      </w:r>
-      <w:r>
-        <w:rPr>
-          <w:lang w:val="es-ES"/>
-        </w:rPr>
-        <w:t>8</w:t>
-      </w:r>
-      <w:r>
-        <w:rPr>
+        <w:t>{</w:t>
+      </w:r>
+      <w:proofErr w:type="spellStart"/>
+      <w:r>
+        <w:rPr>
+          <w:lang w:val="es-ES"/>
+        </w:rPr>
+        <w:t>eWave</w:t>
+      </w:r>
+      <w:proofErr w:type="spellEnd"/>
+      <w:r>
+        <w:rPr>
+          <w:lang w:val="es-ES"/>
+        </w:rPr>
+        <w:t>}</w:t>
+      </w:r>
+      <w:r>
+        <w:rPr>
+          <w:lang w:val="es-ES"/>
+        </w:rPr>
+        <w:t xml:space="preserve"> cm/s, onda A: </w:t>
+      </w:r>
+      <w:r>
+        <w:rPr>
+          <w:lang w:val="es-ES"/>
+        </w:rPr>
+        <w:t>{</w:t>
+      </w:r>
+      <w:proofErr w:type="spellStart"/>
+      <w:r>
+        <w:rPr>
+          <w:lang w:val="es-ES"/>
+        </w:rPr>
+        <w:t>aWave</w:t>
+      </w:r>
+      <w:proofErr w:type="spellEnd"/>
+      <w:r>
+        <w:rPr>
+          <w:lang w:val="es-ES"/>
+        </w:rPr>
+        <w:t>}</w:t>
+      </w:r>
+      <w:r>
+        <w:rPr>
+          <w:lang w:val="es-ES"/>
+        </w:rPr>
+        <w:t xml:space="preserve"> cm/s, relación E/A </w:t>
+      </w:r>
+      <w:r>
+        <w:rPr>
+          <w:lang w:val="es-ES"/>
+        </w:rPr>
+        <w:t>{</w:t>
+      </w:r>
+      <w:proofErr w:type="spellStart"/>
+      <w:r>
+        <w:rPr>
+          <w:lang w:val="es-ES"/>
+        </w:rPr>
+        <w:t>eaWaveRel</w:t>
+      </w:r>
+      <w:proofErr w:type="spellEnd"/>
+      <w:r>
+        <w:rPr>
+          <w:lang w:val="es-ES"/>
+        </w:rPr>
+        <w:t>}</w:t>
+      </w:r>
+      <w:r>
+        <w:rPr>
+          <w:lang w:val="es-ES"/>
+        </w:rPr>
+        <w:t xml:space="preserve">, pendiente de desaceleración </w:t>
+      </w:r>
+      <w:r>
+        <w:rPr>
+          <w:lang w:val="es-ES"/>
+        </w:rPr>
+        <w:t>{</w:t>
+      </w:r>
+      <w:proofErr w:type="spellStart"/>
+      <w:r>
+        <w:rPr>
+          <w:lang w:val="es-ES"/>
+        </w:rPr>
+        <w:t>lvfdt</w:t>
+      </w:r>
+      <w:proofErr w:type="spellEnd"/>
+      <w:r>
+        <w:rPr>
+          <w:lang w:val="es-ES"/>
+        </w:rPr>
+        <w:t>}</w:t>
+      </w:r>
+      <w:r>
+        <w:rPr>
+          <w:lang w:val="es-ES"/>
+        </w:rPr>
+        <w:t xml:space="preserve"> </w:t>
+      </w:r>
+      <w:proofErr w:type="spellStart"/>
+      <w:r>
+        <w:rPr>
+          <w:lang w:val="es-ES"/>
+        </w:rPr>
+        <w:t>mseg</w:t>
+      </w:r>
+      <w:proofErr w:type="spellEnd"/>
+      <w:r>
+        <w:rPr>
+          <w:lang w:val="es-ES"/>
+        </w:rPr>
+        <w:t xml:space="preserve">, TRIV </w:t>
+      </w:r>
+      <w:r>
+        <w:rPr>
+          <w:lang w:val="es-ES"/>
+        </w:rPr>
+        <w:t>{</w:t>
+      </w:r>
+      <w:proofErr w:type="spellStart"/>
+      <w:r>
+        <w:rPr>
+          <w:lang w:val="es-ES"/>
+        </w:rPr>
+        <w:t>lfivrt</w:t>
+      </w:r>
+      <w:proofErr w:type="spellEnd"/>
+      <w:r>
+        <w:rPr>
+          <w:lang w:val="es-ES"/>
+        </w:rPr>
+        <w:t>}</w:t>
+      </w:r>
+      <w:r>
+        <w:rPr>
+          <w:lang w:val="es-ES"/>
+        </w:rPr>
+        <w:t xml:space="preserve"> </w:t>
+      </w:r>
+      <w:proofErr w:type="spellStart"/>
+      <w:r>
+        <w:rPr>
+          <w:lang w:val="es-ES"/>
+        </w:rPr>
+        <w:t>mseg</w:t>
+      </w:r>
+      <w:proofErr w:type="spellEnd"/>
+      <w:r>
+        <w:rPr>
+          <w:lang w:val="es-ES"/>
+        </w:rPr>
+        <w:t xml:space="preserve">, Doppler tisular del anillo mitral onda </w:t>
+      </w:r>
+      <w:proofErr w:type="gramStart"/>
+      <w:r>
+        <w:rPr>
+          <w:lang w:val="es-ES"/>
+        </w:rPr>
+        <w:t>e</w:t>
+      </w:r>
+      <w:proofErr w:type="gramEnd"/>
+      <w:r>
+        <w:rPr>
+          <w:lang w:val="es-ES"/>
+        </w:rPr>
+        <w:t xml:space="preserve"> septal</w:t>
+      </w:r>
+      <w:r>
+        <w:rPr>
+          <w:lang w:val="es-ES"/>
+        </w:rPr>
+        <w:t xml:space="preserve"> </w:t>
+      </w:r>
+      <w:r>
+        <w:rPr>
+          <w:lang w:val="es-ES"/>
+        </w:rPr>
+        <w:t>{</w:t>
+      </w:r>
+      <w:proofErr w:type="spellStart"/>
+      <w:r>
+        <w:rPr>
+          <w:lang w:val="es-ES"/>
+        </w:rPr>
+        <w:t>ePrimeSeptal</w:t>
+      </w:r>
+      <w:proofErr w:type="spellEnd"/>
+      <w:r>
+        <w:rPr>
+          <w:lang w:val="es-ES"/>
+        </w:rPr>
+        <w:t>}</w:t>
+      </w:r>
+      <w:r>
+        <w:rPr>
+          <w:lang w:val="es-ES"/>
+        </w:rPr>
+        <w:t xml:space="preserve"> cm/s, onda </w:t>
+      </w:r>
+      <w:proofErr w:type="gramStart"/>
+      <w:r>
+        <w:rPr>
+          <w:lang w:val="es-ES"/>
+        </w:rPr>
+        <w:t>e</w:t>
+      </w:r>
+      <w:proofErr w:type="gramEnd"/>
+      <w:r>
+        <w:rPr>
+          <w:lang w:val="es-ES"/>
+        </w:rPr>
+        <w:t xml:space="preserve"> lateral </w:t>
+      </w:r>
+      <w:r>
+        <w:rPr>
+          <w:lang w:val="es-ES"/>
+        </w:rPr>
+        <w:t>{</w:t>
+      </w:r>
+      <w:proofErr w:type="spellStart"/>
+      <w:r>
+        <w:rPr>
+          <w:lang w:val="es-ES"/>
+        </w:rPr>
+        <w:t>ePrimeLateral</w:t>
+      </w:r>
+      <w:proofErr w:type="spellEnd"/>
+      <w:r>
+        <w:rPr>
+          <w:lang w:val="es-ES"/>
+        </w:rPr>
+        <w:t>}</w:t>
+      </w:r>
+      <w:r>
+        <w:rPr>
+          <w:lang w:val="es-ES"/>
+        </w:rPr>
+        <w:t xml:space="preserve"> cm/s, relación E/</w:t>
+      </w:r>
+      <w:r>
+        <w:rPr>
+          <w:lang w:val="es-ES"/>
+        </w:rPr>
+        <w:t>e</w:t>
+      </w:r>
+      <w:r>
+        <w:rPr>
+          <w:lang w:val="es-ES"/>
+        </w:rPr>
+        <w:t xml:space="preserve">’ </w:t>
+      </w:r>
+      <w:r>
+        <w:rPr>
+          <w:lang w:val="es-ES"/>
+        </w:rPr>
+        <w:t>{</w:t>
+      </w:r>
+      <w:proofErr w:type="spellStart"/>
+      <w:r>
+        <w:rPr>
+          <w:lang w:val="es-ES"/>
+        </w:rPr>
+        <w:t>eRatio</w:t>
+      </w:r>
+      <w:proofErr w:type="spellEnd"/>
+      <w:r>
+        <w:rPr>
+          <w:lang w:val="es-ES"/>
+        </w:rPr>
+        <w:t>}</w:t>
+      </w:r>
+      <w:r>
+        <w:rPr>
+          <w:lang w:val="es-ES"/>
+        </w:rPr>
+        <w:t xml:space="preserve">, diámetro de tracto de salida VI: </w:t>
+      </w:r>
+      <w:r>
+        <w:rPr>
+          <w:lang w:val="es-ES"/>
+        </w:rPr>
+        <w:t>{</w:t>
+      </w:r>
+      <w:proofErr w:type="spellStart"/>
+      <w:r>
+        <w:rPr>
+          <w:lang w:val="es-ES"/>
+        </w:rPr>
+        <w:t>lvotd</w:t>
+      </w:r>
+      <w:proofErr w:type="spellEnd"/>
+      <w:r>
+        <w:rPr>
+          <w:lang w:val="es-ES"/>
+        </w:rPr>
+        <w:t xml:space="preserve">} </w:t>
+      </w:r>
+      <w:r>
+        <w:rPr>
+          <w:lang w:val="es-ES"/>
+        </w:rPr>
+        <w:t xml:space="preserve">cm, Raíz aórtica </w:t>
+      </w:r>
+      <w:r>
+        <w:rPr>
+          <w:lang w:val="es-ES"/>
+        </w:rPr>
+        <w:t>{</w:t>
+      </w:r>
+      <w:proofErr w:type="spellStart"/>
+      <w:r>
+        <w:rPr>
+          <w:lang w:val="es-ES"/>
+        </w:rPr>
+        <w:t>lvar</w:t>
+      </w:r>
+      <w:proofErr w:type="spellEnd"/>
+      <w:r>
+        <w:rPr>
+          <w:lang w:val="es-ES"/>
+        </w:rPr>
+        <w:t>}</w:t>
+      </w:r>
+      <w:r>
+        <w:rPr>
+          <w:lang w:val="es-ES"/>
+        </w:rPr>
+        <w:t xml:space="preserve"> cm, indexada </w:t>
+      </w:r>
+      <w:r>
+        <w:rPr>
+          <w:lang w:val="es-ES"/>
+        </w:rPr>
+        <w:t>{</w:t>
+      </w:r>
+      <w:proofErr w:type="spellStart"/>
+      <w:r>
+        <w:rPr>
+          <w:lang w:val="es-ES"/>
+        </w:rPr>
+        <w:t>ilvar</w:t>
+      </w:r>
+      <w:proofErr w:type="spellEnd"/>
+      <w:r>
+        <w:rPr>
+          <w:lang w:val="es-ES"/>
+        </w:rPr>
+        <w:t>}</w:t>
+      </w:r>
+      <w:r>
+        <w:rPr>
+          <w:lang w:val="es-ES"/>
+        </w:rPr>
+        <w:t xml:space="preserve"> cm/m</w:t>
+      </w:r>
+      <w:r>
+        <w:rPr>
+          <w:rFonts w:cstheme="minorHAnsi"/>
+          <w:lang w:val="es-ES"/>
+        </w:rPr>
+        <w:t>²,</w:t>
+      </w:r>
+      <w:r>
+        <w:rPr>
+          <w:lang w:val="es-ES"/>
+        </w:rPr>
+        <w:t xml:space="preserve"> diámetro unión </w:t>
+      </w:r>
+      <w:proofErr w:type="spellStart"/>
+      <w:r>
+        <w:rPr>
+          <w:lang w:val="es-ES"/>
+        </w:rPr>
+        <w:t>sinotubular</w:t>
+      </w:r>
+      <w:proofErr w:type="spellEnd"/>
+      <w:r>
+        <w:rPr>
+          <w:lang w:val="es-ES"/>
+        </w:rPr>
+        <w:t xml:space="preserve"> </w:t>
+      </w:r>
+      <w:r>
+        <w:rPr>
+          <w:lang w:val="es-ES"/>
+        </w:rPr>
+        <w:t>{</w:t>
+      </w:r>
+      <w:proofErr w:type="spellStart"/>
+      <w:r>
+        <w:rPr>
+          <w:lang w:val="es-ES"/>
+        </w:rPr>
+        <w:t>lvstj</w:t>
+      </w:r>
+      <w:proofErr w:type="spellEnd"/>
+      <w:r>
+        <w:rPr>
+          <w:lang w:val="es-ES"/>
+        </w:rPr>
+        <w:t>}</w:t>
+      </w:r>
+      <w:r>
+        <w:rPr>
+          <w:lang w:val="es-ES"/>
+        </w:rPr>
+        <w:t xml:space="preserve"> cm, diámetro aorta proximal ascendente </w:t>
+      </w:r>
+      <w:r>
+        <w:rPr>
+          <w:lang w:val="es-ES"/>
+        </w:rPr>
+        <w:t>{</w:t>
+      </w:r>
+      <w:proofErr w:type="spellStart"/>
+      <w:r>
+        <w:rPr>
+          <w:lang w:val="es-ES"/>
+        </w:rPr>
+        <w:t>lvaad</w:t>
+      </w:r>
+      <w:proofErr w:type="spellEnd"/>
+      <w:r>
+        <w:rPr>
+          <w:lang w:val="es-ES"/>
+        </w:rPr>
+        <w:t>}</w:t>
+      </w:r>
+      <w:r>
+        <w:rPr>
+          <w:lang w:val="es-ES"/>
+        </w:rPr>
+        <w:t xml:space="preserve"> cm</w:t>
+      </w:r>
+      <w:r>
+        <w:rPr>
+          <w:lang w:val="es-ES"/>
+        </w:rPr>
+        <w:t>, indexada {</w:t>
+      </w:r>
+      <w:proofErr w:type="spellStart"/>
+      <w:r>
+        <w:rPr>
+          <w:lang w:val="es-ES"/>
+        </w:rPr>
+        <w:t>ilvaad</w:t>
+      </w:r>
+      <w:proofErr w:type="spellEnd"/>
+      <w:r>
+        <w:rPr>
+          <w:lang w:val="es-ES"/>
+        </w:rPr>
+        <w:t>} cm/</w:t>
+      </w:r>
+      <w:r>
+        <w:rPr>
+          <w:lang w:val="es-ES"/>
+        </w:rPr>
+        <w:t>m</w:t>
+      </w:r>
+      <w:r>
+        <w:rPr>
+          <w:rFonts w:cstheme="minorHAnsi"/>
+          <w:lang w:val="es-ES"/>
+        </w:rPr>
+        <w:t>²</w:t>
+      </w:r>
+      <w:r>
+        <w:rPr>
+          <w:rFonts w:cstheme="minorHAnsi"/>
           <w:lang w:val="es-ES"/>
         </w:rPr>
         <w:t>.</w:t>
-      </w:r>
-      <w:r>
-        <w:rPr>
-          <w:lang w:val="es-ES"/>
-        </w:rPr>
-        <w:t>84</w:t>
-      </w:r>
-      <w:r>
-        <w:rPr>
-          <w:lang w:val="es-ES"/>
-        </w:rPr>
-        <w:t xml:space="preserve"> cm/s, onda A: </w:t>
-      </w:r>
-      <w:r>
-        <w:rPr>
-          <w:lang w:val="es-ES"/>
-        </w:rPr>
-        <w:t>58.82</w:t>
-      </w:r>
-      <w:r>
-        <w:rPr>
-          <w:lang w:val="es-ES"/>
-        </w:rPr>
-        <w:t xml:space="preserve"> cm/s, relación E/A </w:t>
-      </w:r>
-      <w:r>
-        <w:rPr>
-          <w:lang w:val="es-ES"/>
-        </w:rPr>
-        <w:t>0.</w:t>
-      </w:r>
-      <w:r>
-        <w:rPr>
-          <w:lang w:val="es-ES"/>
-        </w:rPr>
-        <w:t>83</w:t>
-      </w:r>
-      <w:r>
-        <w:rPr>
-          <w:lang w:val="es-ES"/>
-        </w:rPr>
-        <w:t xml:space="preserve">, pendiente de desaceleración </w:t>
-      </w:r>
-      <w:r>
-        <w:rPr>
-          <w:lang w:val="es-ES"/>
-        </w:rPr>
-        <w:t>192</w:t>
-      </w:r>
-      <w:r>
-        <w:rPr>
-          <w:lang w:val="es-ES"/>
-        </w:rPr>
-        <w:t xml:space="preserve"> </w:t>
-      </w:r>
-      <w:proofErr w:type="spellStart"/>
-      <w:r>
-        <w:rPr>
-          <w:lang w:val="es-ES"/>
-        </w:rPr>
-        <w:t>mseg</w:t>
-      </w:r>
-      <w:proofErr w:type="spellEnd"/>
-      <w:r>
-        <w:rPr>
-          <w:lang w:val="es-ES"/>
-        </w:rPr>
-        <w:t xml:space="preserve">, TRIV </w:t>
-      </w:r>
-      <w:r>
-        <w:rPr>
-          <w:lang w:val="es-ES"/>
-        </w:rPr>
-        <w:t>96</w:t>
-      </w:r>
-      <w:r>
-        <w:rPr>
-          <w:lang w:val="es-ES"/>
-        </w:rPr>
-        <w:t xml:space="preserve"> </w:t>
-      </w:r>
-      <w:proofErr w:type="spellStart"/>
-      <w:r>
-        <w:rPr>
-          <w:lang w:val="es-ES"/>
-        </w:rPr>
-        <w:t>mseg</w:t>
-      </w:r>
-      <w:proofErr w:type="spellEnd"/>
-      <w:r>
-        <w:rPr>
-          <w:lang w:val="es-ES"/>
-        </w:rPr>
-        <w:t xml:space="preserve">, Doppler tisular del anillo mitral onda </w:t>
-      </w:r>
-      <w:proofErr w:type="gramStart"/>
-      <w:r>
-        <w:rPr>
-          <w:lang w:val="es-ES"/>
-        </w:rPr>
-        <w:t>e</w:t>
-      </w:r>
-      <w:proofErr w:type="gramEnd"/>
-      <w:r>
-        <w:rPr>
-          <w:lang w:val="es-ES"/>
-        </w:rPr>
-        <w:t xml:space="preserve"> septal</w:t>
-      </w:r>
-      <w:r>
-        <w:rPr>
-          <w:lang w:val="es-ES"/>
-        </w:rPr>
-        <w:t xml:space="preserve"> 7.79</w:t>
-      </w:r>
-      <w:r>
-        <w:rPr>
-          <w:lang w:val="es-ES"/>
-        </w:rPr>
-        <w:t xml:space="preserve"> cm/s, onda </w:t>
-      </w:r>
-      <w:proofErr w:type="gramStart"/>
-      <w:r>
-        <w:rPr>
-          <w:lang w:val="es-ES"/>
-        </w:rPr>
-        <w:t>e</w:t>
-      </w:r>
-      <w:proofErr w:type="gramEnd"/>
-      <w:r>
-        <w:rPr>
-          <w:lang w:val="es-ES"/>
-        </w:rPr>
-        <w:t xml:space="preserve"> lateral </w:t>
-      </w:r>
-      <w:r>
-        <w:rPr>
-          <w:lang w:val="es-ES"/>
-        </w:rPr>
-        <w:t>11.38</w:t>
-      </w:r>
-      <w:r>
-        <w:rPr>
-          <w:lang w:val="es-ES"/>
-        </w:rPr>
-        <w:t xml:space="preserve"> cm/s, relación E/E’ </w:t>
-      </w:r>
-      <w:r>
-        <w:rPr>
-          <w:lang w:val="es-ES"/>
-        </w:rPr>
-        <w:t>5.09</w:t>
-      </w:r>
-      <w:r>
-        <w:rPr>
-          <w:lang w:val="es-ES"/>
-        </w:rPr>
-        <w:t>, diámetro de tracto de salida VI: 2.</w:t>
-      </w:r>
-      <w:r>
-        <w:rPr>
-          <w:lang w:val="es-ES"/>
-        </w:rPr>
-        <w:t>1</w:t>
-      </w:r>
-      <w:r>
-        <w:rPr>
-          <w:lang w:val="es-ES"/>
-        </w:rPr>
-        <w:t>4</w:t>
-      </w:r>
-      <w:r>
-        <w:rPr>
-          <w:lang w:val="es-ES"/>
-        </w:rPr>
-        <w:t xml:space="preserve"> cm, Raíz aórtica 2.</w:t>
-      </w:r>
-      <w:r>
-        <w:rPr>
-          <w:lang w:val="es-ES"/>
-        </w:rPr>
-        <w:t>99</w:t>
-      </w:r>
-      <w:r>
-        <w:rPr>
-          <w:lang w:val="es-ES"/>
-        </w:rPr>
-        <w:t xml:space="preserve"> cm, indexada 1.</w:t>
-      </w:r>
-      <w:r>
-        <w:rPr>
-          <w:lang w:val="es-ES"/>
-        </w:rPr>
-        <w:t>72</w:t>
-      </w:r>
-      <w:r>
-        <w:rPr>
-          <w:lang w:val="es-ES"/>
-        </w:rPr>
-        <w:t xml:space="preserve"> cm/m</w:t>
-      </w:r>
-      <w:r>
-        <w:rPr>
-          <w:rFonts w:cstheme="minorHAnsi"/>
-          <w:lang w:val="es-ES"/>
-        </w:rPr>
-        <w:t>²,</w:t>
-      </w:r>
-      <w:r>
-        <w:rPr>
-          <w:lang w:val="es-ES"/>
-        </w:rPr>
-        <w:t xml:space="preserve"> diámetro unión </w:t>
-      </w:r>
-      <w:proofErr w:type="spellStart"/>
-      <w:r>
-        <w:rPr>
-          <w:lang w:val="es-ES"/>
-        </w:rPr>
-        <w:t>sinotubular</w:t>
-      </w:r>
-      <w:proofErr w:type="spellEnd"/>
-      <w:r>
-        <w:rPr>
-          <w:lang w:val="es-ES"/>
-        </w:rPr>
-        <w:t xml:space="preserve"> 2.</w:t>
-      </w:r>
-      <w:r>
-        <w:rPr>
-          <w:lang w:val="es-ES"/>
-        </w:rPr>
-        <w:t>2</w:t>
-      </w:r>
-      <w:r>
-        <w:rPr>
-          <w:lang w:val="es-ES"/>
-        </w:rPr>
-        <w:t>7</w:t>
-      </w:r>
-      <w:r>
-        <w:rPr>
-          <w:lang w:val="es-ES"/>
-        </w:rPr>
-        <w:t xml:space="preserve"> cm, diámetro aorta proximal ascendente 2.</w:t>
-      </w:r>
-      <w:r>
-        <w:rPr>
-          <w:lang w:val="es-ES"/>
-        </w:rPr>
-        <w:t>4</w:t>
-      </w:r>
-      <w:r>
-        <w:rPr>
-          <w:lang w:val="es-ES"/>
-        </w:rPr>
-        <w:t>8</w:t>
-      </w:r>
-      <w:r>
-        <w:rPr>
-          <w:lang w:val="es-ES"/>
-        </w:rPr>
-        <w:t xml:space="preserve"> cm</w:t>
-      </w:r>
-      <w:r>
-        <w:rPr>
-          <w:lang w:val="es-ES"/>
-        </w:rPr>
-        <w:t>.</w:t>
-      </w:r>
-      <w:r>
-        <w:rPr>
-          <w:lang w:val="es-ES"/>
-        </w:rPr>
-        <w:t xml:space="preserve"> </w:t>
       </w:r>
     </w:p>
     <w:p>

</xml_diff>

<commit_message>
rv injected values to template and template updated
</commit_message>
<xml_diff>
--- a/public/medical-rerpot-template.docx
+++ b/public/medical-rerpot-template.docx
@@ -1326,12 +1326,14 @@
         </w:rPr>
         <w:t>{</w:t>
       </w:r>
+      <w:proofErr w:type="spellStart"/>
       <w:r>
         <w:rPr>
           <w:lang w:val="es-ES"/>
         </w:rPr>
         <w:t>lvedv</w:t>
       </w:r>
+      <w:proofErr w:type="spellEnd"/>
       <w:r>
         <w:rPr>
           <w:lang w:val="es-ES"/>
@@ -1956,7 +1958,21 @@
         <w:rPr>
           <w:lang w:val="es-ES"/>
         </w:rPr>
-        <w:t>3.88</w:t>
+        <w:t>{</w:t>
+      </w:r>
+      <w:proofErr w:type="spellStart"/>
+      <w:r>
+        <w:rPr>
+          <w:lang w:val="es-ES"/>
+        </w:rPr>
+        <w:t>rvbd</w:t>
+      </w:r>
+      <w:proofErr w:type="spellEnd"/>
+      <w:r>
+        <w:rPr>
+          <w:lang w:val="es-ES"/>
+        </w:rPr>
+        <w:t>}</w:t>
       </w:r>
       <w:r>
         <w:rPr>
@@ -1965,10 +1981,7 @@
         <w:t xml:space="preserve"> cm, diámetro medio </w:t>
       </w:r>
       <w:r>
-        <w:rPr>
-          <w:lang w:val="es-ES"/>
-        </w:rPr>
-        <w:t>2.97</w:t>
+        <w:t>{rvmd}</w:t>
       </w:r>
       <w:r>
         <w:rPr>
@@ -1977,10 +1990,73 @@
         <w:t xml:space="preserve"> cm, diámetro longitudinal </w:t>
       </w:r>
       <w:r>
-        <w:rPr>
-          <w:lang w:val="es-ES"/>
-        </w:rPr>
-        <w:t>7</w:t>
+        <w:t>{rvld}</w:t>
+      </w:r>
+      <w:r>
+        <w:rPr>
+          <w:lang w:val="es-ES"/>
+        </w:rPr>
+        <w:t xml:space="preserve"> cm, función sistólica </w:t>
+      </w:r>
+      <w:r>
+        <w:rPr>
+          <w:lang w:val="es-ES"/>
+        </w:rPr>
+        <w:t>conservada</w:t>
+      </w:r>
+      <w:r>
+        <w:rPr>
+          <w:lang w:val="es-ES"/>
+        </w:rPr>
+        <w:t xml:space="preserve">, </w:t>
+      </w:r>
+      <w:r>
+        <w:rPr>
+          <w:lang w:val="es-ES"/>
+        </w:rPr>
+        <w:t xml:space="preserve">onda </w:t>
+      </w:r>
+      <w:r>
+        <w:rPr>
+          <w:lang w:val="es-ES"/>
+        </w:rPr>
+        <w:t xml:space="preserve">S </w:t>
+      </w:r>
+      <w:proofErr w:type="spellStart"/>
+      <w:r>
+        <w:rPr>
+          <w:lang w:val="es-ES"/>
+        </w:rPr>
+        <w:t>tricuspidea</w:t>
+      </w:r>
+      <w:proofErr w:type="spellEnd"/>
+      <w:r>
+        <w:rPr>
+          <w:lang w:val="es-ES"/>
+        </w:rPr>
+        <w:t xml:space="preserve"> </w:t>
+      </w:r>
+      <w:r>
+        <w:t>{sWave}</w:t>
+      </w:r>
+      <w:r>
+        <w:rPr>
+          <w:lang w:val="es-ES"/>
+        </w:rPr>
+        <w:t xml:space="preserve"> cm/s, TAPSE </w:t>
+      </w:r>
+      <w:r>
+        <w:t>{rvtapse}</w:t>
+      </w:r>
+      <w:r>
+        <w:t xml:space="preserve"> </w:t>
+      </w:r>
+      <w:proofErr w:type="spellStart"/>
+      <w:r>
+        <w:rPr>
+          <w:lang w:val="es-ES"/>
+        </w:rPr>
+        <w:t>mm</w:t>
       </w:r>
       <w:r>
         <w:rPr>
@@ -1988,73 +2064,84 @@
         </w:rPr>
         <w:t>.</w:t>
       </w:r>
-      <w:r>
-        <w:rPr>
-          <w:lang w:val="es-ES"/>
-        </w:rPr>
-        <w:t>15</w:t>
-      </w:r>
-      <w:r>
-        <w:rPr>
-          <w:lang w:val="es-ES"/>
-        </w:rPr>
-        <w:t xml:space="preserve"> cm, función sistólica </w:t>
-      </w:r>
-      <w:r>
-        <w:rPr>
-          <w:lang w:val="es-ES"/>
-        </w:rPr>
-        <w:t>conservada</w:t>
-      </w:r>
-      <w:r>
-        <w:rPr>
-          <w:lang w:val="es-ES"/>
-        </w:rPr>
-        <w:t xml:space="preserve">, </w:t>
-      </w:r>
-      <w:r>
-        <w:rPr>
-          <w:lang w:val="es-ES"/>
-        </w:rPr>
-        <w:t xml:space="preserve">onda </w:t>
-      </w:r>
-      <w:r>
-        <w:rPr>
-          <w:lang w:val="es-ES"/>
-        </w:rPr>
-        <w:t xml:space="preserve">S </w:t>
+      <w:proofErr w:type="spellEnd"/>
+      <w:r>
+        <w:rPr>
+          <w:lang w:val="es-ES"/>
+        </w:rPr>
+        <w:t xml:space="preserve"> Área </w:t>
       </w:r>
       <w:proofErr w:type="spellStart"/>
       <w:r>
         <w:rPr>
           <w:lang w:val="es-ES"/>
         </w:rPr>
-        <w:t>tricuspidea</w:t>
+        <w:t>telediastólica</w:t>
       </w:r>
       <w:proofErr w:type="spellEnd"/>
       <w:r>
         <w:rPr>
           <w:lang w:val="es-ES"/>
         </w:rPr>
+        <w:t xml:space="preserve"> VD</w:t>
+      </w:r>
+      <w:r>
+        <w:rPr>
+          <w:lang w:val="es-ES"/>
+        </w:rPr>
         <w:t xml:space="preserve"> </w:t>
       </w:r>
       <w:r>
-        <w:rPr>
-          <w:lang w:val="es-ES"/>
-        </w:rPr>
-        <w:t>13.18</w:t>
-      </w:r>
-      <w:r>
-        <w:rPr>
-          <w:lang w:val="es-ES"/>
-        </w:rPr>
-        <w:t xml:space="preserve"> cm/s, TAPSE </w:t>
-      </w:r>
-      <w:r>
-        <w:rPr>
-          <w:lang w:val="es-ES"/>
-        </w:rPr>
-        <w:t>22</w:t>
+        <w:t>{rveda}</w:t>
+      </w:r>
+      <w:r>
+        <w:rPr>
+          <w:lang w:val="es-ES"/>
+        </w:rPr>
+        <w:t xml:space="preserve"> cm</w:t>
+      </w:r>
+      <w:r>
+        <w:rPr>
+          <w:rFonts w:cstheme="minorHAnsi"/>
+          <w:lang w:val="es-ES"/>
+        </w:rPr>
+        <w:t>²,</w:t>
+      </w:r>
+      <w:r>
+        <w:rPr>
+          <w:lang w:val="es-ES"/>
+        </w:rPr>
+        <w:t xml:space="preserve"> área </w:t>
+      </w:r>
+      <w:proofErr w:type="spellStart"/>
+      <w:r>
+        <w:rPr>
+          <w:lang w:val="es-ES"/>
+        </w:rPr>
+        <w:t>telesistólica</w:t>
+      </w:r>
+      <w:proofErr w:type="spellEnd"/>
+      <w:r>
+        <w:rPr>
+          <w:lang w:val="es-ES"/>
+        </w:rPr>
+        <w:t xml:space="preserve"> VD </w:t>
+      </w:r>
+      <w:r>
+        <w:t>{rvesa}</w:t>
+      </w:r>
+      <w:r>
+        <w:rPr>
+          <w:lang w:val="es-ES"/>
+        </w:rPr>
+        <w:t xml:space="preserve"> cm</w:t>
+      </w:r>
+      <w:r>
+        <w:rPr>
+          <w:rFonts w:cstheme="minorHAnsi"/>
+          <w:lang w:val="es-ES"/>
+        </w:rPr>
+        <w:t xml:space="preserve">²  </w:t>
       </w:r>
       <w:r>
         <w:rPr>
@@ -2062,110 +2149,6 @@
         </w:rPr>
         <w:t xml:space="preserve"> </w:t>
       </w:r>
-      <w:proofErr w:type="spellStart"/>
-      <w:r>
-        <w:rPr>
-          <w:lang w:val="es-ES"/>
-        </w:rPr>
-        <w:t>mm</w:t>
-      </w:r>
-      <w:r>
-        <w:rPr>
-          <w:lang w:val="es-ES"/>
-        </w:rPr>
-        <w:t>.</w:t>
-      </w:r>
-      <w:proofErr w:type="spellEnd"/>
-      <w:r>
-        <w:rPr>
-          <w:lang w:val="es-ES"/>
-        </w:rPr>
-        <w:t xml:space="preserve"> Área </w:t>
-      </w:r>
-      <w:proofErr w:type="spellStart"/>
-      <w:r>
-        <w:rPr>
-          <w:lang w:val="es-ES"/>
-        </w:rPr>
-        <w:t>telediastólica</w:t>
-      </w:r>
-      <w:proofErr w:type="spellEnd"/>
-      <w:r>
-        <w:rPr>
-          <w:lang w:val="es-ES"/>
-        </w:rPr>
-        <w:t xml:space="preserve"> VD</w:t>
-      </w:r>
-      <w:r>
-        <w:rPr>
-          <w:lang w:val="es-ES"/>
-        </w:rPr>
-        <w:t xml:space="preserve"> </w:t>
-      </w:r>
-      <w:r>
-        <w:rPr>
-          <w:lang w:val="es-ES"/>
-        </w:rPr>
-        <w:t>17.15</w:t>
-      </w:r>
-      <w:r>
-        <w:rPr>
-          <w:lang w:val="es-ES"/>
-        </w:rPr>
-        <w:t xml:space="preserve"> cm</w:t>
-      </w:r>
-      <w:r>
-        <w:rPr>
-          <w:rFonts w:cstheme="minorHAnsi"/>
-          <w:lang w:val="es-ES"/>
-        </w:rPr>
-        <w:t>²,</w:t>
-      </w:r>
-      <w:r>
-        <w:rPr>
-          <w:lang w:val="es-ES"/>
-        </w:rPr>
-        <w:t xml:space="preserve"> área </w:t>
-      </w:r>
-      <w:proofErr w:type="spellStart"/>
-      <w:r>
-        <w:rPr>
-          <w:lang w:val="es-ES"/>
-        </w:rPr>
-        <w:t>telesistólica</w:t>
-      </w:r>
-      <w:proofErr w:type="spellEnd"/>
-      <w:r>
-        <w:rPr>
-          <w:lang w:val="es-ES"/>
-        </w:rPr>
-        <w:t xml:space="preserve"> VD </w:t>
-      </w:r>
-      <w:r>
-        <w:rPr>
-          <w:lang w:val="es-ES"/>
-        </w:rPr>
-        <w:t>10.18</w:t>
-      </w:r>
-      <w:r>
-        <w:rPr>
-          <w:lang w:val="es-ES"/>
-        </w:rPr>
-        <w:t xml:space="preserve"> cm</w:t>
-      </w:r>
-      <w:r>
-        <w:rPr>
-          <w:rFonts w:cstheme="minorHAnsi"/>
-          <w:lang w:val="es-ES"/>
-        </w:rPr>
-        <w:t xml:space="preserve">²  </w:t>
-      </w:r>
-      <w:r>
-        <w:rPr>
-          <w:lang w:val="es-ES"/>
-        </w:rPr>
-        <w:t xml:space="preserve"> </w:t>
-      </w:r>
       <w:r>
         <w:rPr>
           <w:lang w:val="es-ES"/>
@@ -2173,42 +2156,13 @@
         <w:t xml:space="preserve">cambio fraccional de área, FAC </w:t>
       </w:r>
       <w:r>
-        <w:rPr>
-          <w:lang w:val="es-ES"/>
-        </w:rPr>
-        <w:t>40.61</w:t>
-      </w:r>
-      <w:r>
-        <w:rPr>
-          <w:lang w:val="es-ES"/>
-        </w:rPr>
-        <w:t xml:space="preserve"> </w:t>
-      </w:r>
-      <w:proofErr w:type="gramStart"/>
-      <w:r>
-        <w:rPr>
-          <w:lang w:val="es-ES"/>
-        </w:rPr>
-        <w:t>%</w:t>
-      </w:r>
-      <w:r>
-        <w:rPr>
-          <w:lang w:val="es-ES"/>
-        </w:rPr>
-        <w:t xml:space="preserve"> </w:t>
-      </w:r>
-      <w:r>
-        <w:rPr>
-          <w:lang w:val="es-ES"/>
-        </w:rPr>
-        <w:t>.</w:t>
-      </w:r>
-      <w:proofErr w:type="gramEnd"/>
-      <w:r>
-        <w:rPr>
-          <w:lang w:val="es-ES"/>
-        </w:rPr>
-        <w:t xml:space="preserve"> </w:t>
+        <w:t>{rvfac}</w:t>
+      </w:r>
+      <w:r>
+        <w:rPr>
+          <w:lang w:val="es-ES"/>
+        </w:rPr>
+        <w:t xml:space="preserve"> %. </w:t>
       </w:r>
       <w:r>
         <w:rPr>
@@ -2226,7 +2180,10 @@
         <w:rPr>
           <w:lang w:val="es-ES"/>
         </w:rPr>
-        <w:t xml:space="preserve"> VD de 4</w:t>
+        <w:t xml:space="preserve"> VD de </w:t>
+      </w:r>
+      <w:r>
+        <w:t>{rvfwt}</w:t>
       </w:r>
       <w:r>
         <w:rPr>
@@ -2539,7 +2496,6 @@
           <w:b/>
           <w:bCs/>
         </w:rPr>
-        <w:lastRenderedPageBreak/>
         <w:t>Válvula aórtica</w:t>
       </w:r>
       <w:r>
@@ -3647,6 +3603,7 @@
           <w:szCs w:val="24"/>
           <w:lang w:val="es-ES"/>
         </w:rPr>
+        <w:lastRenderedPageBreak/>
         <w:t>Colegiado Activo 18,540</w:t>
       </w:r>
       <w:bookmarkEnd w:id="0"/>

</xml_diff>

<commit_message>
la section added form, template and data injections
</commit_message>
<xml_diff>
--- a/public/medical-rerpot-template.docx
+++ b/public/medical-rerpot-template.docx
@@ -2246,19 +2246,21 @@
         <w:rPr>
           <w:lang w:val="es-ES"/>
         </w:rPr>
-        <w:t>3.</w:t>
-      </w:r>
-      <w:r>
-        <w:rPr>
-          <w:lang w:val="es-ES"/>
-        </w:rPr>
-        <w:t>6</w:t>
-      </w:r>
-      <w:r>
-        <w:rPr>
-          <w:lang w:val="es-ES"/>
-        </w:rPr>
-        <w:t>3</w:t>
+        <w:t>{</w:t>
+      </w:r>
+      <w:proofErr w:type="spellStart"/>
+      <w:r>
+        <w:rPr>
+          <w:lang w:val="es-ES"/>
+        </w:rPr>
+        <w:t>laapd</w:t>
+      </w:r>
+      <w:proofErr w:type="spellEnd"/>
+      <w:r>
+        <w:rPr>
+          <w:lang w:val="es-ES"/>
+        </w:rPr>
+        <w:t>}</w:t>
       </w:r>
       <w:r>
         <w:rPr>
@@ -2276,7 +2278,19 @@
         <w:rPr>
           <w:lang w:val="es-ES"/>
         </w:rPr>
-        <w:t>25.25</w:t>
+        <w:t>{</w:t>
+      </w:r>
+      <w:r>
+        <w:rPr>
+          <w:lang w:val="es-ES"/>
+        </w:rPr>
+        <w:t>ilav</w:t>
+      </w:r>
+      <w:r>
+        <w:rPr>
+          <w:lang w:val="es-ES"/>
+        </w:rPr>
+        <w:t>}</w:t>
       </w:r>
       <w:r>
         <w:rPr>

</xml_diff>

<commit_message>
new section right atrium added, template updated and data injection
</commit_message>
<xml_diff>
--- a/public/medical-rerpot-template.docx
+++ b/public/medical-rerpot-template.docx
@@ -2046,10 +2046,7 @@
         <w:t xml:space="preserve"> cm/s, TAPSE </w:t>
       </w:r>
       <w:r>
-        <w:t>{rvtapse}</w:t>
-      </w:r>
-      <w:r>
-        <w:t xml:space="preserve"> </w:t>
+        <w:t xml:space="preserve">{rvtapse} </w:t>
       </w:r>
       <w:proofErr w:type="spellStart"/>
       <w:r>
@@ -2358,7 +2355,21 @@
         <w:rPr>
           <w:lang w:val="es-ES"/>
         </w:rPr>
-        <w:t>15.62</w:t>
+        <w:t>{</w:t>
+      </w:r>
+      <w:proofErr w:type="spellStart"/>
+      <w:r>
+        <w:rPr>
+          <w:lang w:val="es-ES"/>
+        </w:rPr>
+        <w:t>raa</w:t>
+      </w:r>
+      <w:proofErr w:type="spellEnd"/>
+      <w:r>
+        <w:rPr>
+          <w:lang w:val="es-ES"/>
+        </w:rPr>
+        <w:t>}</w:t>
       </w:r>
       <w:r>
         <w:rPr>
@@ -2383,13 +2394,7 @@
         <w:rPr>
           <w:lang w:val="es-ES"/>
         </w:rPr>
-        <w:t>24</w:t>
-      </w:r>
-      <w:r>
-        <w:rPr>
-          <w:lang w:val="es-ES"/>
-        </w:rPr>
-        <w:t>.3</w:t>
+        <w:t>{irav}</w:t>
       </w:r>
       <w:r>
         <w:rPr>

</xml_diff>

<commit_message>
section added, template updated, data injected
</commit_message>
<xml_diff>
--- a/public/medical-rerpot-template.docx
+++ b/public/medical-rerpot-template.docx
@@ -2452,10 +2452,7 @@
         <w:t xml:space="preserve">no estenosis, IVT VM: </w:t>
       </w:r>
       <w:r>
-        <w:t>2</w:t>
-      </w:r>
-      <w:r>
-        <w:t>1.25</w:t>
+        <w:t>{mvvti}</w:t>
       </w:r>
       <w:r>
         <w:t xml:space="preserve"> cm, Vmax VM:</w:t>
@@ -2464,31 +2461,25 @@
         <w:t xml:space="preserve"> </w:t>
       </w:r>
       <w:r>
-        <w:t>71</w:t>
+        <w:t>{mvvmax}</w:t>
+      </w:r>
+      <w:r>
+        <w:t xml:space="preserve"> cm/s, Grad Med VM </w:t>
+      </w:r>
+      <w:r>
+        <w:t>{mvmg}</w:t>
+      </w:r>
+      <w:r>
+        <w:t xml:space="preserve"> mmHg</w:t>
       </w:r>
       <w:r>
         <w:t>.</w:t>
       </w:r>
       <w:r>
-        <w:t>30</w:t>
-      </w:r>
-      <w:r>
-        <w:t xml:space="preserve"> cm/s, Grad Med VM </w:t>
-      </w:r>
-      <w:r>
-        <w:t>0.80</w:t>
-      </w:r>
-      <w:r>
-        <w:t xml:space="preserve"> mmHg</w:t>
-      </w:r>
-      <w:r>
-        <w:t>.</w:t>
-      </w:r>
-      <w:r>
-        <w:t xml:space="preserve"> AVM: 3.</w:t>
-      </w:r>
-      <w:r>
-        <w:t>25</w:t>
+        <w:t xml:space="preserve"> AVM: </w:t>
+      </w:r>
+      <w:r>
+        <w:t>{mva}</w:t>
       </w:r>
       <w:r>
         <w:t xml:space="preserve"> cm</w:t>
@@ -3421,51 +3412,15 @@
     <w:p>
       <w:pPr>
         <w:pStyle w:val="NoSpacing"/>
-        <w:jc w:val="both"/>
-        <w:rPr>
-          <w:lang w:val="es-ES"/>
-        </w:rPr>
-      </w:pPr>
-    </w:p>
-    <w:p>
-      <w:pPr>
-        <w:pStyle w:val="NoSpacing"/>
         <w:tabs>
           <w:tab w:val="left" w:pos="3490"/>
         </w:tabs>
-        <w:rPr>
-          <w:rFonts w:ascii="Arial" w:hAnsi="Arial" w:cs="Arial"/>
-          <w:noProof/>
-        </w:rPr>
-      </w:pPr>
-      <w:r>
         <w:rPr>
           <w:rFonts w:ascii="Arial" w:hAnsi="Arial" w:cs="Arial"/>
           <w:b/>
           <w:bCs/>
           <w:noProof/>
-        </w:rPr>
-        <w:t>Impresión clínica:</w:t>
-      </w:r>
-      <w:r>
-        <w:rPr>
-          <w:rFonts w:ascii="Arial" w:hAnsi="Arial" w:cs="Arial"/>
-          <w:noProof/>
-        </w:rPr>
-        <w:t xml:space="preserve"> ecocardiograma transtorácico doppler NORMAL. </w:t>
-      </w:r>
-    </w:p>
-    <w:p>
-      <w:pPr>
-        <w:pStyle w:val="NoSpacing"/>
-        <w:tabs>
-          <w:tab w:val="left" w:pos="3490"/>
-        </w:tabs>
-        <w:rPr>
-          <w:rFonts w:ascii="Arial" w:hAnsi="Arial" w:cs="Arial"/>
-          <w:b/>
-          <w:bCs/>
-          <w:noProof/>
+          <w:lang w:val="es-ES"/>
         </w:rPr>
       </w:pPr>
     </w:p>
@@ -3607,7 +3562,6 @@
           <w:szCs w:val="24"/>
           <w:lang w:val="es-ES"/>
         </w:rPr>
-        <w:lastRenderedPageBreak/>
         <w:t>Médico cardiólogo</w:t>
       </w:r>
     </w:p>

</xml_diff>

<commit_message>
aortic valve section added, template updated, data injected
</commit_message>
<xml_diff>
--- a/public/medical-rerpot-template.docx
+++ b/public/medical-rerpot-template.docx
@@ -2534,73 +2534,37 @@
         <w:t xml:space="preserve"> alteraciones del flujo, IVT VA </w:t>
       </w:r>
       <w:r>
-        <w:rPr>
-          <w:u w:val="single"/>
-        </w:rPr>
-        <w:t>26.28</w:t>
+        <w:t>{avvti}</w:t>
       </w:r>
       <w:r>
         <w:t xml:space="preserve"> cm, IVT TSVI </w:t>
       </w:r>
       <w:r>
-        <w:rPr>
-          <w:u w:val="single"/>
-        </w:rPr>
-        <w:t>1</w:t>
-      </w:r>
-      <w:r>
-        <w:rPr>
-          <w:u w:val="single"/>
-        </w:rPr>
-        <w:t>8.01</w:t>
+        <w:t>{lvotvti}</w:t>
       </w:r>
       <w:r>
         <w:t xml:space="preserve"> cm, Grad Max </w:t>
       </w:r>
       <w:r>
-        <w:rPr>
-          <w:u w:val="single"/>
-        </w:rPr>
-        <w:t>7.97</w:t>
+        <w:t>{avMaxGrad}</w:t>
       </w:r>
       <w:r>
         <w:t xml:space="preserve"> mmHg, Gradiente medio </w:t>
       </w:r>
       <w:r>
-        <w:rPr>
-          <w:u w:val="single"/>
-        </w:rPr>
-        <w:t>3.61</w:t>
+        <w:t>{avMeanGrad}</w:t>
       </w:r>
       <w:r>
         <w:t xml:space="preserve"> mmHg, Velocidad máxima </w:t>
       </w:r>
       <w:r>
-        <w:rPr>
-          <w:u w:val="single"/>
-        </w:rPr>
-        <w:t>141.17</w:t>
+        <w:t>{avvmax}</w:t>
       </w:r>
       <w:r>
         <w:t xml:space="preserve"> cm/s. Área valvular aórtica (AVAo): </w:t>
       </w:r>
       <w:r>
-        <w:rPr>
-          <w:u w:val="single"/>
-        </w:rPr>
-        <w:t>2</w:t>
-      </w:r>
-      <w:r>
-        <w:rPr>
-          <w:u w:val="single"/>
-        </w:rPr>
-        <w:t>.4</w:t>
-      </w:r>
-      <w:r>
-        <w:rPr>
-          <w:u w:val="single"/>
-        </w:rPr>
-        <w:t>5</w:t>
+        <w:t>{avao}</w:t>
       </w:r>
       <w:r>
         <w:t xml:space="preserve"> cm</w:t>
@@ -2615,29 +2579,13 @@
         <w:t xml:space="preserve">, AVAo indexada: </w:t>
       </w:r>
       <w:r>
-        <w:rPr>
-          <w:u w:val="single"/>
-        </w:rPr>
-        <w:t>1.</w:t>
-      </w:r>
-      <w:r>
-        <w:rPr>
-          <w:u w:val="single"/>
-        </w:rPr>
-        <w:t>42</w:t>
-      </w:r>
-      <w:r>
-        <w:rPr>
-          <w:u w:val="single"/>
-          <w:lang w:val="es-ES"/>
-        </w:rPr>
-        <w:t xml:space="preserve"> </w:t>
-      </w:r>
-      <w:r>
-        <w:rPr>
-          <w:lang w:val="es-ES"/>
-        </w:rPr>
-        <w:t>cm</w:t>
+        <w:t>{iavao}</w:t>
+      </w:r>
+      <w:r>
+        <w:rPr>
+          <w:lang w:val="es-ES"/>
+        </w:rPr>
+        <w:t xml:space="preserve"> cm</w:t>
       </w:r>
       <w:r>
         <w:rPr>
@@ -3586,6 +3534,7 @@
           <w:szCs w:val="24"/>
           <w:lang w:val="es-ES"/>
         </w:rPr>
+        <w:lastRenderedPageBreak/>
         <w:t>Colegiado Activo 18,540</w:t>
       </w:r>
       <w:bookmarkEnd w:id="0"/>

</xml_diff>

<commit_message>
pulmonary valve section added, template updated, data ijected
</commit_message>
<xml_diff>
--- a/public/medical-rerpot-template.docx
+++ b/public/medical-rerpot-template.docx
@@ -2664,13 +2664,29 @@
           <w:bCs/>
           <w:lang w:val="es-ES"/>
         </w:rPr>
-        <w:t>88.41</w:t>
-      </w:r>
+        <w:t>{</w:t>
+      </w:r>
+      <w:proofErr w:type="spellStart"/>
       <w:r>
         <w:rPr>
           <w:bCs/>
           <w:lang w:val="es-ES"/>
         </w:rPr>
+        <w:t>pvvmax</w:t>
+      </w:r>
+      <w:proofErr w:type="spellEnd"/>
+      <w:r>
+        <w:rPr>
+          <w:bCs/>
+          <w:lang w:val="es-ES"/>
+        </w:rPr>
+        <w:t>}</w:t>
+      </w:r>
+      <w:r>
+        <w:rPr>
+          <w:bCs/>
+          <w:lang w:val="es-ES"/>
+        </w:rPr>
         <w:t xml:space="preserve"> cm/s, IVT TSVD</w:t>
       </w:r>
       <w:r>
@@ -2685,13 +2701,29 @@
           <w:bCs/>
           <w:lang w:val="es-ES"/>
         </w:rPr>
-        <w:t>13.85</w:t>
-      </w:r>
+        <w:t>{</w:t>
+      </w:r>
+      <w:proofErr w:type="spellStart"/>
       <w:r>
         <w:rPr>
           <w:bCs/>
           <w:lang w:val="es-ES"/>
         </w:rPr>
+        <w:t>rvotvti</w:t>
+      </w:r>
+      <w:proofErr w:type="spellEnd"/>
+      <w:r>
+        <w:rPr>
+          <w:bCs/>
+          <w:lang w:val="es-ES"/>
+        </w:rPr>
+        <w:t>}</w:t>
+      </w:r>
+      <w:r>
+        <w:rPr>
+          <w:bCs/>
+          <w:lang w:val="es-ES"/>
+        </w:rPr>
         <w:t xml:space="preserve"> </w:t>
       </w:r>
       <w:r>
@@ -2706,13 +2738,29 @@
           <w:bCs/>
           <w:lang w:val="es-ES"/>
         </w:rPr>
-        <w:t>171</w:t>
-      </w:r>
+        <w:t>{</w:t>
+      </w:r>
+      <w:proofErr w:type="spellStart"/>
       <w:r>
         <w:rPr>
           <w:bCs/>
           <w:lang w:val="es-ES"/>
         </w:rPr>
+        <w:t>pvat</w:t>
+      </w:r>
+      <w:proofErr w:type="spellEnd"/>
+      <w:r>
+        <w:rPr>
+          <w:bCs/>
+          <w:lang w:val="es-ES"/>
+        </w:rPr>
+        <w:t>}</w:t>
+      </w:r>
+      <w:r>
+        <w:rPr>
+          <w:bCs/>
+          <w:lang w:val="es-ES"/>
+        </w:rPr>
         <w:t xml:space="preserve"> </w:t>
       </w:r>
       <w:proofErr w:type="spellStart"/>
@@ -2750,14 +2798,14 @@
           <w:bCs/>
           <w:lang w:val="es-ES"/>
         </w:rPr>
-        <w:t>diámetro 2.</w:t>
+        <w:t xml:space="preserve">diámetro </w:t>
       </w:r>
       <w:r>
         <w:rPr>
           <w:bCs/>
           <w:lang w:val="es-ES"/>
         </w:rPr>
-        <w:t>01</w:t>
+        <w:t>{pvd}</w:t>
       </w:r>
       <w:r>
         <w:rPr>

</xml_diff>

<commit_message>
form updated, template updated, data injected for tricuspid section
</commit_message>
<xml_diff>
--- a/public/medical-rerpot-template.docx
+++ b/public/medical-rerpot-template.docx
@@ -2887,19 +2887,21 @@
         <w:rPr>
           <w:lang w:val="es-ES"/>
         </w:rPr>
-        <w:t>2</w:t>
-      </w:r>
-      <w:r>
-        <w:rPr>
-          <w:lang w:val="es-ES"/>
-        </w:rPr>
-        <w:t>2</w:t>
-      </w:r>
-      <w:r>
-        <w:rPr>
-          <w:lang w:val="es-ES"/>
-        </w:rPr>
-        <w:t>2.31</w:t>
+        <w:t>{</w:t>
+      </w:r>
+      <w:proofErr w:type="spellStart"/>
+      <w:r>
+        <w:rPr>
+          <w:lang w:val="es-ES"/>
+        </w:rPr>
+        <w:t>trvmax</w:t>
+      </w:r>
+      <w:proofErr w:type="spellEnd"/>
+      <w:r>
+        <w:rPr>
+          <w:lang w:val="es-ES"/>
+        </w:rPr>
+        <w:t>}</w:t>
       </w:r>
       <w:r>
         <w:rPr>
@@ -2911,7 +2913,47 @@
         <w:rPr>
           <w:lang w:val="es-ES"/>
         </w:rPr>
-        <w:t>20.4</w:t>
+        <w:t>{</w:t>
+      </w:r>
+      <w:proofErr w:type="spellStart"/>
+      <w:r>
+        <w:rPr>
+          <w:lang w:val="es-ES"/>
+        </w:rPr>
+        <w:t>trMaxGrad</w:t>
+      </w:r>
+      <w:proofErr w:type="spellEnd"/>
+      <w:r>
+        <w:rPr>
+          <w:lang w:val="es-ES"/>
+        </w:rPr>
+        <w:t>}</w:t>
+      </w:r>
+      <w:r>
+        <w:rPr>
+          <w:lang w:val="es-ES"/>
+        </w:rPr>
+        <w:t xml:space="preserve"> m</w:t>
+      </w:r>
+      <w:proofErr w:type="spellStart"/>
+      <w:r>
+        <w:rPr>
+          <w:lang w:val="es-ES"/>
+        </w:rPr>
+        <w:t>mHg</w:t>
+      </w:r>
+      <w:proofErr w:type="spellEnd"/>
+      <w:r>
+        <w:rPr>
+          <w:lang w:val="es-ES"/>
+        </w:rPr>
+        <w:t xml:space="preserve">, vena cava inferior </w:t>
+      </w:r>
+      <w:r>
+        <w:rPr>
+          <w:lang w:val="es-ES"/>
+        </w:rPr>
+        <w:t>de dimensiones normales</w:t>
       </w:r>
       <w:r>
         <w:rPr>
@@ -2919,25 +2961,75 @@
         </w:rPr>
         <w:t xml:space="preserve"> </w:t>
       </w:r>
+      <w:r>
+        <w:rPr>
+          <w:lang w:val="es-ES"/>
+        </w:rPr>
+        <w:t xml:space="preserve">diámetro </w:t>
+      </w:r>
+      <w:r>
+        <w:rPr>
+          <w:lang w:val="es-ES"/>
+        </w:rPr>
+        <w:t>{</w:t>
+      </w:r>
       <w:proofErr w:type="spellStart"/>
       <w:r>
         <w:rPr>
           <w:lang w:val="es-ES"/>
         </w:rPr>
-        <w:t>mmHg</w:t>
+        <w:t>ivcMaxDiam</w:t>
       </w:r>
       <w:proofErr w:type="spellEnd"/>
       <w:r>
         <w:rPr>
           <w:lang w:val="es-ES"/>
         </w:rPr>
-        <w:t xml:space="preserve">, vena cava inferior </w:t>
-      </w:r>
-      <w:r>
-        <w:rPr>
-          <w:lang w:val="es-ES"/>
-        </w:rPr>
-        <w:t>de dimensiones normales</w:t>
+        <w:t>}</w:t>
+      </w:r>
+      <w:r>
+        <w:rPr>
+          <w:lang w:val="es-ES"/>
+        </w:rPr>
+        <w:t xml:space="preserve"> cm</w:t>
+      </w:r>
+      <w:r>
+        <w:rPr>
+          <w:lang w:val="es-ES"/>
+        </w:rPr>
+        <w:t>,</w:t>
+      </w:r>
+      <w:r>
+        <w:rPr>
+          <w:lang w:val="es-ES"/>
+        </w:rPr>
+        <w:t xml:space="preserve"> con colapso inspiratorio </w:t>
+      </w:r>
+      <w:r>
+        <w:rPr>
+          <w:lang w:val="es-ES"/>
+        </w:rPr>
+        <w:t>{</w:t>
+      </w:r>
+      <w:proofErr w:type="spellStart"/>
+      <w:r>
+        <w:rPr>
+          <w:lang w:val="es-ES"/>
+        </w:rPr>
+        <w:t>ivcicM</w:t>
+      </w:r>
+      <w:proofErr w:type="spellEnd"/>
+      <w:r>
+        <w:rPr>
+          <w:lang w:val="es-ES"/>
+        </w:rPr>
+        <w:t>}</w:t>
+      </w:r>
+      <w:r>
+        <w:rPr>
+          <w:lang w:val="es-ES"/>
+        </w:rPr>
+        <w:t xml:space="preserve"> al</w:t>
       </w:r>
       <w:r>
         <w:rPr>
@@ -2949,61 +3041,33 @@
         <w:rPr>
           <w:lang w:val="es-ES"/>
         </w:rPr>
-        <w:t xml:space="preserve">diámetro </w:t>
-      </w:r>
-      <w:r>
-        <w:rPr>
-          <w:lang w:val="es-ES"/>
-        </w:rPr>
-        <w:t>1.71</w:t>
-      </w:r>
-      <w:r>
-        <w:rPr>
-          <w:lang w:val="es-ES"/>
-        </w:rPr>
-        <w:t xml:space="preserve"> cm</w:t>
-      </w:r>
-      <w:r>
-        <w:rPr>
-          <w:lang w:val="es-ES"/>
-        </w:rPr>
-        <w:t>,</w:t>
-      </w:r>
-      <w:r>
-        <w:rPr>
-          <w:lang w:val="es-ES"/>
-        </w:rPr>
-        <w:t xml:space="preserve"> con colapso inspiratorio m</w:t>
-      </w:r>
-      <w:r>
-        <w:rPr>
-          <w:lang w:val="es-ES"/>
-        </w:rPr>
-        <w:t>eno</w:t>
-      </w:r>
-      <w:r>
-        <w:rPr>
-          <w:lang w:val="es-ES"/>
-        </w:rPr>
-        <w:t>r</w:t>
-      </w:r>
-      <w:r>
-        <w:rPr>
-          <w:lang w:val="es-ES"/>
-        </w:rPr>
-        <w:t xml:space="preserve"> al</w:t>
-      </w:r>
-      <w:r>
-        <w:rPr>
-          <w:lang w:val="es-ES"/>
-        </w:rPr>
-        <w:t xml:space="preserve"> 50%, que permite estimar una PSAP </w:t>
-      </w:r>
-      <w:r>
-        <w:rPr>
-          <w:lang w:val="es-ES"/>
-        </w:rPr>
-        <w:t>23</w:t>
+        <w:t>{</w:t>
+      </w:r>
+      <w:proofErr w:type="spellStart"/>
+      <w:r>
+        <w:rPr>
+          <w:lang w:val="es-ES"/>
+        </w:rPr>
+        <w:t>ivcci</w:t>
+      </w:r>
+      <w:proofErr w:type="spellEnd"/>
+      <w:r>
+        <w:rPr>
+          <w:lang w:val="es-ES"/>
+        </w:rPr>
+        <w:t xml:space="preserve">} </w:t>
+      </w:r>
+      <w:r>
+        <w:rPr>
+          <w:lang w:val="es-ES"/>
+        </w:rPr>
+        <w:t xml:space="preserve">%, que permite estimar una PSAP </w:t>
+      </w:r>
+      <w:r>
+        <w:rPr>
+          <w:lang w:val="es-ES"/>
+        </w:rPr>
+        <w:t>{psap}</w:t>
       </w:r>
       <w:r>
         <w:rPr>
@@ -3558,6 +3622,7 @@
           <w:szCs w:val="24"/>
           <w:lang w:val="es-ES"/>
         </w:rPr>
+        <w:lastRenderedPageBreak/>
         <w:t>Médico cardiólogo</w:t>
       </w:r>
     </w:p>
@@ -3582,7 +3647,6 @@
           <w:szCs w:val="24"/>
           <w:lang w:val="es-ES"/>
         </w:rPr>
-        <w:lastRenderedPageBreak/>
         <w:t>Colegiado Activo 18,540</w:t>
       </w:r>
       <w:bookmarkEnd w:id="0"/>
@@ -4135,7 +4199,60 @@
                               <w:szCs w:val="18"/>
                               <w:lang w:val="es-ES"/>
                             </w:rPr>
-                            <w:t>- Monitoreo Ambulatorio de la presión arterial (MAPA)</w:t>
+                            <w:t xml:space="preserve">- Monitoreo Ambulatorio de la </w:t>
+                          </w:r>
+                        </w:p>
+                        <w:p>
+                          <w:pPr>
+                            <w:pStyle w:val="NoSpacing"/>
+                            <w:jc w:val="both"/>
+                            <w:rPr>
+                              <w:rFonts w:ascii="Agency FB" w:hAnsi="Agency FB"/>
+                              <w:b/>
+                              <w:bCs/>
+                              <w:sz w:val="18"/>
+                              <w:szCs w:val="18"/>
+                              <w:lang w:val="es-ES"/>
+                            </w:rPr>
+                          </w:pPr>
+                        </w:p>
+                        <w:p>
+                          <w:pPr>
+                            <w:pStyle w:val="NoSpacing"/>
+                            <w:jc w:val="both"/>
+                            <w:rPr>
+                              <w:rFonts w:ascii="Agency FB" w:hAnsi="Agency FB"/>
+                              <w:b/>
+                              <w:bCs/>
+                              <w:sz w:val="18"/>
+                              <w:szCs w:val="18"/>
+                              <w:lang w:val="es-ES"/>
+                            </w:rPr>
+                          </w:pPr>
+                        </w:p>
+                        <w:p>
+                          <w:pPr>
+                            <w:pStyle w:val="NoSpacing"/>
+                            <w:jc w:val="both"/>
+                            <w:rPr>
+                              <w:rFonts w:ascii="Agency FB" w:hAnsi="Agency FB"/>
+                              <w:b/>
+                              <w:bCs/>
+                              <w:sz w:val="18"/>
+                              <w:szCs w:val="18"/>
+                              <w:lang w:val="es-ES"/>
+                            </w:rPr>
+                          </w:pPr>
+                          <w:r>
+                            <w:rPr>
+                              <w:rFonts w:ascii="Agency FB" w:hAnsi="Agency FB"/>
+                              <w:b/>
+                              <w:bCs/>
+                              <w:sz w:val="18"/>
+                              <w:szCs w:val="18"/>
+                              <w:lang w:val="es-ES"/>
+                            </w:rPr>
+                            <w:t xml:space="preserve"> arterial (MAPA)</w:t>
                           </w:r>
                         </w:p>
                         <w:p>
@@ -4377,7 +4494,60 @@
                         <w:szCs w:val="18"/>
                         <w:lang w:val="es-ES"/>
                       </w:rPr>
-                      <w:t>- Monitoreo Ambulatorio de la presión arterial (MAPA)</w:t>
+                      <w:t xml:space="preserve">- Monitoreo Ambulatorio de la </w:t>
+                    </w:r>
+                  </w:p>
+                  <w:p>
+                    <w:pPr>
+                      <w:pStyle w:val="NoSpacing"/>
+                      <w:jc w:val="both"/>
+                      <w:rPr>
+                        <w:rFonts w:ascii="Agency FB" w:hAnsi="Agency FB"/>
+                        <w:b/>
+                        <w:bCs/>
+                        <w:sz w:val="18"/>
+                        <w:szCs w:val="18"/>
+                        <w:lang w:val="es-ES"/>
+                      </w:rPr>
+                    </w:pPr>
+                  </w:p>
+                  <w:p>
+                    <w:pPr>
+                      <w:pStyle w:val="NoSpacing"/>
+                      <w:jc w:val="both"/>
+                      <w:rPr>
+                        <w:rFonts w:ascii="Agency FB" w:hAnsi="Agency FB"/>
+                        <w:b/>
+                        <w:bCs/>
+                        <w:sz w:val="18"/>
+                        <w:szCs w:val="18"/>
+                        <w:lang w:val="es-ES"/>
+                      </w:rPr>
+                    </w:pPr>
+                  </w:p>
+                  <w:p>
+                    <w:pPr>
+                      <w:pStyle w:val="NoSpacing"/>
+                      <w:jc w:val="both"/>
+                      <w:rPr>
+                        <w:rFonts w:ascii="Agency FB" w:hAnsi="Agency FB"/>
+                        <w:b/>
+                        <w:bCs/>
+                        <w:sz w:val="18"/>
+                        <w:szCs w:val="18"/>
+                        <w:lang w:val="es-ES"/>
+                      </w:rPr>
+                    </w:pPr>
+                    <w:r>
+                      <w:rPr>
+                        <w:rFonts w:ascii="Agency FB" w:hAnsi="Agency FB"/>
+                        <w:b/>
+                        <w:bCs/>
+                        <w:sz w:val="18"/>
+                        <w:szCs w:val="18"/>
+                        <w:lang w:val="es-ES"/>
+                      </w:rPr>
+                      <w:t xml:space="preserve"> arterial (MAPA)</w:t>
                     </w:r>
                   </w:p>
                   <w:p>

</xml_diff>

<commit_message>
form added extra field, conclusions section added in actions.js, template updated, ijected data
</commit_message>
<xml_diff>
--- a/public/medical-rerpot-template.docx
+++ b/public/medical-rerpot-template.docx
@@ -3067,20 +3067,34 @@
         <w:rPr>
           <w:lang w:val="es-ES"/>
         </w:rPr>
-        <w:t>{psap}</w:t>
-      </w:r>
-      <w:r>
-        <w:rPr>
-          <w:lang w:val="es-ES"/>
-        </w:rPr>
-        <w:t xml:space="preserve"> </w:t>
-      </w:r>
-      <w:proofErr w:type="spellStart"/>
-      <w:r>
-        <w:rPr>
-          <w:lang w:val="es-ES"/>
-        </w:rPr>
-        <w:t>mmHg</w:t>
+        <w:t>{</w:t>
+      </w:r>
+      <w:proofErr w:type="spellStart"/>
+      <w:r>
+        <w:rPr>
+          <w:lang w:val="es-ES"/>
+        </w:rPr>
+        <w:t>psap</w:t>
+      </w:r>
+      <w:proofErr w:type="spellEnd"/>
+      <w:r>
+        <w:rPr>
+          <w:lang w:val="es-ES"/>
+        </w:rPr>
+        <w:t>}</w:t>
+      </w:r>
+      <w:r>
+        <w:rPr>
+          <w:lang w:val="es-ES"/>
+        </w:rPr>
+        <w:t xml:space="preserve"> m</w:t>
+      </w:r>
+      <w:proofErr w:type="spellStart"/>
+      <w:r>
+        <w:rPr>
+          <w:lang w:val="es-ES"/>
+        </w:rPr>
+        <w:t>mHg</w:t>
       </w:r>
       <w:proofErr w:type="spellEnd"/>
       <w:r>
@@ -3222,13 +3236,21 @@
         <w:rPr>
           <w:lang w:val="es-ES"/>
         </w:rPr>
-        <w:t>6</w:t>
-      </w:r>
-      <w:r>
-        <w:rPr>
-          <w:lang w:val="es-ES"/>
-        </w:rPr>
-        <w:t>9</w:t>
+        <w:t>{</w:t>
+      </w:r>
+      <w:proofErr w:type="spellStart"/>
+      <w:r>
+        <w:rPr>
+          <w:lang w:val="es-ES"/>
+        </w:rPr>
+        <w:t>lvefInt</w:t>
+      </w:r>
+      <w:proofErr w:type="spellEnd"/>
+      <w:r>
+        <w:rPr>
+          <w:lang w:val="es-ES"/>
+        </w:rPr>
+        <w:t>}</w:t>
       </w:r>
       <w:r>
         <w:rPr>
@@ -3306,7 +3328,27 @@
         <w:rPr>
           <w:lang w:val="es-ES"/>
         </w:rPr>
-        <w:t xml:space="preserve">22 </w:t>
+        <w:t>{</w:t>
+      </w:r>
+      <w:proofErr w:type="spellStart"/>
+      <w:r>
+        <w:rPr>
+          <w:lang w:val="es-ES"/>
+        </w:rPr>
+        <w:t>rvtapse</w:t>
+      </w:r>
+      <w:proofErr w:type="spellEnd"/>
+      <w:r>
+        <w:rPr>
+          <w:lang w:val="es-ES"/>
+        </w:rPr>
+        <w:t>}</w:t>
+      </w:r>
+      <w:r>
+        <w:rPr>
+          <w:lang w:val="es-ES"/>
+        </w:rPr>
+        <w:t xml:space="preserve"> </w:t>
       </w:r>
       <w:r>
         <w:rPr>
@@ -3318,13 +3360,59 @@
         <w:rPr>
           <w:lang w:val="es-ES"/>
         </w:rPr>
-        <w:t xml:space="preserve">13.18 </w:t>
-      </w:r>
-      <w:r>
-        <w:rPr>
-          <w:lang w:val="es-ES"/>
-        </w:rPr>
-        <w:t>cm/s, FAC 40 %.</w:t>
+        <w:t>{</w:t>
+      </w:r>
+      <w:proofErr w:type="spellStart"/>
+      <w:r>
+        <w:rPr>
+          <w:lang w:val="es-ES"/>
+        </w:rPr>
+        <w:t>sWave</w:t>
+      </w:r>
+      <w:proofErr w:type="spellEnd"/>
+      <w:r>
+        <w:rPr>
+          <w:lang w:val="es-ES"/>
+        </w:rPr>
+        <w:t>}</w:t>
+      </w:r>
+      <w:r>
+        <w:rPr>
+          <w:lang w:val="es-ES"/>
+        </w:rPr>
+        <w:t xml:space="preserve"> </w:t>
+      </w:r>
+      <w:r>
+        <w:rPr>
+          <w:lang w:val="es-ES"/>
+        </w:rPr>
+        <w:t xml:space="preserve">cm/s, FAC </w:t>
+      </w:r>
+      <w:r>
+        <w:rPr>
+          <w:lang w:val="es-ES"/>
+        </w:rPr>
+        <w:t>{</w:t>
+      </w:r>
+      <w:proofErr w:type="spellStart"/>
+      <w:r>
+        <w:rPr>
+          <w:lang w:val="es-ES"/>
+        </w:rPr>
+        <w:t>rvfacInt</w:t>
+      </w:r>
+      <w:proofErr w:type="spellEnd"/>
+      <w:r>
+        <w:rPr>
+          <w:lang w:val="es-ES"/>
+        </w:rPr>
+        <w:t>}</w:t>
+      </w:r>
+      <w:r>
+        <w:rPr>
+          <w:lang w:val="es-ES"/>
+        </w:rPr>
+        <w:t xml:space="preserve"> %.</w:t>
       </w:r>
     </w:p>
     <w:p>
@@ -3415,7 +3503,7 @@
         <w:rPr>
           <w:lang w:val="es-ES"/>
         </w:rPr>
-        <w:t>23</w:t>
+        <w:t>{pasp}</w:t>
       </w:r>
       <w:r>
         <w:rPr>

</xml_diff>

<commit_message>
template updated, dafulat values for testing
</commit_message>
<xml_diff>
--- a/public/medical-rerpot-template.docx
+++ b/public/medical-rerpot-template.docx
@@ -121,7 +121,6 @@
               </w:rPr>
               <w:t>{</w:t>
             </w:r>
-            <w:proofErr w:type="spellStart"/>
             <w:r>
               <w:rPr>
                 <w:sz w:val="28"/>
@@ -131,7 +130,6 @@
               </w:rPr>
               <w:t>name</w:t>
             </w:r>
-            <w:proofErr w:type="spellEnd"/>
             <w:r>
               <w:rPr>
                 <w:sz w:val="28"/>
@@ -200,27 +198,7 @@
                 <w:u w:val="single"/>
                 <w:lang w:val="es-ES"/>
               </w:rPr>
-              <w:t>{</w:t>
-            </w:r>
-            <w:proofErr w:type="spellStart"/>
-            <w:r>
-              <w:rPr>
-                <w:sz w:val="28"/>
-                <w:szCs w:val="28"/>
-                <w:u w:val="single"/>
-                <w:lang w:val="es-ES"/>
-              </w:rPr>
-              <w:t>age</w:t>
-            </w:r>
-            <w:proofErr w:type="spellEnd"/>
-            <w:r>
-              <w:rPr>
-                <w:sz w:val="28"/>
-                <w:szCs w:val="28"/>
-                <w:u w:val="single"/>
-                <w:lang w:val="es-ES"/>
-              </w:rPr>
-              <w:t>}</w:t>
+              <w:t>{age}</w:t>
             </w:r>
             <w:r>
               <w:rPr>
@@ -271,18 +249,7 @@
                 <w:szCs w:val="28"/>
                 <w:lang w:val="es-ES"/>
               </w:rPr>
-              <w:t>Fecha del estudio</w:t>
-            </w:r>
-            <w:proofErr w:type="gramStart"/>
-            <w:r>
-              <w:rPr>
-                <w:b/>
-                <w:bCs/>
-                <w:sz w:val="28"/>
-                <w:szCs w:val="28"/>
-                <w:lang w:val="es-ES"/>
-              </w:rPr>
-              <w:t>:</w:t>
+              <w:t>Fecha del estudio:</w:t>
             </w:r>
             <w:r>
               <w:rPr>
@@ -311,17 +278,7 @@
                 <w:u w:val="single"/>
                 <w:lang w:val="es-ES"/>
               </w:rPr>
-              <w:t>{</w:t>
-            </w:r>
-            <w:proofErr w:type="gramEnd"/>
-            <w:r>
-              <w:rPr>
-                <w:sz w:val="28"/>
-                <w:szCs w:val="28"/>
-                <w:u w:val="single"/>
-                <w:lang w:val="es-ES"/>
-              </w:rPr>
-              <w:t>date}</w:t>
+              <w:t>{date}</w:t>
             </w:r>
             <w:r>
               <w:rPr>
@@ -393,27 +350,7 @@
                 <w:u w:val="single"/>
                 <w:lang w:val="es-ES"/>
               </w:rPr>
-              <w:t>{</w:t>
-            </w:r>
-            <w:proofErr w:type="spellStart"/>
-            <w:r>
-              <w:rPr>
-                <w:sz w:val="28"/>
-                <w:szCs w:val="28"/>
-                <w:u w:val="single"/>
-                <w:lang w:val="es-ES"/>
-              </w:rPr>
-              <w:t>weight</w:t>
-            </w:r>
-            <w:proofErr w:type="spellEnd"/>
-            <w:r>
-              <w:rPr>
-                <w:sz w:val="28"/>
-                <w:szCs w:val="28"/>
-                <w:u w:val="single"/>
-                <w:lang w:val="es-ES"/>
-              </w:rPr>
-              <w:t>}</w:t>
+              <w:t>{weight}</w:t>
             </w:r>
             <w:r>
               <w:rPr>
@@ -504,27 +441,7 @@
                 <w:u w:val="single"/>
                 <w:lang w:val="en-US"/>
               </w:rPr>
-              <w:t>{</w:t>
-            </w:r>
-            <w:proofErr w:type="spellStart"/>
-            <w:r>
-              <w:rPr>
-                <w:sz w:val="28"/>
-                <w:szCs w:val="28"/>
-                <w:u w:val="single"/>
-                <w:lang w:val="en-US"/>
-              </w:rPr>
-              <w:t>asc</w:t>
-            </w:r>
-            <w:proofErr w:type="spellEnd"/>
-            <w:r>
-              <w:rPr>
-                <w:sz w:val="28"/>
-                <w:szCs w:val="28"/>
-                <w:u w:val="single"/>
-                <w:lang w:val="en-US"/>
-              </w:rPr>
-              <w:t>}</w:t>
+              <w:t>{asc}</w:t>
             </w:r>
             <w:r>
               <w:rPr>
@@ -592,28 +509,7 @@
                 <w:szCs w:val="24"/>
                 <w:lang w:val="es-ES"/>
               </w:rPr>
-              <w:t>{^</w:t>
-            </w:r>
-            <w:proofErr w:type="spellStart"/>
-            <w:proofErr w:type="gramStart"/>
-            <w:r>
-              <w:rPr>
-                <w:rFonts w:cs="Arial"/>
-                <w:sz w:val="24"/>
-                <w:szCs w:val="24"/>
-                <w:lang w:val="es-ES"/>
-              </w:rPr>
-              <w:t>hasReference</w:t>
-            </w:r>
-            <w:proofErr w:type="spellEnd"/>
-            <w:r>
-              <w:rPr>
-                <w:rFonts w:cs="Arial"/>
-                <w:sz w:val="24"/>
-                <w:szCs w:val="24"/>
-                <w:lang w:val="es-ES"/>
-              </w:rPr>
-              <w:t>}</w:t>
+              <w:t>{^hasReference}</w:t>
             </w:r>
             <w:r>
               <w:rPr>
@@ -623,18 +519,7 @@
                 <w:szCs w:val="28"/>
                 <w:lang w:val="es-ES"/>
               </w:rPr>
-              <w:t>Referencia</w:t>
-            </w:r>
-            <w:proofErr w:type="gramEnd"/>
-            <w:r>
-              <w:rPr>
-                <w:b/>
-                <w:bCs/>
-                <w:sz w:val="28"/>
-                <w:szCs w:val="28"/>
-                <w:lang w:val="es-ES"/>
-              </w:rPr>
-              <w:t>:</w:t>
+              <w:t>Referencia:</w:t>
             </w:r>
             <w:r>
               <w:rPr>
@@ -662,27 +547,7 @@
                 <w:szCs w:val="24"/>
                 <w:lang w:val="es-ES"/>
               </w:rPr>
-              <w:t>{/</w:t>
-            </w:r>
-            <w:proofErr w:type="spellStart"/>
-            <w:r>
-              <w:rPr>
-                <w:rFonts w:cs="Arial"/>
-                <w:sz w:val="24"/>
-                <w:szCs w:val="24"/>
-                <w:lang w:val="es-ES"/>
-              </w:rPr>
-              <w:t>hasReference</w:t>
-            </w:r>
-            <w:proofErr w:type="spellEnd"/>
-            <w:r>
-              <w:rPr>
-                <w:rFonts w:cs="Arial"/>
-                <w:sz w:val="24"/>
-                <w:szCs w:val="24"/>
-                <w:lang w:val="es-ES"/>
-              </w:rPr>
-              <w:t>}</w:t>
+              <w:t>{/hasReference}</w:t>
             </w:r>
           </w:p>
         </w:tc>
@@ -765,27 +630,7 @@
           <w:u w:val="single"/>
           <w:lang w:val="es-ES"/>
         </w:rPr>
-        <w:t>{</w:t>
-      </w:r>
-      <w:proofErr w:type="spellStart"/>
-      <w:r>
-        <w:rPr>
-          <w:sz w:val="28"/>
-          <w:szCs w:val="28"/>
-          <w:u w:val="single"/>
-          <w:lang w:val="es-ES"/>
-        </w:rPr>
-        <w:t>reference</w:t>
-      </w:r>
-      <w:proofErr w:type="spellEnd"/>
-      <w:r>
-        <w:rPr>
-          <w:sz w:val="28"/>
-          <w:szCs w:val="28"/>
-          <w:u w:val="single"/>
-          <w:lang w:val="es-ES"/>
-        </w:rPr>
-        <w:t>}.</w:t>
+        <w:t>{reference}.</w:t>
       </w:r>
     </w:p>
     <w:p>
@@ -806,190 +651,690 @@
           <w:szCs w:val="24"/>
           <w:lang w:val="es-ES"/>
         </w:rPr>
-        <w:t>{/</w:t>
-      </w:r>
-      <w:proofErr w:type="spellStart"/>
-      <w:r>
+        <w:t>{/hasReference}</w:t>
+      </w:r>
+    </w:p>
+    <w:p>
+      <w:pPr>
+        <w:pStyle w:val="NoSpacing"/>
+        <w:jc w:val="both"/>
         <w:rPr>
           <w:rFonts w:cs="Arial"/>
           <w:sz w:val="24"/>
           <w:szCs w:val="24"/>
           <w:lang w:val="es-ES"/>
         </w:rPr>
-        <w:t>hasReference</w:t>
-      </w:r>
-      <w:proofErr w:type="spellEnd"/>
-      <w:r>
-        <w:rPr>
-          <w:rFonts w:cs="Arial"/>
-          <w:sz w:val="24"/>
-          <w:szCs w:val="24"/>
-          <w:lang w:val="es-ES"/>
-        </w:rPr>
-        <w:t>}</w:t>
-      </w:r>
+      </w:pPr>
     </w:p>
     <w:p>
       <w:pPr>
         <w:pStyle w:val="NoSpacing"/>
         <w:jc w:val="both"/>
         <w:rPr>
+          <w:rFonts w:ascii="Arial" w:hAnsi="Arial" w:cs="Arial"/>
+          <w:lang w:val="es-ES"/>
+        </w:rPr>
+      </w:pPr>
+      <w:r>
+        <w:rPr>
           <w:rFonts w:cs="Arial"/>
-          <w:sz w:val="24"/>
-          <w:szCs w:val="24"/>
-          <w:lang w:val="es-ES"/>
-        </w:rPr>
-      </w:pPr>
+          <w:lang w:val="es-ES"/>
+        </w:rPr>
+        <w:t>Bajo los estándares de la sociedad americana de ecocardiografía se procede a realizar ecocardiograma transtorácico 2D – modo M, Doppler continuo, pulsado y color, con equipo Sonoscape X-3</w:t>
+      </w:r>
+      <w:r>
+        <w:rPr>
+          <w:rFonts w:cs="Arial"/>
+          <w:lang w:val="es-ES"/>
+        </w:rPr>
+        <w:t xml:space="preserve">. </w:t>
+      </w:r>
+      <w:r>
+        <w:rPr>
+          <w:rFonts w:cs="Arial"/>
+          <w:lang w:val="es-ES"/>
+        </w:rPr>
+        <w:t>Estudio realizado en ritmo sinusal,</w:t>
+      </w:r>
+      <w:r>
+        <w:rPr>
+          <w:rFonts w:cs="Arial"/>
+          <w:lang w:val="es-ES"/>
+        </w:rPr>
+        <w:t xml:space="preserve"> </w:t>
+      </w:r>
+      <w:r>
+        <w:rPr>
+          <w:rFonts w:cs="Arial"/>
+          <w:lang w:val="es-ES"/>
+        </w:rPr>
+        <w:t xml:space="preserve">frecuencia promedio </w:t>
+      </w:r>
+      <w:r>
+        <w:rPr>
+          <w:rFonts w:cs="Arial"/>
+          <w:lang w:val="es-ES"/>
+        </w:rPr>
+        <w:t>66</w:t>
+      </w:r>
+      <w:r>
+        <w:rPr>
+          <w:rFonts w:cs="Arial"/>
+          <w:lang w:val="es-ES"/>
+        </w:rPr>
+        <w:t xml:space="preserve"> l</w:t>
+      </w:r>
+      <w:r>
+        <w:rPr>
+          <w:rFonts w:cs="Arial"/>
+          <w:lang w:val="es-ES"/>
+        </w:rPr>
+        <w:t xml:space="preserve">atidos </w:t>
+      </w:r>
+      <w:r>
+        <w:rPr>
+          <w:rFonts w:cs="Arial"/>
+          <w:lang w:val="es-ES"/>
+        </w:rPr>
+        <w:t>p</w:t>
+      </w:r>
+      <w:r>
+        <w:rPr>
+          <w:rFonts w:cs="Arial"/>
+          <w:lang w:val="es-ES"/>
+        </w:rPr>
+        <w:t xml:space="preserve">or </w:t>
+      </w:r>
+      <w:r>
+        <w:rPr>
+          <w:rFonts w:cs="Arial"/>
+          <w:lang w:val="es-ES"/>
+        </w:rPr>
+        <w:t>m</w:t>
+      </w:r>
+      <w:r>
+        <w:rPr>
+          <w:rFonts w:cs="Arial"/>
+          <w:lang w:val="es-ES"/>
+        </w:rPr>
+        <w:t xml:space="preserve">inuto, </w:t>
+      </w:r>
+      <w:r>
+        <w:rPr>
+          <w:rFonts w:cs="Arial"/>
+          <w:lang w:val="es-ES"/>
+        </w:rPr>
+        <w:t xml:space="preserve">se </w:t>
+      </w:r>
+      <w:r>
+        <w:rPr>
+          <w:rFonts w:cs="Arial"/>
+          <w:lang w:val="es-ES"/>
+        </w:rPr>
+        <w:t>obt</w:t>
+      </w:r>
+      <w:r>
+        <w:rPr>
+          <w:rFonts w:cs="Arial"/>
+          <w:lang w:val="es-ES"/>
+        </w:rPr>
+        <w:t>i</w:t>
+      </w:r>
+      <w:r>
+        <w:rPr>
+          <w:rFonts w:cs="Arial"/>
+          <w:lang w:val="es-ES"/>
+        </w:rPr>
+        <w:t>enen los siguientes hallazgos:</w:t>
+      </w:r>
     </w:p>
     <w:p>
       <w:pPr>
         <w:pStyle w:val="NoSpacing"/>
-        <w:jc w:val="both"/>
-        <w:rPr>
-          <w:rFonts w:ascii="Arial" w:hAnsi="Arial" w:cs="Arial"/>
-          <w:lang w:val="es-ES"/>
-        </w:rPr>
-      </w:pPr>
-      <w:r>
-        <w:rPr>
-          <w:rFonts w:cs="Arial"/>
-          <w:lang w:val="es-ES"/>
-        </w:rPr>
-        <w:t xml:space="preserve">Bajo los estándares de la sociedad americana de ecocardiografía se procede a realizar ecocardiograma transtorácico 2D – modo M, Doppler continuo, pulsado y color, con equipo </w:t>
-      </w:r>
-      <w:proofErr w:type="spellStart"/>
-      <w:r>
-        <w:rPr>
-          <w:rFonts w:cs="Arial"/>
-          <w:lang w:val="es-ES"/>
-        </w:rPr>
-        <w:t>Sonoscape</w:t>
-      </w:r>
-      <w:proofErr w:type="spellEnd"/>
-      <w:r>
-        <w:rPr>
-          <w:rFonts w:cs="Arial"/>
-          <w:lang w:val="es-ES"/>
-        </w:rPr>
-        <w:t xml:space="preserve"> X-3</w:t>
-      </w:r>
-      <w:r>
-        <w:rPr>
-          <w:rFonts w:cs="Arial"/>
-          <w:lang w:val="es-ES"/>
-        </w:rPr>
-        <w:t xml:space="preserve">. </w:t>
-      </w:r>
-      <w:r>
-        <w:rPr>
-          <w:rFonts w:cs="Arial"/>
-          <w:lang w:val="es-ES"/>
-        </w:rPr>
-        <w:t>Estudio realizado en ritmo sinusal,</w:t>
-      </w:r>
-      <w:r>
-        <w:rPr>
-          <w:rFonts w:cs="Arial"/>
-          <w:lang w:val="es-ES"/>
-        </w:rPr>
-        <w:t xml:space="preserve"> </w:t>
-      </w:r>
-      <w:r>
-        <w:rPr>
-          <w:rFonts w:cs="Arial"/>
-          <w:lang w:val="es-ES"/>
-        </w:rPr>
-        <w:t xml:space="preserve">frecuencia promedio </w:t>
-      </w:r>
-      <w:r>
-        <w:rPr>
-          <w:rFonts w:cs="Arial"/>
-          <w:lang w:val="es-ES"/>
-        </w:rPr>
-        <w:t>66</w:t>
-      </w:r>
-      <w:r>
-        <w:rPr>
-          <w:rFonts w:cs="Arial"/>
-          <w:lang w:val="es-ES"/>
-        </w:rPr>
-        <w:t xml:space="preserve"> l</w:t>
-      </w:r>
-      <w:r>
-        <w:rPr>
-          <w:rFonts w:cs="Arial"/>
-          <w:lang w:val="es-ES"/>
-        </w:rPr>
-        <w:t xml:space="preserve">atidos </w:t>
-      </w:r>
-      <w:r>
-        <w:rPr>
-          <w:rFonts w:cs="Arial"/>
-          <w:lang w:val="es-ES"/>
-        </w:rPr>
-        <w:t>p</w:t>
-      </w:r>
-      <w:r>
-        <w:rPr>
-          <w:rFonts w:cs="Arial"/>
-          <w:lang w:val="es-ES"/>
-        </w:rPr>
-        <w:t xml:space="preserve">or </w:t>
-      </w:r>
-      <w:r>
-        <w:rPr>
-          <w:rFonts w:cs="Arial"/>
-          <w:lang w:val="es-ES"/>
-        </w:rPr>
-        <w:t>m</w:t>
-      </w:r>
-      <w:r>
-        <w:rPr>
-          <w:rFonts w:cs="Arial"/>
-          <w:lang w:val="es-ES"/>
-        </w:rPr>
-        <w:t xml:space="preserve">inuto, </w:t>
-      </w:r>
-      <w:r>
-        <w:rPr>
-          <w:rFonts w:cs="Arial"/>
-          <w:lang w:val="es-ES"/>
-        </w:rPr>
-        <w:t xml:space="preserve">se </w:t>
-      </w:r>
-      <w:r>
-        <w:rPr>
-          <w:rFonts w:cs="Arial"/>
-          <w:lang w:val="es-ES"/>
-        </w:rPr>
-        <w:t>obt</w:t>
-      </w:r>
-      <w:r>
-        <w:rPr>
-          <w:rFonts w:cs="Arial"/>
-          <w:lang w:val="es-ES"/>
-        </w:rPr>
-        <w:t>i</w:t>
-      </w:r>
-      <w:r>
-        <w:rPr>
-          <w:rFonts w:cs="Arial"/>
-          <w:lang w:val="es-ES"/>
-        </w:rPr>
-        <w:t>enen los siguientes hallazgos:</w:t>
-      </w:r>
+        <w:rPr>
+          <w:lang w:val="es-ES"/>
+        </w:rPr>
+      </w:pPr>
     </w:p>
     <w:p>
       <w:pPr>
         <w:pStyle w:val="NoSpacing"/>
-        <w:rPr>
-          <w:lang w:val="es-ES"/>
-        </w:rPr>
-      </w:pPr>
+        <w:jc w:val="both"/>
+        <w:rPr>
+          <w:lang w:val="es-ES"/>
+        </w:rPr>
+      </w:pPr>
+      <w:r>
+        <w:rPr>
+          <w:b/>
+          <w:bCs/>
+          <w:lang w:val="es-ES"/>
+        </w:rPr>
+        <w:t xml:space="preserve">Ventrículo izquierdo: </w:t>
+      </w:r>
+      <w:r>
+        <w:rPr>
+          <w:lang w:val="es-ES"/>
+        </w:rPr>
+        <w:t>de dimensiones y geometría normal</w:t>
+      </w:r>
+      <w:r>
+        <w:rPr>
+          <w:lang w:val="es-ES"/>
+        </w:rPr>
+        <w:t xml:space="preserve">, diámetro telediastólico indexado </w:t>
+      </w:r>
+      <w:r>
+        <w:rPr>
+          <w:lang w:val="es-ES"/>
+        </w:rPr>
+        <w:t>{</w:t>
+      </w:r>
+      <w:r>
+        <w:rPr>
+          <w:lang w:val="es-ES"/>
+        </w:rPr>
+        <w:t>ilvedd</w:t>
+      </w:r>
+      <w:r>
+        <w:rPr>
+          <w:lang w:val="es-ES"/>
+        </w:rPr>
+        <w:t>}</w:t>
+      </w:r>
+      <w:r>
+        <w:rPr>
+          <w:lang w:val="es-ES"/>
+        </w:rPr>
+        <w:t xml:space="preserve"> cm/m</w:t>
+      </w:r>
+      <w:r>
+        <w:rPr>
+          <w:rFonts w:cstheme="minorHAnsi"/>
+          <w:lang w:val="es-ES"/>
+        </w:rPr>
+        <w:t>²</w:t>
+      </w:r>
+      <w:r>
+        <w:rPr>
+          <w:lang w:val="es-ES"/>
+        </w:rPr>
+        <w:t xml:space="preserve">, volumen telediastólico indexado </w:t>
+      </w:r>
+      <w:r>
+        <w:rPr>
+          <w:lang w:val="es-ES"/>
+        </w:rPr>
+        <w:t>{</w:t>
+      </w:r>
+      <w:r>
+        <w:rPr>
+          <w:lang w:val="es-ES"/>
+        </w:rPr>
+        <w:t>ilvedv</w:t>
+      </w:r>
+      <w:r>
+        <w:rPr>
+          <w:lang w:val="es-ES"/>
+        </w:rPr>
+        <w:t>}</w:t>
+      </w:r>
+      <w:r>
+        <w:rPr>
+          <w:lang w:val="es-ES"/>
+        </w:rPr>
+        <w:t xml:space="preserve"> ml/m</w:t>
+      </w:r>
+      <w:r>
+        <w:rPr>
+          <w:rFonts w:cstheme="minorHAnsi"/>
+          <w:lang w:val="es-ES"/>
+        </w:rPr>
+        <w:t>²</w:t>
+      </w:r>
+      <w:r>
+        <w:rPr>
+          <w:lang w:val="es-ES"/>
+        </w:rPr>
+        <w:t xml:space="preserve">, masa indexada </w:t>
+      </w:r>
+      <w:r>
+        <w:rPr>
+          <w:lang w:val="es-ES"/>
+        </w:rPr>
+        <w:t>{</w:t>
+      </w:r>
+      <w:r>
+        <w:rPr>
+          <w:lang w:val="es-ES"/>
+        </w:rPr>
+        <w:t>ilvmass</w:t>
+      </w:r>
+      <w:r>
+        <w:rPr>
+          <w:lang w:val="es-ES"/>
+        </w:rPr>
+        <w:t>}</w:t>
+      </w:r>
+      <w:r>
+        <w:rPr>
+          <w:lang w:val="es-ES"/>
+        </w:rPr>
+        <w:t xml:space="preserve"> gr/m</w:t>
+      </w:r>
+      <w:r>
+        <w:rPr>
+          <w:rFonts w:cstheme="minorHAnsi"/>
+          <w:lang w:val="es-ES"/>
+        </w:rPr>
+        <w:t>²</w:t>
+      </w:r>
+      <w:r>
+        <w:rPr>
+          <w:lang w:val="es-ES"/>
+        </w:rPr>
+        <w:t xml:space="preserve">, SIVd: </w:t>
+      </w:r>
+      <w:r>
+        <w:rPr>
+          <w:lang w:val="es-ES"/>
+        </w:rPr>
+        <w:t>{ivsd}</w:t>
+      </w:r>
+      <w:r>
+        <w:rPr>
+          <w:lang w:val="es-ES"/>
+        </w:rPr>
+        <w:t xml:space="preserve"> cm, DIVId: </w:t>
+      </w:r>
+      <w:r>
+        <w:rPr>
+          <w:lang w:val="es-ES"/>
+        </w:rPr>
+        <w:t>{</w:t>
+      </w:r>
+      <w:r>
+        <w:rPr>
+          <w:lang w:val="es-ES"/>
+        </w:rPr>
+        <w:t>lvided</w:t>
+      </w:r>
+      <w:r>
+        <w:rPr>
+          <w:lang w:val="es-ES"/>
+        </w:rPr>
+        <w:t>}</w:t>
+      </w:r>
+      <w:r>
+        <w:rPr>
+          <w:lang w:val="es-ES"/>
+        </w:rPr>
+        <w:t xml:space="preserve"> cm, PPVId: </w:t>
+      </w:r>
+      <w:r>
+        <w:rPr>
+          <w:lang w:val="es-ES"/>
+        </w:rPr>
+        <w:t>{lvpwd}</w:t>
+      </w:r>
+      <w:r>
+        <w:rPr>
+          <w:lang w:val="es-ES"/>
+        </w:rPr>
+        <w:t xml:space="preserve"> cm, grosor parietal relativo </w:t>
+      </w:r>
+      <w:r>
+        <w:rPr>
+          <w:lang w:val="es-ES"/>
+        </w:rPr>
+        <w:t>{lvrwt}</w:t>
+      </w:r>
+      <w:r>
+        <w:rPr>
+          <w:lang w:val="es-ES"/>
+        </w:rPr>
+        <w:t xml:space="preserve">, no se observan trastornos de la contractilidad global o segmentaria. Volumen telediastólico </w:t>
+      </w:r>
+      <w:r>
+        <w:rPr>
+          <w:lang w:val="es-ES"/>
+        </w:rPr>
+        <w:t>{</w:t>
+      </w:r>
+      <w:r>
+        <w:rPr>
+          <w:lang w:val="es-ES"/>
+        </w:rPr>
+        <w:t>lvedv</w:t>
+      </w:r>
+      <w:r>
+        <w:rPr>
+          <w:lang w:val="es-ES"/>
+        </w:rPr>
+        <w:t>}</w:t>
+      </w:r>
+      <w:r>
+        <w:rPr>
+          <w:lang w:val="es-ES"/>
+        </w:rPr>
+        <w:t xml:space="preserve"> ml, volumen telesistólico </w:t>
+      </w:r>
+      <w:r>
+        <w:rPr>
+          <w:lang w:val="es-ES"/>
+        </w:rPr>
+        <w:t>{lvesv}</w:t>
+      </w:r>
+      <w:r>
+        <w:rPr>
+          <w:lang w:val="es-ES"/>
+        </w:rPr>
+        <w:t xml:space="preserve"> ml, FEVI: </w:t>
+      </w:r>
+      <w:r>
+        <w:rPr>
+          <w:lang w:val="es-ES"/>
+        </w:rPr>
+        <w:t>{</w:t>
+      </w:r>
+      <w:r>
+        <w:rPr>
+          <w:lang w:val="es-ES"/>
+        </w:rPr>
+        <w:t>lvef</w:t>
+      </w:r>
+      <w:r>
+        <w:rPr>
+          <w:lang w:val="es-ES"/>
+        </w:rPr>
+        <w:t>}</w:t>
+      </w:r>
+      <w:r>
+        <w:rPr>
+          <w:lang w:val="es-ES"/>
+        </w:rPr>
+        <w:t xml:space="preserve"> </w:t>
+      </w:r>
+      <w:r>
+        <w:rPr>
+          <w:lang w:val="es-ES"/>
+        </w:rPr>
+        <w:t xml:space="preserve">% por método biplano. Flujograma transmitral:  onda E: </w:t>
+      </w:r>
+      <w:r>
+        <w:rPr>
+          <w:lang w:val="es-ES"/>
+        </w:rPr>
+        <w:t>{eWave}</w:t>
+      </w:r>
+      <w:r>
+        <w:rPr>
+          <w:lang w:val="es-ES"/>
+        </w:rPr>
+        <w:t xml:space="preserve"> cm/s, onda A: </w:t>
+      </w:r>
+      <w:r>
+        <w:rPr>
+          <w:lang w:val="es-ES"/>
+        </w:rPr>
+        <w:t>{aWave}</w:t>
+      </w:r>
+      <w:r>
+        <w:rPr>
+          <w:lang w:val="es-ES"/>
+        </w:rPr>
+        <w:t xml:space="preserve"> cm/s, relación E/A </w:t>
+      </w:r>
+      <w:r>
+        <w:rPr>
+          <w:lang w:val="es-ES"/>
+        </w:rPr>
+        <w:t>{eaWaveRel}</w:t>
+      </w:r>
+      <w:r>
+        <w:rPr>
+          <w:lang w:val="es-ES"/>
+        </w:rPr>
+        <w:t xml:space="preserve">, pendiente de desaceleración </w:t>
+      </w:r>
+      <w:r>
+        <w:rPr>
+          <w:lang w:val="es-ES"/>
+        </w:rPr>
+        <w:t>{lvfdt}</w:t>
+      </w:r>
+      <w:r>
+        <w:rPr>
+          <w:lang w:val="es-ES"/>
+        </w:rPr>
+        <w:t xml:space="preserve"> mseg, TRIV </w:t>
+      </w:r>
+      <w:r>
+        <w:rPr>
+          <w:lang w:val="es-ES"/>
+        </w:rPr>
+        <w:t>{lfivrt}</w:t>
+      </w:r>
+      <w:r>
+        <w:rPr>
+          <w:lang w:val="es-ES"/>
+        </w:rPr>
+        <w:t xml:space="preserve"> mseg, Doppler tisular del anillo mitral onda e septal</w:t>
+      </w:r>
+      <w:r>
+        <w:rPr>
+          <w:lang w:val="es-ES"/>
+        </w:rPr>
+        <w:t xml:space="preserve"> </w:t>
+      </w:r>
+      <w:r>
+        <w:rPr>
+          <w:lang w:val="es-ES"/>
+        </w:rPr>
+        <w:t>{ePrimeSeptal}</w:t>
+      </w:r>
+      <w:r>
+        <w:rPr>
+          <w:lang w:val="es-ES"/>
+        </w:rPr>
+        <w:t xml:space="preserve"> cm/s, onda e lateral </w:t>
+      </w:r>
+      <w:r>
+        <w:rPr>
+          <w:lang w:val="es-ES"/>
+        </w:rPr>
+        <w:t>{ePrimeLateral}</w:t>
+      </w:r>
+      <w:r>
+        <w:rPr>
+          <w:lang w:val="es-ES"/>
+        </w:rPr>
+        <w:t xml:space="preserve"> cm/s, relación E/</w:t>
+      </w:r>
+      <w:r>
+        <w:rPr>
+          <w:lang w:val="es-ES"/>
+        </w:rPr>
+        <w:t>e</w:t>
+      </w:r>
+      <w:r>
+        <w:rPr>
+          <w:lang w:val="es-ES"/>
+        </w:rPr>
+        <w:t xml:space="preserve">’ </w:t>
+      </w:r>
+      <w:r>
+        <w:rPr>
+          <w:lang w:val="es-ES"/>
+        </w:rPr>
+        <w:t>{eRatio}</w:t>
+      </w:r>
+      <w:r>
+        <w:rPr>
+          <w:lang w:val="es-ES"/>
+        </w:rPr>
+        <w:t>.</w:t>
+      </w:r>
+      <w:r>
+        <w:rPr>
+          <w:lang w:val="es-ES"/>
+        </w:rPr>
+        <w:t xml:space="preserve"> </w:t>
+      </w:r>
+      <w:r>
+        <w:rPr>
+          <w:lang w:val="es-ES"/>
+        </w:rPr>
+        <w:t>D</w:t>
+      </w:r>
+      <w:r>
+        <w:rPr>
+          <w:lang w:val="es-ES"/>
+        </w:rPr>
+        <w:t xml:space="preserve">iámetro de tracto de salida VI: </w:t>
+      </w:r>
+      <w:r>
+        <w:rPr>
+          <w:lang w:val="es-ES"/>
+        </w:rPr>
+        <w:t xml:space="preserve">{lvotd} </w:t>
+      </w:r>
+      <w:r>
+        <w:rPr>
+          <w:lang w:val="es-ES"/>
+        </w:rPr>
+        <w:t xml:space="preserve">cm, Raíz aórtica </w:t>
+      </w:r>
+      <w:r>
+        <w:rPr>
+          <w:lang w:val="es-ES"/>
+        </w:rPr>
+        <w:t>{lvar}</w:t>
+      </w:r>
+      <w:r>
+        <w:rPr>
+          <w:lang w:val="es-ES"/>
+        </w:rPr>
+        <w:t xml:space="preserve"> cm, indexada </w:t>
+      </w:r>
+      <w:r>
+        <w:rPr>
+          <w:lang w:val="es-ES"/>
+        </w:rPr>
+        <w:t>{</w:t>
+      </w:r>
+      <w:r>
+        <w:rPr>
+          <w:lang w:val="es-ES"/>
+        </w:rPr>
+        <w:t>ilvar</w:t>
+      </w:r>
+      <w:r>
+        <w:rPr>
+          <w:lang w:val="es-ES"/>
+        </w:rPr>
+        <w:t>}</w:t>
+      </w:r>
+      <w:r>
+        <w:rPr>
+          <w:lang w:val="es-ES"/>
+        </w:rPr>
+        <w:t xml:space="preserve"> cm/m</w:t>
+      </w:r>
+      <w:r>
+        <w:rPr>
+          <w:rFonts w:cstheme="minorHAnsi"/>
+          <w:lang w:val="es-ES"/>
+        </w:rPr>
+        <w:t>²,</w:t>
+      </w:r>
+      <w:r>
+        <w:rPr>
+          <w:lang w:val="es-ES"/>
+        </w:rPr>
+        <w:t xml:space="preserve"> diámetro unión sinotubular </w:t>
+      </w:r>
+      <w:r>
+        <w:rPr>
+          <w:lang w:val="es-ES"/>
+        </w:rPr>
+        <w:t>{lvstj}</w:t>
+      </w:r>
+      <w:r>
+        <w:rPr>
+          <w:lang w:val="es-ES"/>
+        </w:rPr>
+        <w:t xml:space="preserve"> cm, diámetro aorta proximal ascendente </w:t>
+      </w:r>
+      <w:r>
+        <w:rPr>
+          <w:lang w:val="es-ES"/>
+        </w:rPr>
+        <w:t>{lvaad}</w:t>
+      </w:r>
+      <w:r>
+        <w:rPr>
+          <w:lang w:val="es-ES"/>
+        </w:rPr>
+        <w:t xml:space="preserve"> cm</w:t>
+      </w:r>
+      <w:r>
+        <w:rPr>
+          <w:lang w:val="es-ES"/>
+        </w:rPr>
+        <w:t>, indexada {</w:t>
+      </w:r>
+      <w:r>
+        <w:rPr>
+          <w:lang w:val="es-ES"/>
+        </w:rPr>
+        <w:t>ilvaad</w:t>
+      </w:r>
+      <w:r>
+        <w:rPr>
+          <w:lang w:val="es-ES"/>
+        </w:rPr>
+        <w:t>} cm/</w:t>
+      </w:r>
+      <w:r>
+        <w:rPr>
+          <w:lang w:val="es-ES"/>
+        </w:rPr>
+        <w:t>m</w:t>
+      </w:r>
+      <w:r>
+        <w:rPr>
+          <w:rFonts w:cstheme="minorHAnsi"/>
+          <w:lang w:val="es-ES"/>
+        </w:rPr>
+        <w:t>²</w:t>
+      </w:r>
+      <w:r>
+        <w:rPr>
+          <w:rFonts w:cstheme="minorHAnsi"/>
+          <w:lang w:val="es-ES"/>
+        </w:rPr>
+        <w:t>.</w:t>
+      </w:r>
+      <w:r>
+        <w:rPr>
+          <w:rFonts w:cstheme="minorHAnsi"/>
+          <w:lang w:val="es-ES"/>
+        </w:rPr>
+        <w:t>{obLeftVentricle}</w:t>
+      </w:r>
     </w:p>
     <w:p>
       <w:pPr>
         <w:pStyle w:val="NoSpacing"/>
+        <w:rPr>
+          <w:lang w:val="es-ES"/>
+        </w:rPr>
+      </w:pPr>
+    </w:p>
+    <w:p>
+      <w:pPr>
+        <w:pStyle w:val="NoSpacing"/>
         <w:jc w:val="both"/>
         <w:rPr>
           <w:lang w:val="es-ES"/>
@@ -1001,7 +1346,13 @@
           <w:bCs/>
           <w:lang w:val="es-ES"/>
         </w:rPr>
-        <w:t xml:space="preserve">Ventrículo izquierdo: </w:t>
+        <w:t>Ventrículo derecho:</w:t>
+      </w:r>
+      <w:r>
+        <w:rPr>
+          <w:lang w:val="es-ES"/>
+        </w:rPr>
+        <w:t xml:space="preserve"> </w:t>
       </w:r>
       <w:r>
         <w:rPr>
@@ -1013,903 +1364,191 @@
         <w:rPr>
           <w:lang w:val="es-ES"/>
         </w:rPr>
-        <w:t xml:space="preserve">, diámetro </w:t>
-      </w:r>
-      <w:proofErr w:type="spellStart"/>
-      <w:r>
-        <w:rPr>
-          <w:lang w:val="es-ES"/>
-        </w:rPr>
-        <w:t>telediastólico</w:t>
-      </w:r>
-      <w:proofErr w:type="spellEnd"/>
-      <w:r>
-        <w:rPr>
-          <w:lang w:val="es-ES"/>
-        </w:rPr>
-        <w:t xml:space="preserve"> indexado </w:t>
-      </w:r>
-      <w:r>
-        <w:rPr>
-          <w:lang w:val="es-ES"/>
-        </w:rPr>
-        <w:t>{</w:t>
-      </w:r>
-      <w:proofErr w:type="spellStart"/>
-      <w:r>
-        <w:rPr>
-          <w:lang w:val="es-ES"/>
-        </w:rPr>
-        <w:t>ilvedd</w:t>
-      </w:r>
-      <w:proofErr w:type="spellEnd"/>
-      <w:r>
-        <w:rPr>
-          <w:lang w:val="es-ES"/>
-        </w:rPr>
-        <w:t>}</w:t>
-      </w:r>
-      <w:r>
-        <w:rPr>
-          <w:lang w:val="es-ES"/>
-        </w:rPr>
-        <w:t xml:space="preserve"> cm/m</w:t>
+        <w:t xml:space="preserve">, diámetro basal </w:t>
+      </w:r>
+      <w:r>
+        <w:rPr>
+          <w:lang w:val="es-ES"/>
+        </w:rPr>
+        <w:t>{rvbd}</w:t>
+      </w:r>
+      <w:r>
+        <w:rPr>
+          <w:lang w:val="es-ES"/>
+        </w:rPr>
+        <w:t xml:space="preserve"> cm, diámetro medio </w:t>
+      </w:r>
+      <w:r>
+        <w:t>{rvmd}</w:t>
+      </w:r>
+      <w:r>
+        <w:rPr>
+          <w:lang w:val="es-ES"/>
+        </w:rPr>
+        <w:t xml:space="preserve"> cm, diámetro longitudinal </w:t>
+      </w:r>
+      <w:r>
+        <w:t>{rvld}</w:t>
+      </w:r>
+      <w:r>
+        <w:rPr>
+          <w:lang w:val="es-ES"/>
+        </w:rPr>
+        <w:t xml:space="preserve"> cm, función sistólica </w:t>
+      </w:r>
+      <w:r>
+        <w:rPr>
+          <w:lang w:val="es-ES"/>
+        </w:rPr>
+        <w:t>conservada</w:t>
+      </w:r>
+      <w:r>
+        <w:rPr>
+          <w:lang w:val="es-ES"/>
+        </w:rPr>
+        <w:t xml:space="preserve">, </w:t>
+      </w:r>
+      <w:r>
+        <w:rPr>
+          <w:lang w:val="es-ES"/>
+        </w:rPr>
+        <w:t xml:space="preserve">onda </w:t>
+      </w:r>
+      <w:r>
+        <w:rPr>
+          <w:lang w:val="es-ES"/>
+        </w:rPr>
+        <w:t xml:space="preserve">S tricuspidea </w:t>
+      </w:r>
+      <w:r>
+        <w:t>{sWave}</w:t>
+      </w:r>
+      <w:r>
+        <w:rPr>
+          <w:lang w:val="es-ES"/>
+        </w:rPr>
+        <w:t xml:space="preserve"> cm/s, TAPSE </w:t>
+      </w:r>
+      <w:r>
+        <w:t xml:space="preserve">{rvtapse} </w:t>
+      </w:r>
+      <w:r>
+        <w:rPr>
+          <w:lang w:val="es-ES"/>
+        </w:rPr>
+        <w:t>mm</w:t>
+      </w:r>
+      <w:r>
+        <w:rPr>
+          <w:lang w:val="es-ES"/>
+        </w:rPr>
+        <w:t>. Área telediastólica VD</w:t>
+      </w:r>
+      <w:r>
+        <w:rPr>
+          <w:lang w:val="es-ES"/>
+        </w:rPr>
+        <w:t xml:space="preserve"> </w:t>
+      </w:r>
+      <w:r>
+        <w:t>{rveda}</w:t>
+      </w:r>
+      <w:r>
+        <w:rPr>
+          <w:lang w:val="es-ES"/>
+        </w:rPr>
+        <w:t xml:space="preserve"> cm</w:t>
       </w:r>
       <w:r>
         <w:rPr>
           <w:rFonts w:cstheme="minorHAnsi"/>
           <w:lang w:val="es-ES"/>
         </w:rPr>
-        <w:t>²</w:t>
-      </w:r>
-      <w:r>
-        <w:rPr>
-          <w:lang w:val="es-ES"/>
-        </w:rPr>
-        <w:t xml:space="preserve">, volumen </w:t>
-      </w:r>
-      <w:proofErr w:type="spellStart"/>
-      <w:r>
-        <w:rPr>
-          <w:lang w:val="es-ES"/>
-        </w:rPr>
-        <w:t>telediastólico</w:t>
-      </w:r>
-      <w:proofErr w:type="spellEnd"/>
-      <w:r>
-        <w:rPr>
-          <w:lang w:val="es-ES"/>
-        </w:rPr>
-        <w:t xml:space="preserve"> indexado </w:t>
-      </w:r>
-      <w:r>
-        <w:rPr>
-          <w:lang w:val="es-ES"/>
-        </w:rPr>
-        <w:t>{</w:t>
-      </w:r>
-      <w:proofErr w:type="spellStart"/>
-      <w:r>
-        <w:rPr>
-          <w:lang w:val="es-ES"/>
-        </w:rPr>
-        <w:t>ilvedv</w:t>
-      </w:r>
-      <w:proofErr w:type="spellEnd"/>
-      <w:r>
-        <w:rPr>
-          <w:lang w:val="es-ES"/>
-        </w:rPr>
-        <w:t>}</w:t>
-      </w:r>
-      <w:r>
-        <w:rPr>
-          <w:lang w:val="es-ES"/>
-        </w:rPr>
-        <w:t xml:space="preserve"> ml/m</w:t>
+        <w:t>²,</w:t>
+      </w:r>
+      <w:r>
+        <w:rPr>
+          <w:lang w:val="es-ES"/>
+        </w:rPr>
+        <w:t xml:space="preserve"> área telesistólica VD </w:t>
+      </w:r>
+      <w:r>
+        <w:t>{rvesa}</w:t>
+      </w:r>
+      <w:r>
+        <w:rPr>
+          <w:lang w:val="es-ES"/>
+        </w:rPr>
+        <w:t xml:space="preserve"> cm</w:t>
       </w:r>
       <w:r>
         <w:rPr>
           <w:rFonts w:cstheme="minorHAnsi"/>
           <w:lang w:val="es-ES"/>
         </w:rPr>
-        <w:t>²</w:t>
-      </w:r>
-      <w:r>
-        <w:rPr>
-          <w:lang w:val="es-ES"/>
-        </w:rPr>
-        <w:t xml:space="preserve">, masa indexada </w:t>
-      </w:r>
-      <w:r>
-        <w:rPr>
-          <w:lang w:val="es-ES"/>
-        </w:rPr>
-        <w:t>{</w:t>
-      </w:r>
-      <w:proofErr w:type="spellStart"/>
-      <w:r>
-        <w:rPr>
-          <w:lang w:val="es-ES"/>
-        </w:rPr>
-        <w:t>ilvmass</w:t>
-      </w:r>
-      <w:proofErr w:type="spellEnd"/>
-      <w:r>
-        <w:rPr>
-          <w:lang w:val="es-ES"/>
-        </w:rPr>
-        <w:t>}</w:t>
-      </w:r>
-      <w:r>
-        <w:rPr>
-          <w:lang w:val="es-ES"/>
-        </w:rPr>
-        <w:t xml:space="preserve"> gr/m</w:t>
+        <w:t xml:space="preserve">²  </w:t>
+      </w:r>
+      <w:r>
+        <w:rPr>
+          <w:lang w:val="es-ES"/>
+        </w:rPr>
+        <w:t xml:space="preserve"> </w:t>
+      </w:r>
+      <w:r>
+        <w:rPr>
+          <w:lang w:val="es-ES"/>
+        </w:rPr>
+        <w:t xml:space="preserve">cambio fraccional de área, FAC </w:t>
+      </w:r>
+      <w:r>
+        <w:t>{rvfac}</w:t>
+      </w:r>
+      <w:r>
+        <w:rPr>
+          <w:lang w:val="es-ES"/>
+        </w:rPr>
+        <w:t xml:space="preserve"> %. </w:t>
+      </w:r>
+      <w:r>
+        <w:rPr>
+          <w:lang w:val="es-ES"/>
+        </w:rPr>
+        <w:t xml:space="preserve">Diámetro </w:t>
+      </w:r>
+      <w:r>
+        <w:rPr>
+          <w:lang w:val="es-ES"/>
+        </w:rPr>
+        <w:t>de la pared libre</w:t>
+      </w:r>
+      <w:r>
+        <w:rPr>
+          <w:lang w:val="es-ES"/>
+        </w:rPr>
+        <w:t xml:space="preserve"> VD de </w:t>
+      </w:r>
+      <w:r>
+        <w:t>{rvfwt}</w:t>
+      </w:r>
+      <w:r>
+        <w:rPr>
+          <w:lang w:val="es-ES"/>
+        </w:rPr>
+        <w:t xml:space="preserve"> mm.</w:t>
       </w:r>
       <w:r>
         <w:rPr>
           <w:rFonts w:cstheme="minorHAnsi"/>
           <w:lang w:val="es-ES"/>
         </w:rPr>
-        <w:t>²</w:t>
-      </w:r>
-      <w:r>
-        <w:rPr>
-          <w:lang w:val="es-ES"/>
-        </w:rPr>
-        <w:t xml:space="preserve">, </w:t>
-      </w:r>
-      <w:proofErr w:type="spellStart"/>
-      <w:r>
-        <w:rPr>
-          <w:lang w:val="es-ES"/>
-        </w:rPr>
-        <w:t>SIVd</w:t>
-      </w:r>
-      <w:proofErr w:type="spellEnd"/>
-      <w:r>
-        <w:rPr>
-          <w:lang w:val="es-ES"/>
-        </w:rPr>
-        <w:t xml:space="preserve">: </w:t>
-      </w:r>
-      <w:r>
-        <w:rPr>
-          <w:lang w:val="es-ES"/>
-        </w:rPr>
-        <w:t>{</w:t>
-      </w:r>
-      <w:proofErr w:type="spellStart"/>
-      <w:r>
-        <w:rPr>
-          <w:lang w:val="es-ES"/>
-        </w:rPr>
-        <w:t>ivsd</w:t>
-      </w:r>
-      <w:proofErr w:type="spellEnd"/>
-      <w:r>
-        <w:rPr>
-          <w:lang w:val="es-ES"/>
-        </w:rPr>
-        <w:t>}</w:t>
-      </w:r>
-      <w:r>
-        <w:rPr>
-          <w:lang w:val="es-ES"/>
-        </w:rPr>
-        <w:t xml:space="preserve"> cm, </w:t>
-      </w:r>
-      <w:proofErr w:type="spellStart"/>
-      <w:r>
-        <w:rPr>
-          <w:lang w:val="es-ES"/>
-        </w:rPr>
-        <w:t>DIVId</w:t>
-      </w:r>
-      <w:proofErr w:type="spellEnd"/>
-      <w:r>
-        <w:rPr>
-          <w:lang w:val="es-ES"/>
-        </w:rPr>
-        <w:t xml:space="preserve">: </w:t>
-      </w:r>
-      <w:r>
-        <w:rPr>
-          <w:lang w:val="es-ES"/>
-        </w:rPr>
-        <w:t>{</w:t>
-      </w:r>
-      <w:proofErr w:type="spellStart"/>
-      <w:r>
-        <w:rPr>
-          <w:lang w:val="es-ES"/>
-        </w:rPr>
-        <w:t>lvided</w:t>
-      </w:r>
-      <w:proofErr w:type="spellEnd"/>
-      <w:r>
-        <w:rPr>
-          <w:lang w:val="es-ES"/>
-        </w:rPr>
-        <w:t>}</w:t>
-      </w:r>
-      <w:r>
-        <w:rPr>
-          <w:lang w:val="es-ES"/>
-        </w:rPr>
-        <w:t xml:space="preserve"> cm, </w:t>
-      </w:r>
-      <w:proofErr w:type="spellStart"/>
-      <w:r>
-        <w:rPr>
-          <w:lang w:val="es-ES"/>
-        </w:rPr>
-        <w:t>PPVId</w:t>
-      </w:r>
-      <w:proofErr w:type="spellEnd"/>
-      <w:r>
-        <w:rPr>
-          <w:lang w:val="es-ES"/>
-        </w:rPr>
-        <w:t xml:space="preserve">: </w:t>
-      </w:r>
-      <w:r>
-        <w:rPr>
-          <w:lang w:val="es-ES"/>
-        </w:rPr>
-        <w:t>{</w:t>
-      </w:r>
-      <w:proofErr w:type="spellStart"/>
-      <w:r>
-        <w:rPr>
-          <w:lang w:val="es-ES"/>
-        </w:rPr>
-        <w:t>lvpwd</w:t>
-      </w:r>
-      <w:proofErr w:type="spellEnd"/>
-      <w:r>
-        <w:rPr>
-          <w:lang w:val="es-ES"/>
-        </w:rPr>
-        <w:t>}</w:t>
-      </w:r>
-      <w:r>
-        <w:rPr>
-          <w:lang w:val="es-ES"/>
-        </w:rPr>
-        <w:t xml:space="preserve"> cm, grosor parietal relativo </w:t>
-      </w:r>
-      <w:r>
-        <w:rPr>
-          <w:lang w:val="es-ES"/>
-        </w:rPr>
-        <w:t>{</w:t>
-      </w:r>
-      <w:proofErr w:type="spellStart"/>
-      <w:r>
-        <w:rPr>
-          <w:lang w:val="es-ES"/>
-        </w:rPr>
-        <w:t>lvrwt</w:t>
-      </w:r>
-      <w:proofErr w:type="spellEnd"/>
-      <w:r>
-        <w:rPr>
-          <w:lang w:val="es-ES"/>
-        </w:rPr>
-        <w:t>}</w:t>
-      </w:r>
-      <w:r>
-        <w:rPr>
-          <w:lang w:val="es-ES"/>
-        </w:rPr>
-        <w:t xml:space="preserve">, no se observan trastornos de la contractilidad global o segmentaria. Volumen </w:t>
-      </w:r>
-      <w:proofErr w:type="spellStart"/>
-      <w:r>
-        <w:rPr>
-          <w:lang w:val="es-ES"/>
-        </w:rPr>
-        <w:t>telediastólico</w:t>
-      </w:r>
-      <w:proofErr w:type="spellEnd"/>
-      <w:r>
-        <w:rPr>
-          <w:lang w:val="es-ES"/>
-        </w:rPr>
-        <w:t xml:space="preserve"> </w:t>
-      </w:r>
-      <w:r>
-        <w:rPr>
-          <w:lang w:val="es-ES"/>
-        </w:rPr>
-        <w:t>{</w:t>
-      </w:r>
-      <w:proofErr w:type="spellStart"/>
-      <w:r>
-        <w:rPr>
-          <w:lang w:val="es-ES"/>
-        </w:rPr>
-        <w:t>lvedv</w:t>
-      </w:r>
-      <w:proofErr w:type="spellEnd"/>
-      <w:r>
-        <w:rPr>
-          <w:lang w:val="es-ES"/>
-        </w:rPr>
-        <w:t>}</w:t>
-      </w:r>
-      <w:r>
-        <w:rPr>
-          <w:lang w:val="es-ES"/>
-        </w:rPr>
-        <w:t xml:space="preserve"> ml, volumen </w:t>
-      </w:r>
-      <w:proofErr w:type="spellStart"/>
-      <w:r>
-        <w:rPr>
-          <w:lang w:val="es-ES"/>
-        </w:rPr>
-        <w:t>telesistólico</w:t>
-      </w:r>
-      <w:proofErr w:type="spellEnd"/>
-      <w:r>
-        <w:rPr>
-          <w:lang w:val="es-ES"/>
-        </w:rPr>
-        <w:t xml:space="preserve"> </w:t>
-      </w:r>
-      <w:r>
-        <w:rPr>
-          <w:lang w:val="es-ES"/>
-        </w:rPr>
-        <w:t>{</w:t>
-      </w:r>
-      <w:proofErr w:type="spellStart"/>
-      <w:r>
-        <w:rPr>
-          <w:lang w:val="es-ES"/>
-        </w:rPr>
-        <w:t>lvesv</w:t>
-      </w:r>
-      <w:proofErr w:type="spellEnd"/>
-      <w:r>
-        <w:rPr>
-          <w:lang w:val="es-ES"/>
-        </w:rPr>
-        <w:t>}</w:t>
-      </w:r>
-      <w:r>
-        <w:rPr>
-          <w:lang w:val="es-ES"/>
-        </w:rPr>
-        <w:t xml:space="preserve"> ml, FEVI: </w:t>
-      </w:r>
-      <w:r>
-        <w:rPr>
-          <w:lang w:val="es-ES"/>
-        </w:rPr>
-        <w:t>{</w:t>
-      </w:r>
-      <w:proofErr w:type="spellStart"/>
-      <w:r>
-        <w:rPr>
-          <w:lang w:val="es-ES"/>
-        </w:rPr>
-        <w:t>lvef</w:t>
-      </w:r>
-      <w:proofErr w:type="spellEnd"/>
-      <w:r>
-        <w:rPr>
-          <w:lang w:val="es-ES"/>
-        </w:rPr>
-        <w:t>}</w:t>
-      </w:r>
-      <w:r>
-        <w:rPr>
-          <w:lang w:val="es-ES"/>
-        </w:rPr>
-        <w:t xml:space="preserve"> </w:t>
-      </w:r>
-      <w:r>
-        <w:rPr>
-          <w:lang w:val="es-ES"/>
-        </w:rPr>
-        <w:t xml:space="preserve">% por método biplano. Flujograma </w:t>
-      </w:r>
-      <w:proofErr w:type="spellStart"/>
-      <w:r>
-        <w:rPr>
-          <w:lang w:val="es-ES"/>
-        </w:rPr>
-        <w:t>transmitral</w:t>
-      </w:r>
-      <w:proofErr w:type="spellEnd"/>
-      <w:r>
-        <w:rPr>
-          <w:lang w:val="es-ES"/>
-        </w:rPr>
-        <w:t xml:space="preserve">:  onda E: </w:t>
-      </w:r>
-      <w:r>
-        <w:rPr>
-          <w:lang w:val="es-ES"/>
-        </w:rPr>
-        <w:t>{</w:t>
-      </w:r>
-      <w:proofErr w:type="spellStart"/>
-      <w:r>
-        <w:rPr>
-          <w:lang w:val="es-ES"/>
-        </w:rPr>
-        <w:t>eWave</w:t>
-      </w:r>
-      <w:proofErr w:type="spellEnd"/>
-      <w:r>
-        <w:rPr>
-          <w:lang w:val="es-ES"/>
-        </w:rPr>
-        <w:t>}</w:t>
-      </w:r>
-      <w:r>
-        <w:rPr>
-          <w:lang w:val="es-ES"/>
-        </w:rPr>
-        <w:t xml:space="preserve"> cm/s, onda A: </w:t>
-      </w:r>
-      <w:r>
-        <w:rPr>
-          <w:lang w:val="es-ES"/>
-        </w:rPr>
-        <w:t>{</w:t>
-      </w:r>
-      <w:proofErr w:type="spellStart"/>
-      <w:r>
-        <w:rPr>
-          <w:lang w:val="es-ES"/>
-        </w:rPr>
-        <w:t>aWave</w:t>
-      </w:r>
-      <w:proofErr w:type="spellEnd"/>
-      <w:r>
-        <w:rPr>
-          <w:lang w:val="es-ES"/>
-        </w:rPr>
-        <w:t>}</w:t>
-      </w:r>
-      <w:r>
-        <w:rPr>
-          <w:lang w:val="es-ES"/>
-        </w:rPr>
-        <w:t xml:space="preserve"> cm/s, relación E/A </w:t>
-      </w:r>
-      <w:r>
-        <w:rPr>
-          <w:lang w:val="es-ES"/>
-        </w:rPr>
-        <w:t>{</w:t>
-      </w:r>
-      <w:proofErr w:type="spellStart"/>
-      <w:r>
-        <w:rPr>
-          <w:lang w:val="es-ES"/>
-        </w:rPr>
-        <w:t>eaWaveRel</w:t>
-      </w:r>
-      <w:proofErr w:type="spellEnd"/>
-      <w:r>
-        <w:rPr>
-          <w:lang w:val="es-ES"/>
-        </w:rPr>
-        <w:t>}</w:t>
-      </w:r>
-      <w:r>
-        <w:rPr>
-          <w:lang w:val="es-ES"/>
-        </w:rPr>
-        <w:t xml:space="preserve">, pendiente de desaceleración </w:t>
-      </w:r>
-      <w:r>
-        <w:rPr>
-          <w:lang w:val="es-ES"/>
-        </w:rPr>
-        <w:t>{</w:t>
-      </w:r>
-      <w:proofErr w:type="spellStart"/>
-      <w:r>
-        <w:rPr>
-          <w:lang w:val="es-ES"/>
-        </w:rPr>
-        <w:t>lvfdt</w:t>
-      </w:r>
-      <w:proofErr w:type="spellEnd"/>
-      <w:r>
-        <w:rPr>
-          <w:lang w:val="es-ES"/>
-        </w:rPr>
-        <w:t>}</w:t>
-      </w:r>
-      <w:r>
-        <w:rPr>
-          <w:lang w:val="es-ES"/>
-        </w:rPr>
-        <w:t xml:space="preserve"> </w:t>
-      </w:r>
-      <w:proofErr w:type="spellStart"/>
-      <w:r>
-        <w:rPr>
-          <w:lang w:val="es-ES"/>
-        </w:rPr>
-        <w:t>mseg</w:t>
-      </w:r>
-      <w:proofErr w:type="spellEnd"/>
-      <w:r>
-        <w:rPr>
-          <w:lang w:val="es-ES"/>
-        </w:rPr>
-        <w:t xml:space="preserve">, TRIV </w:t>
-      </w:r>
-      <w:r>
-        <w:rPr>
-          <w:lang w:val="es-ES"/>
-        </w:rPr>
-        <w:t>{</w:t>
-      </w:r>
-      <w:proofErr w:type="spellStart"/>
-      <w:r>
-        <w:rPr>
-          <w:lang w:val="es-ES"/>
-        </w:rPr>
-        <w:t>lfivrt</w:t>
-      </w:r>
-      <w:proofErr w:type="spellEnd"/>
-      <w:r>
-        <w:rPr>
-          <w:lang w:val="es-ES"/>
-        </w:rPr>
-        <w:t>}</w:t>
-      </w:r>
-      <w:r>
-        <w:rPr>
-          <w:lang w:val="es-ES"/>
-        </w:rPr>
-        <w:t xml:space="preserve"> </w:t>
-      </w:r>
-      <w:proofErr w:type="spellStart"/>
-      <w:r>
-        <w:rPr>
-          <w:lang w:val="es-ES"/>
-        </w:rPr>
-        <w:t>mseg</w:t>
-      </w:r>
-      <w:proofErr w:type="spellEnd"/>
-      <w:r>
-        <w:rPr>
-          <w:lang w:val="es-ES"/>
-        </w:rPr>
-        <w:t xml:space="preserve">, Doppler tisular del anillo mitral onda </w:t>
-      </w:r>
-      <w:proofErr w:type="gramStart"/>
-      <w:r>
-        <w:rPr>
-          <w:lang w:val="es-ES"/>
-        </w:rPr>
-        <w:t>e</w:t>
-      </w:r>
-      <w:proofErr w:type="gramEnd"/>
-      <w:r>
-        <w:rPr>
-          <w:lang w:val="es-ES"/>
-        </w:rPr>
-        <w:t xml:space="preserve"> septal</w:t>
-      </w:r>
-      <w:r>
-        <w:rPr>
-          <w:lang w:val="es-ES"/>
-        </w:rPr>
-        <w:t xml:space="preserve"> </w:t>
-      </w:r>
-      <w:r>
-        <w:rPr>
-          <w:lang w:val="es-ES"/>
-        </w:rPr>
-        <w:t>{</w:t>
-      </w:r>
-      <w:proofErr w:type="spellStart"/>
-      <w:r>
-        <w:rPr>
-          <w:lang w:val="es-ES"/>
-        </w:rPr>
-        <w:t>ePrimeSeptal</w:t>
-      </w:r>
-      <w:proofErr w:type="spellEnd"/>
-      <w:r>
-        <w:rPr>
-          <w:lang w:val="es-ES"/>
-        </w:rPr>
-        <w:t>}</w:t>
-      </w:r>
-      <w:r>
-        <w:rPr>
-          <w:lang w:val="es-ES"/>
-        </w:rPr>
-        <w:t xml:space="preserve"> cm/s, onda </w:t>
-      </w:r>
-      <w:proofErr w:type="gramStart"/>
-      <w:r>
-        <w:rPr>
-          <w:lang w:val="es-ES"/>
-        </w:rPr>
-        <w:t>e</w:t>
-      </w:r>
-      <w:proofErr w:type="gramEnd"/>
-      <w:r>
-        <w:rPr>
-          <w:lang w:val="es-ES"/>
-        </w:rPr>
-        <w:t xml:space="preserve"> lateral </w:t>
-      </w:r>
-      <w:r>
-        <w:rPr>
-          <w:lang w:val="es-ES"/>
-        </w:rPr>
-        <w:t>{</w:t>
-      </w:r>
-      <w:proofErr w:type="spellStart"/>
-      <w:r>
-        <w:rPr>
-          <w:lang w:val="es-ES"/>
-        </w:rPr>
-        <w:t>ePrimeLateral</w:t>
-      </w:r>
-      <w:proofErr w:type="spellEnd"/>
-      <w:r>
-        <w:rPr>
-          <w:lang w:val="es-ES"/>
-        </w:rPr>
-        <w:t>}</w:t>
-      </w:r>
-      <w:r>
-        <w:rPr>
-          <w:lang w:val="es-ES"/>
-        </w:rPr>
-        <w:t xml:space="preserve"> cm/s, relación E/</w:t>
-      </w:r>
-      <w:r>
-        <w:rPr>
-          <w:lang w:val="es-ES"/>
-        </w:rPr>
-        <w:t>e</w:t>
-      </w:r>
-      <w:r>
-        <w:rPr>
-          <w:lang w:val="es-ES"/>
-        </w:rPr>
-        <w:t xml:space="preserve">’ </w:t>
-      </w:r>
-      <w:r>
-        <w:rPr>
-          <w:lang w:val="es-ES"/>
-        </w:rPr>
-        <w:t>{</w:t>
-      </w:r>
-      <w:proofErr w:type="spellStart"/>
-      <w:r>
-        <w:rPr>
-          <w:lang w:val="es-ES"/>
-        </w:rPr>
-        <w:t>eRatio</w:t>
-      </w:r>
-      <w:proofErr w:type="spellEnd"/>
-      <w:r>
-        <w:rPr>
-          <w:lang w:val="es-ES"/>
-        </w:rPr>
-        <w:t>}</w:t>
-      </w:r>
-      <w:r>
-        <w:rPr>
-          <w:lang w:val="es-ES"/>
-        </w:rPr>
-        <w:t xml:space="preserve">, diámetro de tracto de salida VI: </w:t>
-      </w:r>
-      <w:r>
-        <w:rPr>
-          <w:lang w:val="es-ES"/>
-        </w:rPr>
-        <w:t>{</w:t>
-      </w:r>
-      <w:proofErr w:type="spellStart"/>
-      <w:r>
-        <w:rPr>
-          <w:lang w:val="es-ES"/>
-        </w:rPr>
-        <w:t>lvotd</w:t>
-      </w:r>
-      <w:proofErr w:type="spellEnd"/>
-      <w:r>
-        <w:rPr>
-          <w:lang w:val="es-ES"/>
-        </w:rPr>
-        <w:t xml:space="preserve">} </w:t>
-      </w:r>
-      <w:r>
-        <w:rPr>
-          <w:lang w:val="es-ES"/>
-        </w:rPr>
-        <w:t xml:space="preserve">cm, Raíz aórtica </w:t>
-      </w:r>
-      <w:r>
-        <w:rPr>
-          <w:lang w:val="es-ES"/>
-        </w:rPr>
-        <w:t>{</w:t>
-      </w:r>
-      <w:proofErr w:type="spellStart"/>
-      <w:r>
-        <w:rPr>
-          <w:lang w:val="es-ES"/>
-        </w:rPr>
-        <w:t>lvar</w:t>
-      </w:r>
-      <w:proofErr w:type="spellEnd"/>
-      <w:r>
-        <w:rPr>
-          <w:lang w:val="es-ES"/>
-        </w:rPr>
-        <w:t>}</w:t>
-      </w:r>
-      <w:r>
-        <w:rPr>
-          <w:lang w:val="es-ES"/>
-        </w:rPr>
-        <w:t xml:space="preserve"> cm, indexada </w:t>
-      </w:r>
-      <w:r>
-        <w:rPr>
-          <w:lang w:val="es-ES"/>
-        </w:rPr>
-        <w:t>{</w:t>
-      </w:r>
-      <w:proofErr w:type="spellStart"/>
-      <w:r>
-        <w:rPr>
-          <w:lang w:val="es-ES"/>
-        </w:rPr>
-        <w:t>ilvar</w:t>
-      </w:r>
-      <w:proofErr w:type="spellEnd"/>
-      <w:r>
-        <w:rPr>
-          <w:lang w:val="es-ES"/>
-        </w:rPr>
-        <w:t>}</w:t>
-      </w:r>
-      <w:r>
-        <w:rPr>
-          <w:lang w:val="es-ES"/>
-        </w:rPr>
-        <w:t xml:space="preserve"> cm/m</w:t>
+        <w:t>{ob</w:t>
       </w:r>
       <w:r>
         <w:rPr>
           <w:rFonts w:cstheme="minorHAnsi"/>
           <w:lang w:val="es-ES"/>
         </w:rPr>
-        <w:t>²,</w:t>
-      </w:r>
-      <w:r>
-        <w:rPr>
-          <w:lang w:val="es-ES"/>
-        </w:rPr>
-        <w:t xml:space="preserve"> diámetro unión </w:t>
-      </w:r>
-      <w:proofErr w:type="spellStart"/>
-      <w:r>
-        <w:rPr>
-          <w:lang w:val="es-ES"/>
-        </w:rPr>
-        <w:t>sinotubular</w:t>
-      </w:r>
-      <w:proofErr w:type="spellEnd"/>
-      <w:r>
-        <w:rPr>
-          <w:lang w:val="es-ES"/>
-        </w:rPr>
-        <w:t xml:space="preserve"> </w:t>
-      </w:r>
-      <w:r>
-        <w:rPr>
-          <w:lang w:val="es-ES"/>
-        </w:rPr>
-        <w:t>{</w:t>
-      </w:r>
-      <w:proofErr w:type="spellStart"/>
-      <w:r>
-        <w:rPr>
-          <w:lang w:val="es-ES"/>
-        </w:rPr>
-        <w:t>lvstj</w:t>
-      </w:r>
-      <w:proofErr w:type="spellEnd"/>
-      <w:r>
-        <w:rPr>
-          <w:lang w:val="es-ES"/>
-        </w:rPr>
-        <w:t>}</w:t>
-      </w:r>
-      <w:r>
-        <w:rPr>
-          <w:lang w:val="es-ES"/>
-        </w:rPr>
-        <w:t xml:space="preserve"> cm, diámetro aorta proximal ascendente </w:t>
-      </w:r>
-      <w:r>
-        <w:rPr>
-          <w:lang w:val="es-ES"/>
-        </w:rPr>
-        <w:t>{</w:t>
-      </w:r>
-      <w:proofErr w:type="spellStart"/>
-      <w:r>
-        <w:rPr>
-          <w:lang w:val="es-ES"/>
-        </w:rPr>
-        <w:t>lvaad</w:t>
-      </w:r>
-      <w:proofErr w:type="spellEnd"/>
-      <w:r>
-        <w:rPr>
-          <w:lang w:val="es-ES"/>
-        </w:rPr>
-        <w:t>}</w:t>
-      </w:r>
-      <w:r>
-        <w:rPr>
-          <w:lang w:val="es-ES"/>
-        </w:rPr>
-        <w:t xml:space="preserve"> cm</w:t>
-      </w:r>
-      <w:r>
-        <w:rPr>
-          <w:lang w:val="es-ES"/>
-        </w:rPr>
-        <w:t>, indexada {</w:t>
-      </w:r>
-      <w:proofErr w:type="spellStart"/>
-      <w:r>
-        <w:rPr>
-          <w:lang w:val="es-ES"/>
-        </w:rPr>
-        <w:t>ilvaad</w:t>
-      </w:r>
-      <w:proofErr w:type="spellEnd"/>
-      <w:r>
-        <w:rPr>
-          <w:lang w:val="es-ES"/>
-        </w:rPr>
-        <w:t>} cm/</w:t>
-      </w:r>
-      <w:r>
-        <w:rPr>
-          <w:lang w:val="es-ES"/>
-        </w:rPr>
-        <w:t>m</w:t>
-      </w:r>
-      <w:r>
-        <w:rPr>
-          <w:rFonts w:cstheme="minorHAnsi"/>
-          <w:lang w:val="es-ES"/>
-        </w:rPr>
-        <w:t>²</w:t>
-      </w:r>
-      <w:r>
-        <w:rPr>
-          <w:rFonts w:cstheme="minorHAnsi"/>
-          <w:lang w:val="es-ES"/>
-        </w:rPr>
-        <w:t>.</w:t>
+        <w:t>RightVentricle}</w:t>
       </w:r>
     </w:p>
     <w:p>
@@ -1934,7 +1573,7 @@
           <w:bCs/>
           <w:lang w:val="es-ES"/>
         </w:rPr>
-        <w:t>Ventrículo derecho:</w:t>
+        <w:t>Aurícula izquierda:</w:t>
       </w:r>
       <w:r>
         <w:rPr>
@@ -1946,13 +1585,31 @@
         <w:rPr>
           <w:lang w:val="es-ES"/>
         </w:rPr>
-        <w:t>de dimensiones y geometría normal</w:t>
-      </w:r>
-      <w:r>
-        <w:rPr>
-          <w:lang w:val="es-ES"/>
-        </w:rPr>
-        <w:t xml:space="preserve">, diámetro basal </w:t>
+        <w:t>de dimensiones normales</w:t>
+      </w:r>
+      <w:r>
+        <w:rPr>
+          <w:lang w:val="es-ES"/>
+        </w:rPr>
+        <w:t xml:space="preserve">, diámetro anteroposterior </w:t>
+      </w:r>
+      <w:r>
+        <w:rPr>
+          <w:lang w:val="es-ES"/>
+        </w:rPr>
+        <w:t>{laapd}</w:t>
+      </w:r>
+      <w:r>
+        <w:rPr>
+          <w:lang w:val="es-ES"/>
+        </w:rPr>
+        <w:t xml:space="preserve"> cm, volumen </w:t>
+      </w:r>
+      <w:r>
+        <w:rPr>
+          <w:lang w:val="es-ES"/>
+        </w:rPr>
+        <w:t xml:space="preserve">indexado </w:t>
       </w:r>
       <w:r>
         <w:rPr>
@@ -1960,14 +1617,12 @@
         </w:rPr>
         <w:t>{</w:t>
       </w:r>
-      <w:proofErr w:type="spellStart"/>
-      <w:r>
-        <w:rPr>
-          <w:lang w:val="es-ES"/>
-        </w:rPr>
-        <w:t>rvbd</w:t>
-      </w:r>
-      <w:proofErr w:type="spellEnd"/>
+      <w:r>
+        <w:rPr>
+          <w:lang w:val="es-ES"/>
+        </w:rPr>
+        <w:t>ilav</w:t>
+      </w:r>
       <w:r>
         <w:rPr>
           <w:lang w:val="es-ES"/>
@@ -1978,224 +1633,41 @@
         <w:rPr>
           <w:lang w:val="es-ES"/>
         </w:rPr>
-        <w:t xml:space="preserve"> cm, diámetro medio </w:t>
-      </w:r>
-      <w:r>
-        <w:t>{rvmd}</w:t>
-      </w:r>
-      <w:r>
-        <w:rPr>
-          <w:lang w:val="es-ES"/>
-        </w:rPr>
-        <w:t xml:space="preserve"> cm, diámetro longitudinal </w:t>
-      </w:r>
-      <w:r>
-        <w:t>{rvld}</w:t>
-      </w:r>
-      <w:r>
-        <w:rPr>
-          <w:lang w:val="es-ES"/>
-        </w:rPr>
-        <w:t xml:space="preserve"> cm, función sistólica </w:t>
-      </w:r>
-      <w:r>
-        <w:rPr>
-          <w:lang w:val="es-ES"/>
-        </w:rPr>
-        <w:t>conservada</w:t>
-      </w:r>
-      <w:r>
-        <w:rPr>
-          <w:lang w:val="es-ES"/>
-        </w:rPr>
-        <w:t xml:space="preserve">, </w:t>
-      </w:r>
-      <w:r>
-        <w:rPr>
-          <w:lang w:val="es-ES"/>
-        </w:rPr>
-        <w:t xml:space="preserve">onda </w:t>
-      </w:r>
-      <w:r>
-        <w:rPr>
-          <w:lang w:val="es-ES"/>
-        </w:rPr>
-        <w:t xml:space="preserve">S </w:t>
-      </w:r>
-      <w:proofErr w:type="spellStart"/>
-      <w:r>
-        <w:rPr>
-          <w:lang w:val="es-ES"/>
-        </w:rPr>
-        <w:t>tricuspidea</w:t>
-      </w:r>
-      <w:proofErr w:type="spellEnd"/>
-      <w:r>
-        <w:rPr>
-          <w:lang w:val="es-ES"/>
-        </w:rPr>
         <w:t xml:space="preserve"> </w:t>
       </w:r>
       <w:r>
-        <w:t>{sWave}</w:t>
-      </w:r>
-      <w:r>
-        <w:rPr>
-          <w:lang w:val="es-ES"/>
-        </w:rPr>
-        <w:t xml:space="preserve"> cm/s, TAPSE </w:t>
-      </w:r>
-      <w:r>
-        <w:t xml:space="preserve">{rvtapse} </w:t>
-      </w:r>
-      <w:proofErr w:type="spellStart"/>
-      <w:r>
-        <w:rPr>
-          <w:lang w:val="es-ES"/>
-        </w:rPr>
-        <w:t>mm</w:t>
-      </w:r>
-      <w:r>
-        <w:rPr>
-          <w:lang w:val="es-ES"/>
-        </w:rPr>
-        <w:t>.</w:t>
-      </w:r>
-      <w:proofErr w:type="spellEnd"/>
-      <w:r>
-        <w:rPr>
-          <w:lang w:val="es-ES"/>
-        </w:rPr>
-        <w:t xml:space="preserve"> Área </w:t>
-      </w:r>
-      <w:proofErr w:type="spellStart"/>
-      <w:r>
-        <w:rPr>
-          <w:lang w:val="es-ES"/>
-        </w:rPr>
-        <w:t>telediastólica</w:t>
-      </w:r>
-      <w:proofErr w:type="spellEnd"/>
-      <w:r>
-        <w:rPr>
-          <w:lang w:val="es-ES"/>
-        </w:rPr>
-        <w:t xml:space="preserve"> VD</w:t>
-      </w:r>
-      <w:r>
-        <w:rPr>
-          <w:lang w:val="es-ES"/>
-        </w:rPr>
-        <w:t xml:space="preserve"> </w:t>
-      </w:r>
-      <w:r>
-        <w:t>{rveda}</w:t>
-      </w:r>
-      <w:r>
-        <w:rPr>
-          <w:lang w:val="es-ES"/>
-        </w:rPr>
-        <w:t xml:space="preserve"> cm</w:t>
+        <w:rPr>
+          <w:lang w:val="es-ES"/>
+        </w:rPr>
+        <w:t>ml/m</w:t>
       </w:r>
       <w:r>
         <w:rPr>
           <w:rFonts w:cstheme="minorHAnsi"/>
           <w:lang w:val="es-ES"/>
         </w:rPr>
-        <w:t>²,</w:t>
-      </w:r>
-      <w:r>
-        <w:rPr>
-          <w:lang w:val="es-ES"/>
-        </w:rPr>
-        <w:t xml:space="preserve"> área </w:t>
-      </w:r>
-      <w:proofErr w:type="spellStart"/>
-      <w:r>
-        <w:rPr>
-          <w:lang w:val="es-ES"/>
-        </w:rPr>
-        <w:t>telesistólica</w:t>
-      </w:r>
-      <w:proofErr w:type="spellEnd"/>
-      <w:r>
-        <w:rPr>
-          <w:lang w:val="es-ES"/>
-        </w:rPr>
-        <w:t xml:space="preserve"> VD </w:t>
-      </w:r>
-      <w:r>
-        <w:t>{rvesa}</w:t>
-      </w:r>
-      <w:r>
-        <w:rPr>
-          <w:lang w:val="es-ES"/>
-        </w:rPr>
-        <w:t xml:space="preserve"> cm</w:t>
+        <w:t>²</w:t>
+      </w:r>
+      <w:r>
+        <w:rPr>
+          <w:lang w:val="es-ES"/>
+        </w:rPr>
+        <w:t>. No trombos en su interior.</w:t>
       </w:r>
       <w:r>
         <w:rPr>
           <w:rFonts w:cstheme="minorHAnsi"/>
           <w:lang w:val="es-ES"/>
         </w:rPr>
-        <w:t xml:space="preserve">²  </w:t>
-      </w:r>
-      <w:r>
-        <w:rPr>
-          <w:lang w:val="es-ES"/>
-        </w:rPr>
-        <w:t xml:space="preserve"> </w:t>
-      </w:r>
-      <w:r>
-        <w:rPr>
-          <w:lang w:val="es-ES"/>
-        </w:rPr>
-        <w:t xml:space="preserve">cambio fraccional de área, FAC </w:t>
-      </w:r>
-      <w:r>
-        <w:t>{rvfac}</w:t>
-      </w:r>
-      <w:r>
-        <w:rPr>
-          <w:lang w:val="es-ES"/>
-        </w:rPr>
-        <w:t xml:space="preserve"> %. </w:t>
-      </w:r>
-      <w:r>
-        <w:rPr>
-          <w:lang w:val="es-ES"/>
-        </w:rPr>
-        <w:t xml:space="preserve">Diámetro </w:t>
-      </w:r>
-      <w:r>
-        <w:rPr>
-          <w:lang w:val="es-ES"/>
-        </w:rPr>
-        <w:t>de la pared libre</w:t>
-      </w:r>
-      <w:r>
-        <w:rPr>
-          <w:lang w:val="es-ES"/>
-        </w:rPr>
-        <w:t xml:space="preserve"> VD de </w:t>
-      </w:r>
-      <w:r>
-        <w:t>{rvfwt}</w:t>
-      </w:r>
-      <w:r>
-        <w:rPr>
-          <w:lang w:val="es-ES"/>
-        </w:rPr>
-        <w:t xml:space="preserve"> </w:t>
-      </w:r>
-      <w:proofErr w:type="spellStart"/>
-      <w:r>
-        <w:rPr>
-          <w:lang w:val="es-ES"/>
-        </w:rPr>
-        <w:t>mm.</w:t>
-      </w:r>
-      <w:proofErr w:type="spellEnd"/>
+        <w:t>{ob</w:t>
+      </w:r>
+      <w:r>
+        <w:rPr>
+          <w:rFonts w:cstheme="minorHAnsi"/>
+          <w:lang w:val="es-ES"/>
+        </w:rPr>
+        <w:t>LeftAtrium}</w:t>
+      </w:r>
     </w:p>
     <w:p>
       <w:pPr>
@@ -2219,87 +1691,31 @@
           <w:bCs/>
           <w:lang w:val="es-ES"/>
         </w:rPr>
-        <w:t>Aurícula izquierda:</w:t>
-      </w:r>
-      <w:r>
-        <w:rPr>
-          <w:lang w:val="es-ES"/>
-        </w:rPr>
-        <w:t xml:space="preserve"> </w:t>
-      </w:r>
-      <w:r>
-        <w:rPr>
-          <w:lang w:val="es-ES"/>
-        </w:rPr>
-        <w:t>de dimensiones normales</w:t>
-      </w:r>
-      <w:r>
-        <w:rPr>
-          <w:lang w:val="es-ES"/>
-        </w:rPr>
-        <w:t xml:space="preserve">, diámetro anteroposterior </w:t>
-      </w:r>
-      <w:r>
-        <w:rPr>
-          <w:lang w:val="es-ES"/>
-        </w:rPr>
-        <w:t>{</w:t>
-      </w:r>
-      <w:proofErr w:type="spellStart"/>
-      <w:r>
-        <w:rPr>
-          <w:lang w:val="es-ES"/>
-        </w:rPr>
-        <w:t>laapd</w:t>
-      </w:r>
-      <w:proofErr w:type="spellEnd"/>
-      <w:r>
-        <w:rPr>
-          <w:lang w:val="es-ES"/>
-        </w:rPr>
-        <w:t>}</w:t>
-      </w:r>
-      <w:r>
-        <w:rPr>
-          <w:lang w:val="es-ES"/>
-        </w:rPr>
-        <w:t xml:space="preserve"> cm, volumen </w:t>
-      </w:r>
-      <w:r>
-        <w:rPr>
-          <w:lang w:val="es-ES"/>
-        </w:rPr>
-        <w:t xml:space="preserve">indexado </w:t>
-      </w:r>
-      <w:r>
-        <w:rPr>
-          <w:lang w:val="es-ES"/>
-        </w:rPr>
-        <w:t>{</w:t>
-      </w:r>
-      <w:r>
-        <w:rPr>
-          <w:lang w:val="es-ES"/>
-        </w:rPr>
-        <w:t>ilav</w:t>
-      </w:r>
-      <w:r>
-        <w:rPr>
-          <w:lang w:val="es-ES"/>
-        </w:rPr>
-        <w:t>}</w:t>
-      </w:r>
-      <w:r>
-        <w:rPr>
-          <w:lang w:val="es-ES"/>
-        </w:rPr>
-        <w:t xml:space="preserve"> </w:t>
-      </w:r>
-      <w:r>
-        <w:rPr>
-          <w:lang w:val="es-ES"/>
-        </w:rPr>
-        <w:t>ml/m</w:t>
+        <w:t>Aurícula Derecha:</w:t>
+      </w:r>
+      <w:r>
+        <w:rPr>
+          <w:lang w:val="es-ES"/>
+        </w:rPr>
+        <w:t xml:space="preserve"> de dimensiones normales</w:t>
+      </w:r>
+      <w:r>
+        <w:rPr>
+          <w:lang w:val="es-ES"/>
+        </w:rPr>
+        <w:t xml:space="preserve">, área </w:t>
+      </w:r>
+      <w:r>
+        <w:rPr>
+          <w:lang w:val="es-ES"/>
+        </w:rPr>
+        <w:t>{raa}</w:t>
+      </w:r>
+      <w:r>
+        <w:rPr>
+          <w:lang w:val="es-ES"/>
+        </w:rPr>
+        <w:t xml:space="preserve"> cm</w:t>
       </w:r>
       <w:r>
         <w:rPr>
@@ -2312,7 +1728,46 @@
         <w:rPr>
           <w:lang w:val="es-ES"/>
         </w:rPr>
-        <w:t xml:space="preserve">. No trombos en su interior. </w:t>
+        <w:t xml:space="preserve">, volumen indexado </w:t>
+      </w:r>
+      <w:r>
+        <w:rPr>
+          <w:lang w:val="es-ES"/>
+        </w:rPr>
+        <w:t>{irav}</w:t>
+      </w:r>
+      <w:r>
+        <w:rPr>
+          <w:lang w:val="es-ES"/>
+        </w:rPr>
+        <w:t xml:space="preserve"> ml/m</w:t>
+      </w:r>
+      <w:r>
+        <w:rPr>
+          <w:rFonts w:cstheme="minorHAnsi"/>
+          <w:lang w:val="es-ES"/>
+        </w:rPr>
+        <w:t>²</w:t>
+      </w:r>
+      <w:r>
+        <w:rPr>
+          <w:lang w:val="es-ES"/>
+        </w:rPr>
+        <w:t>. No trombos en su interior.</w:t>
+      </w:r>
+      <w:r>
+        <w:rPr>
+          <w:rFonts w:cstheme="minorHAnsi"/>
+          <w:lang w:val="es-ES"/>
+        </w:rPr>
+        <w:t>{ob</w:t>
+      </w:r>
+      <w:r>
+        <w:rPr>
+          <w:rFonts w:cstheme="minorHAnsi"/>
+          <w:lang w:val="es-ES"/>
+        </w:rPr>
+        <w:t>RightAtrium}</w:t>
       </w:r>
     </w:p>
     <w:p>
@@ -2327,114 +1782,109 @@
       <w:pPr>
         <w:pStyle w:val="NoSpacing"/>
         <w:jc w:val="both"/>
-        <w:rPr>
-          <w:lang w:val="es-ES"/>
-        </w:rPr>
       </w:pPr>
       <w:r>
         <w:rPr>
           <w:b/>
           <w:bCs/>
-          <w:lang w:val="es-ES"/>
-        </w:rPr>
-        <w:t>Aurícula Derecha:</w:t>
-      </w:r>
-      <w:r>
-        <w:rPr>
-          <w:lang w:val="es-ES"/>
-        </w:rPr>
-        <w:t xml:space="preserve"> de dimensiones normales</w:t>
-      </w:r>
-      <w:r>
-        <w:rPr>
-          <w:lang w:val="es-ES"/>
-        </w:rPr>
-        <w:t xml:space="preserve">, área </w:t>
-      </w:r>
-      <w:r>
-        <w:rPr>
-          <w:lang w:val="es-ES"/>
-        </w:rPr>
-        <w:t>{</w:t>
-      </w:r>
-      <w:proofErr w:type="spellStart"/>
-      <w:r>
-        <w:rPr>
-          <w:lang w:val="es-ES"/>
-        </w:rPr>
-        <w:t>raa</w:t>
-      </w:r>
-      <w:proofErr w:type="spellEnd"/>
-      <w:r>
-        <w:rPr>
-          <w:lang w:val="es-ES"/>
-        </w:rPr>
-        <w:t>}</w:t>
-      </w:r>
-      <w:r>
-        <w:rPr>
-          <w:lang w:val="es-ES"/>
-        </w:rPr>
+        </w:rPr>
+        <w:t>Válvula mitral:</w:t>
+      </w:r>
+      <w:r>
+        <w:t xml:space="preserve"> </w:t>
+      </w:r>
+      <w:r>
+        <w:t>de morfología normal</w:t>
+      </w:r>
+      <w:r>
+        <w:t xml:space="preserve">, </w:t>
+      </w:r>
+      <w:r>
+        <w:t xml:space="preserve">sin alteraciones del flujo, </w:t>
+      </w:r>
+      <w:r>
+        <w:t xml:space="preserve">no estenosis, IVT VM: </w:t>
+      </w:r>
+      <w:r>
+        <w:t>{mvvti}</w:t>
+      </w:r>
+      <w:r>
+        <w:t xml:space="preserve"> cm, Vmax VM:</w:t>
+      </w:r>
+      <w:r>
+        <w:t xml:space="preserve"> </w:t>
+      </w:r>
+      <w:r>
+        <w:t>{mvvmax}</w:t>
+      </w:r>
+      <w:r>
+        <w:t xml:space="preserve"> cm/s, Grad Med VM </w:t>
+      </w:r>
+      <w:r>
+        <w:t>{mvmg}</w:t>
+      </w:r>
+      <w:r>
+        <w:t xml:space="preserve"> mmHg</w:t>
+      </w:r>
+      <w:r>
+        <w:t>.</w:t>
+      </w:r>
+      <w:r>
+        <w:t xml:space="preserve"> AVM: </w:t>
+      </w:r>
+      <w:r>
+        <w:t>{mva}</w:t>
+      </w:r>
+      <w:r>
         <w:t xml:space="preserve"> cm</w:t>
       </w:r>
       <w:r>
         <w:rPr>
           <w:rFonts w:cstheme="minorHAnsi"/>
-          <w:lang w:val="es-ES"/>
-        </w:rPr>
-        <w:t>²</w:t>
-      </w:r>
-      <w:r>
-        <w:rPr>
-          <w:lang w:val="es-ES"/>
-        </w:rPr>
-        <w:t xml:space="preserve">, volumen indexado </w:t>
-      </w:r>
-      <w:r>
-        <w:rPr>
-          <w:lang w:val="es-ES"/>
-        </w:rPr>
-        <w:t>{irav}</w:t>
-      </w:r>
-      <w:r>
-        <w:rPr>
-          <w:lang w:val="es-ES"/>
-        </w:rPr>
-        <w:t xml:space="preserve"> ml/m</w:t>
+        </w:rPr>
+        <w:t>².</w:t>
       </w:r>
       <w:r>
         <w:rPr>
           <w:rFonts w:cstheme="minorHAnsi"/>
           <w:lang w:val="es-ES"/>
         </w:rPr>
-        <w:t>²</w:t>
-      </w:r>
-      <w:r>
-        <w:rPr>
-          <w:lang w:val="es-ES"/>
-        </w:rPr>
-        <w:t>. No trombos en su interior.</w:t>
+        <w:t>{ob</w:t>
+      </w:r>
+      <w:r>
+        <w:rPr>
+          <w:rFonts w:cstheme="minorHAnsi"/>
+          <w:lang w:val="es-ES"/>
+        </w:rPr>
+        <w:t>MitralValve}</w:t>
       </w:r>
     </w:p>
     <w:p>
       <w:pPr>
         <w:pStyle w:val="NoSpacing"/>
-        <w:rPr>
-          <w:lang w:val="es-ES"/>
-        </w:rPr>
       </w:pPr>
     </w:p>
     <w:p>
       <w:pPr>
         <w:pStyle w:val="NoSpacing"/>
         <w:jc w:val="both"/>
+        <w:rPr>
+          <w:lang w:val="es-ES"/>
+        </w:rPr>
       </w:pPr>
       <w:r>
         <w:rPr>
           <w:b/>
           <w:bCs/>
         </w:rPr>
-        <w:t>Válvula mitral:</w:t>
+        <w:t>Válvula aórtica</w:t>
+      </w:r>
+      <w:r>
+        <w:rPr>
+          <w:b/>
+          <w:bCs/>
+        </w:rPr>
+        <w:t xml:space="preserve">: </w:t>
       </w:r>
       <w:r>
         <w:t xml:space="preserve"> </w:t>
@@ -2446,54 +1896,110 @@
         <w:t xml:space="preserve">, </w:t>
       </w:r>
       <w:r>
-        <w:t xml:space="preserve">sin alteraciones del flujo, </w:t>
-      </w:r>
-      <w:r>
-        <w:t xml:space="preserve">no estenosis, IVT VM: </w:t>
-      </w:r>
-      <w:r>
-        <w:t>{mvvti}</w:t>
-      </w:r>
-      <w:r>
-        <w:t xml:space="preserve"> cm, Vmax VM:</w:t>
-      </w:r>
-      <w:r>
-        <w:t xml:space="preserve"> </w:t>
-      </w:r>
-      <w:r>
-        <w:t>{mvvmax}</w:t>
-      </w:r>
-      <w:r>
-        <w:t xml:space="preserve"> cm/s, Grad Med VM </w:t>
-      </w:r>
-      <w:r>
-        <w:t>{mvmg}</w:t>
-      </w:r>
-      <w:r>
-        <w:t xml:space="preserve"> mmHg</w:t>
-      </w:r>
-      <w:r>
+        <w:t>sin</w:t>
+      </w:r>
+      <w:r>
+        <w:t xml:space="preserve"> alteraciones del flujo, IVT VA </w:t>
+      </w:r>
+      <w:r>
+        <w:t>{avvti}</w:t>
+      </w:r>
+      <w:r>
+        <w:t xml:space="preserve"> cm, IVT TSVI </w:t>
+      </w:r>
+      <w:r>
+        <w:t>{lvotvti}</w:t>
+      </w:r>
+      <w:r>
+        <w:t xml:space="preserve"> cm, Grad Max </w:t>
+      </w:r>
+      <w:r>
+        <w:t>{avMaxGrad}</w:t>
+      </w:r>
+      <w:r>
+        <w:t xml:space="preserve"> mmHg, Gradiente medio </w:t>
+      </w:r>
+      <w:r>
+        <w:t>{avMeanGrad}</w:t>
+      </w:r>
+      <w:r>
+        <w:t xml:space="preserve"> mmHg, Velocidad máxima </w:t>
+      </w:r>
+      <w:r>
+        <w:t>{avvmax}</w:t>
+      </w:r>
+      <w:r>
+        <w:t xml:space="preserve"> cm/s. Área valvular aórtica (AVAo): </w:t>
+      </w:r>
+      <w:r>
+        <w:t>{avao}</w:t>
+      </w:r>
+      <w:r>
+        <w:t xml:space="preserve"> cm</w:t>
+      </w:r>
+      <w:r>
+        <w:rPr>
+          <w:rFonts w:cstheme="minorHAnsi"/>
+        </w:rPr>
+        <w:t>²</w:t>
+      </w:r>
+      <w:r>
+        <w:t xml:space="preserve">, AVAo indexada: </w:t>
+      </w:r>
+      <w:r>
+        <w:t>{iavao}</w:t>
+      </w:r>
+      <w:r>
+        <w:rPr>
+          <w:lang w:val="es-ES"/>
+        </w:rPr>
+        <w:t xml:space="preserve"> cm</w:t>
+      </w:r>
+      <w:r>
+        <w:rPr>
+          <w:rFonts w:cstheme="minorHAnsi"/>
+          <w:lang w:val="es-ES"/>
+        </w:rPr>
+        <w:t>²/</w:t>
+      </w:r>
+      <w:r>
+        <w:rPr>
+          <w:lang w:val="es-ES"/>
+        </w:rPr>
+        <w:t>m</w:t>
+      </w:r>
+      <w:r>
+        <w:rPr>
+          <w:rFonts w:cstheme="minorHAnsi"/>
+          <w:lang w:val="es-ES"/>
+        </w:rPr>
+        <w:t>²</w:t>
+      </w:r>
+      <w:r>
+        <w:rPr>
+          <w:lang w:val="es-ES"/>
+        </w:rPr>
         <w:t>.</w:t>
       </w:r>
       <w:r>
-        <w:t xml:space="preserve"> AVM: </w:t>
-      </w:r>
-      <w:r>
-        <w:t>{mva}</w:t>
-      </w:r>
-      <w:r>
-        <w:t xml:space="preserve"> cm</w:t>
-      </w:r>
-      <w:r>
         <w:rPr>
           <w:rFonts w:cstheme="minorHAnsi"/>
-        </w:rPr>
-        <w:t>².</w:t>
+          <w:lang w:val="es-ES"/>
+        </w:rPr>
+        <w:t>{ob</w:t>
+      </w:r>
+      <w:r>
+        <w:rPr>
+          <w:rFonts w:cstheme="minorHAnsi"/>
+          <w:lang w:val="es-ES"/>
+        </w:rPr>
+        <w:t>AorticValve}</w:t>
       </w:r>
     </w:p>
     <w:p>
       <w:pPr>
         <w:pStyle w:val="NoSpacing"/>
+        <w:jc w:val="both"/>
       </w:pPr>
     </w:p>
     <w:p>
@@ -2508,600 +2014,299 @@
         <w:rPr>
           <w:b/>
           <w:bCs/>
-        </w:rPr>
-        <w:t>Válvula aórtica</w:t>
-      </w:r>
+          <w:lang w:val="es-ES"/>
+        </w:rPr>
+        <w:t xml:space="preserve">Válvula pulmonar: </w:t>
+      </w:r>
+      <w:r>
+        <w:rPr>
+          <w:bCs/>
+          <w:lang w:val="es-ES"/>
+        </w:rPr>
+        <w:t xml:space="preserve">de morfología normal, sin alteraciones del flujo, Vmax VP </w:t>
+      </w:r>
+      <w:r>
+        <w:rPr>
+          <w:bCs/>
+          <w:lang w:val="es-ES"/>
+        </w:rPr>
+        <w:t>{pvvmax}</w:t>
+      </w:r>
+      <w:r>
+        <w:rPr>
+          <w:bCs/>
+          <w:lang w:val="es-ES"/>
+        </w:rPr>
+        <w:t xml:space="preserve"> cm/s, IVT TSVD</w:t>
+      </w:r>
+      <w:r>
+        <w:rPr>
+          <w:bCs/>
+          <w:lang w:val="es-ES"/>
+        </w:rPr>
+        <w:t xml:space="preserve"> </w:t>
+      </w:r>
+      <w:r>
+        <w:rPr>
+          <w:bCs/>
+          <w:lang w:val="es-ES"/>
+        </w:rPr>
+        <w:t>{rvotvti}</w:t>
+      </w:r>
+      <w:r>
+        <w:rPr>
+          <w:bCs/>
+          <w:lang w:val="es-ES"/>
+        </w:rPr>
+        <w:t xml:space="preserve"> </w:t>
+      </w:r>
+      <w:r>
+        <w:rPr>
+          <w:bCs/>
+          <w:lang w:val="es-ES"/>
+        </w:rPr>
+        <w:t xml:space="preserve">cm, tiempo de aceleración VP </w:t>
+      </w:r>
+      <w:r>
+        <w:rPr>
+          <w:bCs/>
+          <w:lang w:val="es-ES"/>
+        </w:rPr>
+        <w:t>{pvat}</w:t>
+      </w:r>
+      <w:r>
+        <w:rPr>
+          <w:bCs/>
+          <w:lang w:val="es-ES"/>
+        </w:rPr>
+        <w:t xml:space="preserve"> msegs. No estenosis. </w:t>
+      </w:r>
+      <w:r>
+        <w:rPr>
+          <w:bCs/>
+          <w:lang w:val="es-ES"/>
+        </w:rPr>
+        <w:t xml:space="preserve">Arteria pulmonar principal </w:t>
+      </w:r>
+      <w:r>
+        <w:rPr>
+          <w:bCs/>
+          <w:lang w:val="es-ES"/>
+        </w:rPr>
+        <w:t xml:space="preserve">de dimensiones normales, </w:t>
+      </w:r>
+      <w:r>
+        <w:rPr>
+          <w:bCs/>
+          <w:lang w:val="es-ES"/>
+        </w:rPr>
+        <w:t xml:space="preserve">diámetro </w:t>
+      </w:r>
+      <w:r>
+        <w:rPr>
+          <w:bCs/>
+          <w:lang w:val="es-ES"/>
+        </w:rPr>
+        <w:t>{pvd}</w:t>
+      </w:r>
+      <w:r>
+        <w:rPr>
+          <w:bCs/>
+          <w:lang w:val="es-ES"/>
+        </w:rPr>
+        <w:t xml:space="preserve"> </w:t>
+      </w:r>
+      <w:r>
+        <w:rPr>
+          <w:lang w:val="es-ES"/>
+        </w:rPr>
+        <w:t>cm.</w:t>
+      </w:r>
+      <w:r>
+        <w:rPr>
+          <w:rFonts w:cstheme="minorHAnsi"/>
+          <w:lang w:val="es-ES"/>
+        </w:rPr>
+        <w:t xml:space="preserve"> </w:t>
+      </w:r>
+      <w:r>
+        <w:rPr>
+          <w:rFonts w:cstheme="minorHAnsi"/>
+          <w:lang w:val="es-ES"/>
+        </w:rPr>
+        <w:t>{ob</w:t>
+      </w:r>
+      <w:r>
+        <w:rPr>
+          <w:rFonts w:cstheme="minorHAnsi"/>
+          <w:lang w:val="es-ES"/>
+        </w:rPr>
+        <w:t>PulmonaryValve}</w:t>
+      </w:r>
+    </w:p>
+    <w:p>
+      <w:pPr>
+        <w:pStyle w:val="NoSpacing"/>
+        <w:rPr>
+          <w:lang w:val="es-ES"/>
+        </w:rPr>
+      </w:pPr>
+    </w:p>
+    <w:p>
+      <w:pPr>
+        <w:pStyle w:val="NoSpacing"/>
+        <w:jc w:val="both"/>
+        <w:rPr>
+          <w:lang w:val="es-ES"/>
+        </w:rPr>
+      </w:pPr>
       <w:r>
         <w:rPr>
           <w:b/>
           <w:bCs/>
-        </w:rPr>
-        <w:t xml:space="preserve">: </w:t>
-      </w:r>
-      <w:r>
+          <w:lang w:val="es-ES"/>
+        </w:rPr>
+        <w:t xml:space="preserve">Válvula tricúspide: </w:t>
+      </w:r>
+      <w:r>
+        <w:rPr>
+          <w:lang w:val="es-ES"/>
+        </w:rPr>
+        <w:t xml:space="preserve">De morfología normal, con insuficiencia </w:t>
+      </w:r>
+      <w:r>
+        <w:rPr>
+          <w:lang w:val="es-ES"/>
+        </w:rPr>
+        <w:t>trivial</w:t>
+      </w:r>
+      <w:r>
+        <w:rPr>
+          <w:lang w:val="es-ES"/>
+        </w:rPr>
+        <w:t>, Vmax</w:t>
+      </w:r>
+      <w:r>
+        <w:rPr>
+          <w:lang w:val="es-ES"/>
+        </w:rPr>
+        <w:t xml:space="preserve"> IT</w:t>
+      </w:r>
+      <w:r>
+        <w:rPr>
+          <w:lang w:val="es-ES"/>
+        </w:rPr>
         <w:t xml:space="preserve"> </w:t>
       </w:r>
       <w:r>
-        <w:t>de morfología normal</w:t>
-      </w:r>
-      <w:r>
-        <w:t xml:space="preserve">, </w:t>
-      </w:r>
-      <w:r>
-        <w:t>sin</w:t>
-      </w:r>
-      <w:r>
-        <w:t xml:space="preserve"> alteraciones del flujo, IVT VA </w:t>
-      </w:r>
-      <w:r>
-        <w:t>{avvti}</w:t>
-      </w:r>
-      <w:r>
-        <w:t xml:space="preserve"> cm, IVT TSVI </w:t>
-      </w:r>
-      <w:r>
-        <w:t>{lvotvti}</w:t>
-      </w:r>
-      <w:r>
-        <w:t xml:space="preserve"> cm, Grad Max </w:t>
-      </w:r>
-      <w:r>
-        <w:t>{avMaxGrad}</w:t>
-      </w:r>
-      <w:r>
-        <w:t xml:space="preserve"> mmHg, Gradiente medio </w:t>
-      </w:r>
-      <w:r>
-        <w:t>{avMeanGrad}</w:t>
-      </w:r>
-      <w:r>
-        <w:t xml:space="preserve"> mmHg, Velocidad máxima </w:t>
-      </w:r>
-      <w:r>
-        <w:t>{avvmax}</w:t>
-      </w:r>
-      <w:r>
-        <w:t xml:space="preserve"> cm/s. Área valvular aórtica (AVAo): </w:t>
-      </w:r>
-      <w:r>
-        <w:t>{avao}</w:t>
-      </w:r>
-      <w:r>
+        <w:rPr>
+          <w:lang w:val="es-ES"/>
+        </w:rPr>
+        <w:t>{trvmax}</w:t>
+      </w:r>
+      <w:r>
+        <w:rPr>
+          <w:lang w:val="es-ES"/>
+        </w:rPr>
+        <w:t xml:space="preserve"> cm/s, gradiente máximo de IT </w:t>
+      </w:r>
+      <w:r>
+        <w:rPr>
+          <w:lang w:val="es-ES"/>
+        </w:rPr>
+        <w:t>{trMaxGrad}</w:t>
+      </w:r>
+      <w:r>
+        <w:rPr>
+          <w:lang w:val="es-ES"/>
+        </w:rPr>
+        <w:t xml:space="preserve"> mmHg, vena cava inferior </w:t>
+      </w:r>
+      <w:r>
+        <w:rPr>
+          <w:lang w:val="es-ES"/>
+        </w:rPr>
+        <w:t>de dimensiones normales</w:t>
+      </w:r>
+      <w:r>
+        <w:rPr>
+          <w:lang w:val="es-ES"/>
+        </w:rPr>
+        <w:t xml:space="preserve"> </w:t>
+      </w:r>
+      <w:r>
+        <w:rPr>
+          <w:lang w:val="es-ES"/>
+        </w:rPr>
+        <w:t xml:space="preserve">diámetro </w:t>
+      </w:r>
+      <w:r>
+        <w:rPr>
+          <w:lang w:val="es-ES"/>
+        </w:rPr>
+        <w:t>{ivcMaxDiam}</w:t>
+      </w:r>
+      <w:r>
+        <w:rPr>
+          <w:lang w:val="es-ES"/>
+        </w:rPr>
         <w:t xml:space="preserve"> cm</w:t>
       </w:r>
       <w:r>
         <w:rPr>
+          <w:lang w:val="es-ES"/>
+        </w:rPr>
+        <w:t>,</w:t>
+      </w:r>
+      <w:r>
+        <w:rPr>
+          <w:lang w:val="es-ES"/>
+        </w:rPr>
+        <w:t xml:space="preserve"> con colapso inspiratorio </w:t>
+      </w:r>
+      <w:r>
+        <w:rPr>
+          <w:lang w:val="es-ES"/>
+        </w:rPr>
+        <w:t xml:space="preserve">del </w:t>
+      </w:r>
+      <w:r>
+        <w:rPr>
+          <w:lang w:val="es-ES"/>
+        </w:rPr>
+        <w:t xml:space="preserve">{ivcci} </w:t>
+      </w:r>
+      <w:r>
+        <w:rPr>
+          <w:lang w:val="es-ES"/>
+        </w:rPr>
+        <w:t xml:space="preserve">%, que permite estimar una PSAP </w:t>
+      </w:r>
+      <w:r>
+        <w:rPr>
+          <w:lang w:val="es-ES"/>
+        </w:rPr>
+        <w:t>{psap}</w:t>
+      </w:r>
+      <w:r>
+        <w:rPr>
+          <w:lang w:val="es-ES"/>
+        </w:rPr>
+        <w:t xml:space="preserve"> mmHg.</w:t>
+      </w:r>
+      <w:r>
+        <w:rPr>
           <w:rFonts w:cstheme="minorHAnsi"/>
-        </w:rPr>
-        <w:t>²</w:t>
-      </w:r>
-      <w:r>
-        <w:t xml:space="preserve">, AVAo indexada: </w:t>
-      </w:r>
-      <w:r>
-        <w:t>{iavao}</w:t>
-      </w:r>
-      <w:r>
-        <w:rPr>
-          <w:lang w:val="es-ES"/>
-        </w:rPr>
-        <w:t xml:space="preserve"> cm</w:t>
+          <w:lang w:val="es-ES"/>
+        </w:rPr>
+        <w:t>{ob</w:t>
       </w:r>
       <w:r>
         <w:rPr>
           <w:rFonts w:cstheme="minorHAnsi"/>
           <w:lang w:val="es-ES"/>
         </w:rPr>
-        <w:t>²/</w:t>
-      </w:r>
-      <w:r>
-        <w:rPr>
-          <w:lang w:val="es-ES"/>
-        </w:rPr>
-        <w:t>m</w:t>
-      </w:r>
-      <w:r>
-        <w:rPr>
-          <w:rFonts w:cstheme="minorHAnsi"/>
-          <w:lang w:val="es-ES"/>
-        </w:rPr>
-        <w:t>²</w:t>
-      </w:r>
-      <w:r>
-        <w:rPr>
-          <w:lang w:val="es-ES"/>
-        </w:rPr>
-        <w:t xml:space="preserve">. </w:t>
-      </w:r>
-    </w:p>
-    <w:p>
-      <w:pPr>
-        <w:pStyle w:val="NoSpacing"/>
-        <w:jc w:val="both"/>
-      </w:pPr>
-    </w:p>
-    <w:p>
-      <w:pPr>
-        <w:pStyle w:val="NoSpacing"/>
-        <w:jc w:val="both"/>
-        <w:rPr>
-          <w:lang w:val="es-ES"/>
-        </w:rPr>
-      </w:pPr>
-      <w:r>
-        <w:rPr>
-          <w:b/>
-          <w:bCs/>
-          <w:lang w:val="es-ES"/>
-        </w:rPr>
-        <w:t xml:space="preserve">Válvula pulmonar: </w:t>
-      </w:r>
-      <w:r>
-        <w:rPr>
-          <w:bCs/>
-          <w:lang w:val="es-ES"/>
-        </w:rPr>
-        <w:t xml:space="preserve">de morfología normal, sin alteraciones del flujo, </w:t>
-      </w:r>
-      <w:proofErr w:type="spellStart"/>
-      <w:r>
-        <w:rPr>
-          <w:bCs/>
-          <w:lang w:val="es-ES"/>
-        </w:rPr>
-        <w:t>Vmax</w:t>
-      </w:r>
-      <w:proofErr w:type="spellEnd"/>
-      <w:r>
-        <w:rPr>
-          <w:bCs/>
-          <w:lang w:val="es-ES"/>
-        </w:rPr>
-        <w:t xml:space="preserve"> VP </w:t>
-      </w:r>
-      <w:r>
-        <w:rPr>
-          <w:bCs/>
-          <w:lang w:val="es-ES"/>
-        </w:rPr>
-        <w:t>{</w:t>
-      </w:r>
-      <w:proofErr w:type="spellStart"/>
-      <w:r>
-        <w:rPr>
-          <w:bCs/>
-          <w:lang w:val="es-ES"/>
-        </w:rPr>
-        <w:t>pvvmax</w:t>
-      </w:r>
-      <w:proofErr w:type="spellEnd"/>
-      <w:r>
-        <w:rPr>
-          <w:bCs/>
-          <w:lang w:val="es-ES"/>
-        </w:rPr>
-        <w:t>}</w:t>
-      </w:r>
-      <w:r>
-        <w:rPr>
-          <w:bCs/>
-          <w:lang w:val="es-ES"/>
-        </w:rPr>
-        <w:t xml:space="preserve"> cm/s, IVT TSVD</w:t>
-      </w:r>
-      <w:r>
-        <w:rPr>
-          <w:bCs/>
-          <w:lang w:val="es-ES"/>
-        </w:rPr>
-        <w:t xml:space="preserve"> </w:t>
-      </w:r>
-      <w:r>
-        <w:rPr>
-          <w:bCs/>
-          <w:lang w:val="es-ES"/>
-        </w:rPr>
-        <w:t>{</w:t>
-      </w:r>
-      <w:proofErr w:type="spellStart"/>
-      <w:r>
-        <w:rPr>
-          <w:bCs/>
-          <w:lang w:val="es-ES"/>
-        </w:rPr>
-        <w:t>rvotvti</w:t>
-      </w:r>
-      <w:proofErr w:type="spellEnd"/>
-      <w:r>
-        <w:rPr>
-          <w:bCs/>
-          <w:lang w:val="es-ES"/>
-        </w:rPr>
-        <w:t>}</w:t>
-      </w:r>
-      <w:r>
-        <w:rPr>
-          <w:bCs/>
-          <w:lang w:val="es-ES"/>
-        </w:rPr>
-        <w:t xml:space="preserve"> </w:t>
-      </w:r>
-      <w:r>
-        <w:rPr>
-          <w:bCs/>
-          <w:lang w:val="es-ES"/>
-        </w:rPr>
-        <w:t xml:space="preserve">cm, tiempo de aceleración VP </w:t>
-      </w:r>
-      <w:r>
-        <w:rPr>
-          <w:bCs/>
-          <w:lang w:val="es-ES"/>
-        </w:rPr>
-        <w:t>{</w:t>
-      </w:r>
-      <w:proofErr w:type="spellStart"/>
-      <w:r>
-        <w:rPr>
-          <w:bCs/>
-          <w:lang w:val="es-ES"/>
-        </w:rPr>
-        <w:t>pvat</w:t>
-      </w:r>
-      <w:proofErr w:type="spellEnd"/>
-      <w:r>
-        <w:rPr>
-          <w:bCs/>
-          <w:lang w:val="es-ES"/>
-        </w:rPr>
-        <w:t>}</w:t>
-      </w:r>
-      <w:r>
-        <w:rPr>
-          <w:bCs/>
-          <w:lang w:val="es-ES"/>
-        </w:rPr>
-        <w:t xml:space="preserve"> </w:t>
-      </w:r>
-      <w:proofErr w:type="spellStart"/>
-      <w:r>
-        <w:rPr>
-          <w:bCs/>
-          <w:lang w:val="es-ES"/>
-        </w:rPr>
-        <w:t>msegs</w:t>
-      </w:r>
-      <w:proofErr w:type="spellEnd"/>
-      <w:r>
-        <w:rPr>
-          <w:bCs/>
-          <w:lang w:val="es-ES"/>
-        </w:rPr>
-        <w:t xml:space="preserve">. No estenosis. </w:t>
-      </w:r>
-      <w:r>
-        <w:rPr>
-          <w:bCs/>
-          <w:lang w:val="es-ES"/>
-        </w:rPr>
-        <w:t xml:space="preserve">Arteria pulmonar principal </w:t>
-      </w:r>
-      <w:r>
-        <w:rPr>
-          <w:bCs/>
-          <w:lang w:val="es-ES"/>
-        </w:rPr>
-        <w:t xml:space="preserve">de dimensiones normales, </w:t>
-      </w:r>
-      <w:r>
-        <w:rPr>
-          <w:bCs/>
-          <w:lang w:val="es-ES"/>
-        </w:rPr>
-        <w:t xml:space="preserve">diámetro </w:t>
-      </w:r>
-      <w:r>
-        <w:rPr>
-          <w:bCs/>
-          <w:lang w:val="es-ES"/>
-        </w:rPr>
-        <w:t>{pvd}</w:t>
-      </w:r>
-      <w:r>
-        <w:rPr>
-          <w:bCs/>
-          <w:lang w:val="es-ES"/>
-        </w:rPr>
-        <w:t xml:space="preserve"> </w:t>
-      </w:r>
-      <w:r>
-        <w:rPr>
-          <w:lang w:val="es-ES"/>
-        </w:rPr>
-        <w:t>cm.</w:t>
-      </w:r>
-    </w:p>
-    <w:p>
-      <w:pPr>
-        <w:pStyle w:val="NoSpacing"/>
-        <w:rPr>
-          <w:lang w:val="es-ES"/>
-        </w:rPr>
-      </w:pPr>
-    </w:p>
-    <w:p>
-      <w:pPr>
-        <w:pStyle w:val="NoSpacing"/>
-        <w:jc w:val="both"/>
-        <w:rPr>
-          <w:lang w:val="es-ES"/>
-        </w:rPr>
-      </w:pPr>
-      <w:r>
-        <w:rPr>
-          <w:b/>
-          <w:bCs/>
-          <w:lang w:val="es-ES"/>
-        </w:rPr>
-        <w:t xml:space="preserve">Válvula tricúspide: </w:t>
-      </w:r>
-      <w:r>
-        <w:rPr>
-          <w:lang w:val="es-ES"/>
-        </w:rPr>
-        <w:t xml:space="preserve">De morfología normal, con insuficiencia </w:t>
-      </w:r>
-      <w:r>
-        <w:rPr>
-          <w:lang w:val="es-ES"/>
-        </w:rPr>
-        <w:t>trivial</w:t>
-      </w:r>
-      <w:r>
-        <w:rPr>
-          <w:lang w:val="es-ES"/>
-        </w:rPr>
-        <w:t xml:space="preserve">, </w:t>
-      </w:r>
-      <w:proofErr w:type="spellStart"/>
-      <w:r>
-        <w:rPr>
-          <w:lang w:val="es-ES"/>
-        </w:rPr>
-        <w:t>Vmax</w:t>
-      </w:r>
-      <w:proofErr w:type="spellEnd"/>
-      <w:r>
-        <w:rPr>
-          <w:lang w:val="es-ES"/>
-        </w:rPr>
-        <w:t xml:space="preserve"> IT</w:t>
-      </w:r>
-      <w:r>
-        <w:rPr>
-          <w:lang w:val="es-ES"/>
-        </w:rPr>
-        <w:t xml:space="preserve"> </w:t>
-      </w:r>
-      <w:r>
-        <w:rPr>
-          <w:lang w:val="es-ES"/>
-        </w:rPr>
-        <w:t>{</w:t>
-      </w:r>
-      <w:proofErr w:type="spellStart"/>
-      <w:r>
-        <w:rPr>
-          <w:lang w:val="es-ES"/>
-        </w:rPr>
-        <w:t>trvmax</w:t>
-      </w:r>
-      <w:proofErr w:type="spellEnd"/>
-      <w:r>
-        <w:rPr>
-          <w:lang w:val="es-ES"/>
-        </w:rPr>
-        <w:t>}</w:t>
-      </w:r>
-      <w:r>
-        <w:rPr>
-          <w:lang w:val="es-ES"/>
-        </w:rPr>
-        <w:t xml:space="preserve"> cm/s, gradiente máximo de IT </w:t>
-      </w:r>
-      <w:r>
-        <w:rPr>
-          <w:lang w:val="es-ES"/>
-        </w:rPr>
-        <w:t>{</w:t>
-      </w:r>
-      <w:proofErr w:type="spellStart"/>
-      <w:r>
-        <w:rPr>
-          <w:lang w:val="es-ES"/>
-        </w:rPr>
-        <w:t>trMaxGrad</w:t>
-      </w:r>
-      <w:proofErr w:type="spellEnd"/>
-      <w:r>
-        <w:rPr>
-          <w:lang w:val="es-ES"/>
-        </w:rPr>
-        <w:t>}</w:t>
-      </w:r>
-      <w:r>
-        <w:rPr>
-          <w:lang w:val="es-ES"/>
-        </w:rPr>
-        <w:t xml:space="preserve"> m</w:t>
-      </w:r>
-      <w:proofErr w:type="spellStart"/>
-      <w:r>
-        <w:rPr>
-          <w:lang w:val="es-ES"/>
-        </w:rPr>
-        <w:t>mHg</w:t>
-      </w:r>
-      <w:proofErr w:type="spellEnd"/>
-      <w:r>
-        <w:rPr>
-          <w:lang w:val="es-ES"/>
-        </w:rPr>
-        <w:t xml:space="preserve">, vena cava inferior </w:t>
-      </w:r>
-      <w:r>
-        <w:rPr>
-          <w:lang w:val="es-ES"/>
-        </w:rPr>
-        <w:t>de dimensiones normales</w:t>
-      </w:r>
-      <w:r>
-        <w:rPr>
-          <w:lang w:val="es-ES"/>
-        </w:rPr>
-        <w:t xml:space="preserve"> </w:t>
-      </w:r>
-      <w:r>
-        <w:rPr>
-          <w:lang w:val="es-ES"/>
-        </w:rPr>
-        <w:t xml:space="preserve">diámetro </w:t>
-      </w:r>
-      <w:r>
-        <w:rPr>
-          <w:lang w:val="es-ES"/>
-        </w:rPr>
-        <w:t>{</w:t>
-      </w:r>
-      <w:proofErr w:type="spellStart"/>
-      <w:r>
-        <w:rPr>
-          <w:lang w:val="es-ES"/>
-        </w:rPr>
-        <w:t>ivcMaxDiam</w:t>
-      </w:r>
-      <w:proofErr w:type="spellEnd"/>
-      <w:r>
-        <w:rPr>
-          <w:lang w:val="es-ES"/>
-        </w:rPr>
-        <w:t>}</w:t>
-      </w:r>
-      <w:r>
-        <w:rPr>
-          <w:lang w:val="es-ES"/>
-        </w:rPr>
-        <w:t xml:space="preserve"> cm</w:t>
-      </w:r>
-      <w:r>
-        <w:rPr>
-          <w:lang w:val="es-ES"/>
-        </w:rPr>
-        <w:t>,</w:t>
-      </w:r>
-      <w:r>
-        <w:rPr>
-          <w:lang w:val="es-ES"/>
-        </w:rPr>
-        <w:t xml:space="preserve"> con colapso inspiratorio </w:t>
-      </w:r>
-      <w:r>
-        <w:rPr>
-          <w:lang w:val="es-ES"/>
-        </w:rPr>
-        <w:t>{</w:t>
-      </w:r>
-      <w:proofErr w:type="spellStart"/>
-      <w:r>
-        <w:rPr>
-          <w:lang w:val="es-ES"/>
-        </w:rPr>
-        <w:t>ivcicM</w:t>
-      </w:r>
-      <w:proofErr w:type="spellEnd"/>
-      <w:r>
-        <w:rPr>
-          <w:lang w:val="es-ES"/>
-        </w:rPr>
-        <w:t>}</w:t>
-      </w:r>
-      <w:r>
-        <w:rPr>
-          <w:lang w:val="es-ES"/>
-        </w:rPr>
-        <w:t xml:space="preserve"> al</w:t>
-      </w:r>
-      <w:r>
-        <w:rPr>
-          <w:lang w:val="es-ES"/>
-        </w:rPr>
-        <w:t xml:space="preserve"> </w:t>
-      </w:r>
-      <w:r>
-        <w:rPr>
-          <w:lang w:val="es-ES"/>
-        </w:rPr>
-        <w:t>{</w:t>
-      </w:r>
-      <w:proofErr w:type="spellStart"/>
-      <w:r>
-        <w:rPr>
-          <w:lang w:val="es-ES"/>
-        </w:rPr>
-        <w:t>ivcci</w:t>
-      </w:r>
-      <w:proofErr w:type="spellEnd"/>
-      <w:r>
-        <w:rPr>
-          <w:lang w:val="es-ES"/>
-        </w:rPr>
-        <w:t xml:space="preserve">} </w:t>
-      </w:r>
-      <w:r>
-        <w:rPr>
-          <w:lang w:val="es-ES"/>
-        </w:rPr>
-        <w:t xml:space="preserve">%, que permite estimar una PSAP </w:t>
-      </w:r>
-      <w:r>
-        <w:rPr>
-          <w:lang w:val="es-ES"/>
-        </w:rPr>
-        <w:t>{</w:t>
-      </w:r>
-      <w:proofErr w:type="spellStart"/>
-      <w:r>
-        <w:rPr>
-          <w:lang w:val="es-ES"/>
-        </w:rPr>
-        <w:t>psap</w:t>
-      </w:r>
-      <w:proofErr w:type="spellEnd"/>
-      <w:r>
-        <w:rPr>
-          <w:lang w:val="es-ES"/>
-        </w:rPr>
-        <w:t>}</w:t>
-      </w:r>
-      <w:r>
-        <w:rPr>
-          <w:lang w:val="es-ES"/>
-        </w:rPr>
-        <w:t xml:space="preserve"> m</w:t>
-      </w:r>
-      <w:proofErr w:type="spellStart"/>
-      <w:r>
-        <w:rPr>
-          <w:lang w:val="es-ES"/>
-        </w:rPr>
-        <w:t>mHg</w:t>
-      </w:r>
-      <w:proofErr w:type="spellEnd"/>
-      <w:r>
-        <w:rPr>
-          <w:lang w:val="es-ES"/>
-        </w:rPr>
-        <w:t xml:space="preserve">. </w:t>
+        <w:t>TricuspideValve}</w:t>
       </w:r>
     </w:p>
     <w:p>
@@ -3236,21 +2441,7 @@
         <w:rPr>
           <w:lang w:val="es-ES"/>
         </w:rPr>
-        <w:t>{</w:t>
-      </w:r>
-      <w:proofErr w:type="spellStart"/>
-      <w:r>
-        <w:rPr>
-          <w:lang w:val="es-ES"/>
-        </w:rPr>
-        <w:t>lvefInt</w:t>
-      </w:r>
-      <w:proofErr w:type="spellEnd"/>
-      <w:r>
-        <w:rPr>
-          <w:lang w:val="es-ES"/>
-        </w:rPr>
-        <w:t>}</w:t>
+        <w:t>{lvefInt}</w:t>
       </w:r>
       <w:r>
         <w:rPr>
@@ -3328,21 +2519,7 @@
         <w:rPr>
           <w:lang w:val="es-ES"/>
         </w:rPr>
-        <w:t>{</w:t>
-      </w:r>
-      <w:proofErr w:type="spellStart"/>
-      <w:r>
-        <w:rPr>
-          <w:lang w:val="es-ES"/>
-        </w:rPr>
-        <w:t>rvtapse</w:t>
-      </w:r>
-      <w:proofErr w:type="spellEnd"/>
-      <w:r>
-        <w:rPr>
-          <w:lang w:val="es-ES"/>
-        </w:rPr>
-        <w:t>}</w:t>
+        <w:t>{rvtapse}</w:t>
       </w:r>
       <w:r>
         <w:rPr>
@@ -3360,21 +2537,7 @@
         <w:rPr>
           <w:lang w:val="es-ES"/>
         </w:rPr>
-        <w:t>{</w:t>
-      </w:r>
-      <w:proofErr w:type="spellStart"/>
-      <w:r>
-        <w:rPr>
-          <w:lang w:val="es-ES"/>
-        </w:rPr>
-        <w:t>sWave</w:t>
-      </w:r>
-      <w:proofErr w:type="spellEnd"/>
-      <w:r>
-        <w:rPr>
-          <w:lang w:val="es-ES"/>
-        </w:rPr>
-        <w:t>}</w:t>
+        <w:t>{sWave}</w:t>
       </w:r>
       <w:r>
         <w:rPr>
@@ -3392,21 +2555,7 @@
         <w:rPr>
           <w:lang w:val="es-ES"/>
         </w:rPr>
-        <w:t>{</w:t>
-      </w:r>
-      <w:proofErr w:type="spellStart"/>
-      <w:r>
-        <w:rPr>
-          <w:lang w:val="es-ES"/>
-        </w:rPr>
-        <w:t>rvfacInt</w:t>
-      </w:r>
-      <w:proofErr w:type="spellEnd"/>
-      <w:r>
-        <w:rPr>
-          <w:lang w:val="es-ES"/>
-        </w:rPr>
-        <w:t>}</w:t>
+        <w:t>{rvfacInt}</w:t>
       </w:r>
       <w:r>
         <w:rPr>
@@ -3509,21 +2658,7 @@
         <w:rPr>
           <w:lang w:val="es-ES"/>
         </w:rPr>
-        <w:t xml:space="preserve"> </w:t>
-      </w:r>
-      <w:proofErr w:type="spellStart"/>
-      <w:r>
-        <w:rPr>
-          <w:lang w:val="es-ES"/>
-        </w:rPr>
-        <w:t>mmHg</w:t>
-      </w:r>
-      <w:proofErr w:type="spellEnd"/>
-      <w:r>
-        <w:rPr>
-          <w:lang w:val="es-ES"/>
-        </w:rPr>
-        <w:t xml:space="preserve">. </w:t>
+        <w:t xml:space="preserve"> mmHg. </w:t>
       </w:r>
     </w:p>
     <w:p>
@@ -3946,7 +3081,6 @@
         <w:lang w:val="it-IT"/>
       </w:rPr>
     </w:pPr>
-    <w:proofErr w:type="spellStart"/>
     <w:r>
       <w:rPr>
         <w:rFonts w:ascii="Agency FB" w:hAnsi="Agency FB"/>
@@ -3956,19 +3090,7 @@
         <w:szCs w:val="18"/>
         <w:lang w:val="it-IT"/>
       </w:rPr>
-      <w:t>Citas</w:t>
-    </w:r>
-    <w:proofErr w:type="spellEnd"/>
-    <w:r>
-      <w:rPr>
-        <w:rFonts w:ascii="Agency FB" w:hAnsi="Agency FB"/>
-        <w:b/>
-        <w:bCs/>
-        <w:sz w:val="18"/>
-        <w:szCs w:val="18"/>
-        <w:lang w:val="it-IT"/>
-      </w:rPr>
-      <w:t xml:space="preserve"> al 54923219</w:t>
+      <w:t>Citas al 54923219</w:t>
     </w:r>
   </w:p>
 </w:ftr>
@@ -4752,27 +3874,7 @@
         <w:szCs w:val="48"/>
         <w:lang w:val="es-ES"/>
       </w:rPr>
-      <w:t xml:space="preserve">. Luis José </w:t>
-    </w:r>
-    <w:proofErr w:type="spellStart"/>
-    <w:r>
-      <w:rPr>
-        <w:rFonts w:ascii="Brush Script MT" w:hAnsi="Brush Script MT"/>
-        <w:sz w:val="48"/>
-        <w:szCs w:val="48"/>
-        <w:lang w:val="es-ES"/>
-      </w:rPr>
-      <w:t>Olá</w:t>
-    </w:r>
-    <w:proofErr w:type="spellEnd"/>
-    <w:r>
-      <w:rPr>
-        <w:rFonts w:ascii="Brush Script MT" w:hAnsi="Brush Script MT"/>
-        <w:sz w:val="48"/>
-        <w:szCs w:val="48"/>
-        <w:lang w:val="es-ES"/>
-      </w:rPr>
-      <w:t xml:space="preserve"> Ruiz</w:t>
+      <w:t>. Luis José Olá Ruiz</w:t>
     </w:r>
     <w:r>
       <w:rPr>

</xml_diff>

<commit_message>
template updated, form adjustments and data injection adjusted
</commit_message>
<xml_diff>
--- a/public/medical-rerpot-template.docx
+++ b/public/medical-rerpot-template.docx
@@ -121,6 +121,7 @@
               </w:rPr>
               <w:t>{</w:t>
             </w:r>
+            <w:proofErr w:type="spellStart"/>
             <w:r>
               <w:rPr>
                 <w:sz w:val="28"/>
@@ -130,6 +131,7 @@
               </w:rPr>
               <w:t>name</w:t>
             </w:r>
+            <w:proofErr w:type="spellEnd"/>
             <w:r>
               <w:rPr>
                 <w:sz w:val="28"/>
@@ -198,7 +200,27 @@
                 <w:u w:val="single"/>
                 <w:lang w:val="es-ES"/>
               </w:rPr>
-              <w:t>{age}</w:t>
+              <w:t>{</w:t>
+            </w:r>
+            <w:proofErr w:type="spellStart"/>
+            <w:r>
+              <w:rPr>
+                <w:sz w:val="28"/>
+                <w:szCs w:val="28"/>
+                <w:u w:val="single"/>
+                <w:lang w:val="es-ES"/>
+              </w:rPr>
+              <w:t>age</w:t>
+            </w:r>
+            <w:proofErr w:type="spellEnd"/>
+            <w:r>
+              <w:rPr>
+                <w:sz w:val="28"/>
+                <w:szCs w:val="28"/>
+                <w:u w:val="single"/>
+                <w:lang w:val="es-ES"/>
+              </w:rPr>
+              <w:t>}</w:t>
             </w:r>
             <w:r>
               <w:rPr>
@@ -249,7 +271,18 @@
                 <w:szCs w:val="28"/>
                 <w:lang w:val="es-ES"/>
               </w:rPr>
-              <w:t>Fecha del estudio:</w:t>
+              <w:t>Fecha del estudio</w:t>
+            </w:r>
+            <w:proofErr w:type="gramStart"/>
+            <w:r>
+              <w:rPr>
+                <w:b/>
+                <w:bCs/>
+                <w:sz w:val="28"/>
+                <w:szCs w:val="28"/>
+                <w:lang w:val="es-ES"/>
+              </w:rPr>
+              <w:t>:</w:t>
             </w:r>
             <w:r>
               <w:rPr>
@@ -278,7 +311,17 @@
                 <w:u w:val="single"/>
                 <w:lang w:val="es-ES"/>
               </w:rPr>
-              <w:t>{date}</w:t>
+              <w:t>{</w:t>
+            </w:r>
+            <w:proofErr w:type="gramEnd"/>
+            <w:r>
+              <w:rPr>
+                <w:sz w:val="28"/>
+                <w:szCs w:val="28"/>
+                <w:u w:val="single"/>
+                <w:lang w:val="es-ES"/>
+              </w:rPr>
+              <w:t>date}</w:t>
             </w:r>
             <w:r>
               <w:rPr>
@@ -350,7 +393,27 @@
                 <w:u w:val="single"/>
                 <w:lang w:val="es-ES"/>
               </w:rPr>
-              <w:t>{weight}</w:t>
+              <w:t>{</w:t>
+            </w:r>
+            <w:proofErr w:type="spellStart"/>
+            <w:r>
+              <w:rPr>
+                <w:sz w:val="28"/>
+                <w:szCs w:val="28"/>
+                <w:u w:val="single"/>
+                <w:lang w:val="es-ES"/>
+              </w:rPr>
+              <w:t>weight</w:t>
+            </w:r>
+            <w:proofErr w:type="spellEnd"/>
+            <w:r>
+              <w:rPr>
+                <w:sz w:val="28"/>
+                <w:szCs w:val="28"/>
+                <w:u w:val="single"/>
+                <w:lang w:val="es-ES"/>
+              </w:rPr>
+              <w:t>}</w:t>
             </w:r>
             <w:r>
               <w:rPr>
@@ -441,7 +504,27 @@
                 <w:u w:val="single"/>
                 <w:lang w:val="en-US"/>
               </w:rPr>
-              <w:t>{asc}</w:t>
+              <w:t>{</w:t>
+            </w:r>
+            <w:proofErr w:type="spellStart"/>
+            <w:r>
+              <w:rPr>
+                <w:sz w:val="28"/>
+                <w:szCs w:val="28"/>
+                <w:u w:val="single"/>
+                <w:lang w:val="en-US"/>
+              </w:rPr>
+              <w:t>asc</w:t>
+            </w:r>
+            <w:proofErr w:type="spellEnd"/>
+            <w:r>
+              <w:rPr>
+                <w:sz w:val="28"/>
+                <w:szCs w:val="28"/>
+                <w:u w:val="single"/>
+                <w:lang w:val="en-US"/>
+              </w:rPr>
+              <w:t>}</w:t>
             </w:r>
             <w:r>
               <w:rPr>
@@ -509,7 +592,28 @@
                 <w:szCs w:val="24"/>
                 <w:lang w:val="es-ES"/>
               </w:rPr>
-              <w:t>{^hasReference}</w:t>
+              <w:t>{^</w:t>
+            </w:r>
+            <w:proofErr w:type="spellStart"/>
+            <w:proofErr w:type="gramStart"/>
+            <w:r>
+              <w:rPr>
+                <w:rFonts w:cs="Arial"/>
+                <w:sz w:val="24"/>
+                <w:szCs w:val="24"/>
+                <w:lang w:val="es-ES"/>
+              </w:rPr>
+              <w:t>hasReference</w:t>
+            </w:r>
+            <w:proofErr w:type="spellEnd"/>
+            <w:r>
+              <w:rPr>
+                <w:rFonts w:cs="Arial"/>
+                <w:sz w:val="24"/>
+                <w:szCs w:val="24"/>
+                <w:lang w:val="es-ES"/>
+              </w:rPr>
+              <w:t>}</w:t>
             </w:r>
             <w:r>
               <w:rPr>
@@ -519,7 +623,18 @@
                 <w:szCs w:val="28"/>
                 <w:lang w:val="es-ES"/>
               </w:rPr>
-              <w:t>Referencia:</w:t>
+              <w:t>Referencia</w:t>
+            </w:r>
+            <w:proofErr w:type="gramEnd"/>
+            <w:r>
+              <w:rPr>
+                <w:b/>
+                <w:bCs/>
+                <w:sz w:val="28"/>
+                <w:szCs w:val="28"/>
+                <w:lang w:val="es-ES"/>
+              </w:rPr>
+              <w:t>:</w:t>
             </w:r>
             <w:r>
               <w:rPr>
@@ -547,7 +662,27 @@
                 <w:szCs w:val="24"/>
                 <w:lang w:val="es-ES"/>
               </w:rPr>
-              <w:t>{/hasReference}</w:t>
+              <w:t>{/</w:t>
+            </w:r>
+            <w:proofErr w:type="spellStart"/>
+            <w:r>
+              <w:rPr>
+                <w:rFonts w:cs="Arial"/>
+                <w:sz w:val="24"/>
+                <w:szCs w:val="24"/>
+                <w:lang w:val="es-ES"/>
+              </w:rPr>
+              <w:t>hasReference</w:t>
+            </w:r>
+            <w:proofErr w:type="spellEnd"/>
+            <w:r>
+              <w:rPr>
+                <w:rFonts w:cs="Arial"/>
+                <w:sz w:val="24"/>
+                <w:szCs w:val="24"/>
+                <w:lang w:val="es-ES"/>
+              </w:rPr>
+              <w:t>}</w:t>
             </w:r>
           </w:p>
         </w:tc>
@@ -630,7 +765,27 @@
           <w:u w:val="single"/>
           <w:lang w:val="es-ES"/>
         </w:rPr>
-        <w:t>{reference}.</w:t>
+        <w:t>{</w:t>
+      </w:r>
+      <w:proofErr w:type="spellStart"/>
+      <w:r>
+        <w:rPr>
+          <w:sz w:val="28"/>
+          <w:szCs w:val="28"/>
+          <w:u w:val="single"/>
+          <w:lang w:val="es-ES"/>
+        </w:rPr>
+        <w:t>reference</w:t>
+      </w:r>
+      <w:proofErr w:type="spellEnd"/>
+      <w:r>
+        <w:rPr>
+          <w:sz w:val="28"/>
+          <w:szCs w:val="28"/>
+          <w:u w:val="single"/>
+          <w:lang w:val="es-ES"/>
+        </w:rPr>
+        <w:t>}.</w:t>
       </w:r>
     </w:p>
     <w:p>
@@ -651,7 +806,27 @@
           <w:szCs w:val="24"/>
           <w:lang w:val="es-ES"/>
         </w:rPr>
-        <w:t>{/hasReference}</w:t>
+        <w:t>{/</w:t>
+      </w:r>
+      <w:proofErr w:type="spellStart"/>
+      <w:r>
+        <w:rPr>
+          <w:rFonts w:cs="Arial"/>
+          <w:sz w:val="24"/>
+          <w:szCs w:val="24"/>
+          <w:lang w:val="es-ES"/>
+        </w:rPr>
+        <w:t>hasReference</w:t>
+      </w:r>
+      <w:proofErr w:type="spellEnd"/>
+      <w:r>
+        <w:rPr>
+          <w:rFonts w:cs="Arial"/>
+          <w:sz w:val="24"/>
+          <w:szCs w:val="24"/>
+          <w:lang w:val="es-ES"/>
+        </w:rPr>
+        <w:t>}</w:t>
       </w:r>
     </w:p>
     <w:p>
@@ -680,7 +855,23 @@
           <w:rFonts w:cs="Arial"/>
           <w:lang w:val="es-ES"/>
         </w:rPr>
-        <w:t>Bajo los estándares de la sociedad americana de ecocardiografía se procede a realizar ecocardiograma transtorácico 2D – modo M, Doppler continuo, pulsado y color, con equipo Sonoscape X-3</w:t>
+        <w:t xml:space="preserve">Bajo los estándares de la sociedad americana de ecocardiografía se procede a realizar ecocardiograma transtorácico 2D – modo M, Doppler continuo, pulsado y color, con equipo </w:t>
+      </w:r>
+      <w:proofErr w:type="spellStart"/>
+      <w:r>
+        <w:rPr>
+          <w:rFonts w:cs="Arial"/>
+          <w:lang w:val="es-ES"/>
+        </w:rPr>
+        <w:t>Sonoscape</w:t>
+      </w:r>
+      <w:proofErr w:type="spellEnd"/>
+      <w:r>
+        <w:rPr>
+          <w:rFonts w:cs="Arial"/>
+          <w:lang w:val="es-ES"/>
+        </w:rPr>
+        <w:t xml:space="preserve"> X-3</w:t>
       </w:r>
       <w:r>
         <w:rPr>
@@ -822,7 +1013,21 @@
         <w:rPr>
           <w:lang w:val="es-ES"/>
         </w:rPr>
-        <w:t xml:space="preserve">, diámetro telediastólico indexado </w:t>
+        <w:t xml:space="preserve">, diámetro </w:t>
+      </w:r>
+      <w:proofErr w:type="spellStart"/>
+      <w:r>
+        <w:rPr>
+          <w:lang w:val="es-ES"/>
+        </w:rPr>
+        <w:t>telediastólico</w:t>
+      </w:r>
+      <w:proofErr w:type="spellEnd"/>
+      <w:r>
+        <w:rPr>
+          <w:lang w:val="es-ES"/>
+        </w:rPr>
+        <w:t xml:space="preserve"> indexado </w:t>
       </w:r>
       <w:r>
         <w:rPr>
@@ -830,12 +1035,14 @@
         </w:rPr>
         <w:t>{</w:t>
       </w:r>
+      <w:proofErr w:type="spellStart"/>
       <w:r>
         <w:rPr>
           <w:lang w:val="es-ES"/>
         </w:rPr>
         <w:t>ilvedd</w:t>
       </w:r>
+      <w:proofErr w:type="spellEnd"/>
       <w:r>
         <w:rPr>
           <w:lang w:val="es-ES"/>
@@ -859,7 +1066,21 @@
         <w:rPr>
           <w:lang w:val="es-ES"/>
         </w:rPr>
-        <w:t xml:space="preserve">, volumen telediastólico indexado </w:t>
+        <w:t xml:space="preserve">, volumen </w:t>
+      </w:r>
+      <w:proofErr w:type="spellStart"/>
+      <w:r>
+        <w:rPr>
+          <w:lang w:val="es-ES"/>
+        </w:rPr>
+        <w:t>telediastólico</w:t>
+      </w:r>
+      <w:proofErr w:type="spellEnd"/>
+      <w:r>
+        <w:rPr>
+          <w:lang w:val="es-ES"/>
+        </w:rPr>
+        <w:t xml:space="preserve"> indexado </w:t>
       </w:r>
       <w:r>
         <w:rPr>
@@ -867,12 +1088,14 @@
         </w:rPr>
         <w:t>{</w:t>
       </w:r>
+      <w:proofErr w:type="spellStart"/>
       <w:r>
         <w:rPr>
           <w:lang w:val="es-ES"/>
         </w:rPr>
         <w:t>ilvedv</w:t>
       </w:r>
+      <w:proofErr w:type="spellEnd"/>
       <w:r>
         <w:rPr>
           <w:lang w:val="es-ES"/>
@@ -904,12 +1127,14 @@
         </w:rPr>
         <w:t>{</w:t>
       </w:r>
+      <w:proofErr w:type="spellStart"/>
       <w:r>
         <w:rPr>
           <w:lang w:val="es-ES"/>
         </w:rPr>
         <w:t>ilvmass</w:t>
       </w:r>
+      <w:proofErr w:type="spellEnd"/>
       <w:r>
         <w:rPr>
           <w:lang w:val="es-ES"/>
@@ -933,19 +1158,21 @@
         <w:rPr>
           <w:lang w:val="es-ES"/>
         </w:rPr>
-        <w:t xml:space="preserve">, SIVd: </w:t>
-      </w:r>
-      <w:r>
-        <w:rPr>
-          <w:lang w:val="es-ES"/>
-        </w:rPr>
-        <w:t>{ivsd}</w:t>
-      </w:r>
-      <w:r>
-        <w:rPr>
-          <w:lang w:val="es-ES"/>
-        </w:rPr>
-        <w:t xml:space="preserve"> cm, DIVId: </w:t>
+        <w:t xml:space="preserve">, </w:t>
+      </w:r>
+      <w:proofErr w:type="spellStart"/>
+      <w:r>
+        <w:rPr>
+          <w:lang w:val="es-ES"/>
+        </w:rPr>
+        <w:t>SIVd</w:t>
+      </w:r>
+      <w:proofErr w:type="spellEnd"/>
+      <w:r>
+        <w:rPr>
+          <w:lang w:val="es-ES"/>
+        </w:rPr>
+        <w:t xml:space="preserve">: </w:t>
       </w:r>
       <w:r>
         <w:rPr>
@@ -953,12 +1180,54 @@
         </w:rPr>
         <w:t>{</w:t>
       </w:r>
+      <w:proofErr w:type="spellStart"/>
+      <w:r>
+        <w:rPr>
+          <w:lang w:val="es-ES"/>
+        </w:rPr>
+        <w:t>ivsd</w:t>
+      </w:r>
+      <w:proofErr w:type="spellEnd"/>
+      <w:r>
+        <w:rPr>
+          <w:lang w:val="es-ES"/>
+        </w:rPr>
+        <w:t>}</w:t>
+      </w:r>
+      <w:r>
+        <w:rPr>
+          <w:lang w:val="es-ES"/>
+        </w:rPr>
+        <w:t xml:space="preserve"> cm, </w:t>
+      </w:r>
+      <w:proofErr w:type="spellStart"/>
+      <w:r>
+        <w:rPr>
+          <w:lang w:val="es-ES"/>
+        </w:rPr>
+        <w:t>DIVId</w:t>
+      </w:r>
+      <w:proofErr w:type="spellEnd"/>
+      <w:r>
+        <w:rPr>
+          <w:lang w:val="es-ES"/>
+        </w:rPr>
+        <w:t xml:space="preserve">: </w:t>
+      </w:r>
+      <w:r>
+        <w:rPr>
+          <w:lang w:val="es-ES"/>
+        </w:rPr>
+        <w:t>{</w:t>
+      </w:r>
+      <w:proofErr w:type="spellStart"/>
       <w:r>
         <w:rPr>
           <w:lang w:val="es-ES"/>
         </w:rPr>
         <w:t>lvided</w:t>
       </w:r>
+      <w:proofErr w:type="spellEnd"/>
       <w:r>
         <w:rPr>
           <w:lang w:val="es-ES"/>
@@ -969,13 +1238,41 @@
         <w:rPr>
           <w:lang w:val="es-ES"/>
         </w:rPr>
-        <w:t xml:space="preserve"> cm, PPVId: </w:t>
-      </w:r>
-      <w:r>
-        <w:rPr>
-          <w:lang w:val="es-ES"/>
-        </w:rPr>
-        <w:t>{lvpwd}</w:t>
+        <w:t xml:space="preserve"> cm, </w:t>
+      </w:r>
+      <w:proofErr w:type="spellStart"/>
+      <w:r>
+        <w:rPr>
+          <w:lang w:val="es-ES"/>
+        </w:rPr>
+        <w:t>PPVId</w:t>
+      </w:r>
+      <w:proofErr w:type="spellEnd"/>
+      <w:r>
+        <w:rPr>
+          <w:lang w:val="es-ES"/>
+        </w:rPr>
+        <w:t xml:space="preserve">: </w:t>
+      </w:r>
+      <w:r>
+        <w:rPr>
+          <w:lang w:val="es-ES"/>
+        </w:rPr>
+        <w:t>{</w:t>
+      </w:r>
+      <w:proofErr w:type="spellStart"/>
+      <w:r>
+        <w:rPr>
+          <w:lang w:val="es-ES"/>
+        </w:rPr>
+        <w:t>lvpwd</w:t>
+      </w:r>
+      <w:proofErr w:type="spellEnd"/>
+      <w:r>
+        <w:rPr>
+          <w:lang w:val="es-ES"/>
+        </w:rPr>
+        <w:t>}</w:t>
       </w:r>
       <w:r>
         <w:rPr>
@@ -987,26 +1284,56 @@
         <w:rPr>
           <w:lang w:val="es-ES"/>
         </w:rPr>
-        <w:t>{lvrwt}</w:t>
-      </w:r>
-      <w:r>
-        <w:rPr>
-          <w:lang w:val="es-ES"/>
-        </w:rPr>
-        <w:t xml:space="preserve">, no se observan trastornos de la contractilidad global o segmentaria. Volumen telediastólico </w:t>
-      </w:r>
-      <w:r>
-        <w:rPr>
-          <w:lang w:val="es-ES"/>
-        </w:rPr>
         <w:t>{</w:t>
       </w:r>
+      <w:proofErr w:type="spellStart"/>
+      <w:r>
+        <w:rPr>
+          <w:lang w:val="es-ES"/>
+        </w:rPr>
+        <w:t>lvrwt</w:t>
+      </w:r>
+      <w:proofErr w:type="spellEnd"/>
+      <w:r>
+        <w:rPr>
+          <w:lang w:val="es-ES"/>
+        </w:rPr>
+        <w:t>}</w:t>
+      </w:r>
+      <w:r>
+        <w:rPr>
+          <w:lang w:val="es-ES"/>
+        </w:rPr>
+        <w:t xml:space="preserve">, no se observan trastornos de la contractilidad global o segmentaria. Volumen </w:t>
+      </w:r>
+      <w:proofErr w:type="spellStart"/>
+      <w:r>
+        <w:rPr>
+          <w:lang w:val="es-ES"/>
+        </w:rPr>
+        <w:t>telediastólico</w:t>
+      </w:r>
+      <w:proofErr w:type="spellEnd"/>
+      <w:r>
+        <w:rPr>
+          <w:lang w:val="es-ES"/>
+        </w:rPr>
+        <w:t xml:space="preserve"> </w:t>
+      </w:r>
+      <w:r>
+        <w:rPr>
+          <w:lang w:val="es-ES"/>
+        </w:rPr>
+        <w:t>{</w:t>
+      </w:r>
+      <w:proofErr w:type="spellStart"/>
       <w:r>
         <w:rPr>
           <w:lang w:val="es-ES"/>
         </w:rPr>
         <w:t>lvedv</w:t>
       </w:r>
+      <w:proofErr w:type="spellEnd"/>
       <w:r>
         <w:rPr>
           <w:lang w:val="es-ES"/>
@@ -1017,13 +1344,41 @@
         <w:rPr>
           <w:lang w:val="es-ES"/>
         </w:rPr>
-        <w:t xml:space="preserve"> ml, volumen telesistólico </w:t>
-      </w:r>
-      <w:r>
-        <w:rPr>
-          <w:lang w:val="es-ES"/>
-        </w:rPr>
-        <w:t>{lvesv}</w:t>
+        <w:t xml:space="preserve"> ml, volumen </w:t>
+      </w:r>
+      <w:proofErr w:type="spellStart"/>
+      <w:r>
+        <w:rPr>
+          <w:lang w:val="es-ES"/>
+        </w:rPr>
+        <w:t>telesistólico</w:t>
+      </w:r>
+      <w:proofErr w:type="spellEnd"/>
+      <w:r>
+        <w:rPr>
+          <w:lang w:val="es-ES"/>
+        </w:rPr>
+        <w:t xml:space="preserve"> </w:t>
+      </w:r>
+      <w:r>
+        <w:rPr>
+          <w:lang w:val="es-ES"/>
+        </w:rPr>
+        <w:t>{</w:t>
+      </w:r>
+      <w:proofErr w:type="spellStart"/>
+      <w:r>
+        <w:rPr>
+          <w:lang w:val="es-ES"/>
+        </w:rPr>
+        <w:t>lvesv</w:t>
+      </w:r>
+      <w:proofErr w:type="spellEnd"/>
+      <w:r>
+        <w:rPr>
+          <w:lang w:val="es-ES"/>
+        </w:rPr>
+        <w:t>}</w:t>
       </w:r>
       <w:r>
         <w:rPr>
@@ -1037,12 +1392,14 @@
         </w:rPr>
         <w:t>{</w:t>
       </w:r>
+      <w:proofErr w:type="spellStart"/>
       <w:r>
         <w:rPr>
           <w:lang w:val="es-ES"/>
         </w:rPr>
         <w:t>lvef</w:t>
       </w:r>
+      <w:proofErr w:type="spellEnd"/>
       <w:r>
         <w:rPr>
           <w:lang w:val="es-ES"/>
@@ -1059,13 +1416,41 @@
         <w:rPr>
           <w:lang w:val="es-ES"/>
         </w:rPr>
-        <w:t xml:space="preserve">% por método biplano. Flujograma transmitral:  onda E: </w:t>
-      </w:r>
-      <w:r>
-        <w:rPr>
-          <w:lang w:val="es-ES"/>
-        </w:rPr>
-        <w:t>{eWave}</w:t>
+        <w:t xml:space="preserve">% por método biplano. Flujograma </w:t>
+      </w:r>
+      <w:proofErr w:type="spellStart"/>
+      <w:r>
+        <w:rPr>
+          <w:lang w:val="es-ES"/>
+        </w:rPr>
+        <w:t>transmitral</w:t>
+      </w:r>
+      <w:proofErr w:type="spellEnd"/>
+      <w:r>
+        <w:rPr>
+          <w:lang w:val="es-ES"/>
+        </w:rPr>
+        <w:t xml:space="preserve">:  onda E: </w:t>
+      </w:r>
+      <w:r>
+        <w:rPr>
+          <w:lang w:val="es-ES"/>
+        </w:rPr>
+        <w:t>{</w:t>
+      </w:r>
+      <w:proofErr w:type="spellStart"/>
+      <w:r>
+        <w:rPr>
+          <w:lang w:val="es-ES"/>
+        </w:rPr>
+        <w:t>eWave</w:t>
+      </w:r>
+      <w:proofErr w:type="spellEnd"/>
+      <w:r>
+        <w:rPr>
+          <w:lang w:val="es-ES"/>
+        </w:rPr>
+        <w:t>}</w:t>
       </w:r>
       <w:r>
         <w:rPr>
@@ -1077,7 +1462,21 @@
         <w:rPr>
           <w:lang w:val="es-ES"/>
         </w:rPr>
-        <w:t>{aWave}</w:t>
+        <w:t>{</w:t>
+      </w:r>
+      <w:proofErr w:type="spellStart"/>
+      <w:r>
+        <w:rPr>
+          <w:lang w:val="es-ES"/>
+        </w:rPr>
+        <w:t>aWave</w:t>
+      </w:r>
+      <w:proofErr w:type="spellEnd"/>
+      <w:r>
+        <w:rPr>
+          <w:lang w:val="es-ES"/>
+        </w:rPr>
+        <w:t>}</w:t>
       </w:r>
       <w:r>
         <w:rPr>
@@ -1089,7 +1488,21 @@
         <w:rPr>
           <w:lang w:val="es-ES"/>
         </w:rPr>
-        <w:t>{eaWaveRel}</w:t>
+        <w:t>{</w:t>
+      </w:r>
+      <w:proofErr w:type="spellStart"/>
+      <w:r>
+        <w:rPr>
+          <w:lang w:val="es-ES"/>
+        </w:rPr>
+        <w:t>eaWaveRel</w:t>
+      </w:r>
+      <w:proofErr w:type="spellEnd"/>
+      <w:r>
+        <w:rPr>
+          <w:lang w:val="es-ES"/>
+        </w:rPr>
+        <w:t>}</w:t>
       </w:r>
       <w:r>
         <w:rPr>
@@ -1101,25 +1514,21 @@
         <w:rPr>
           <w:lang w:val="es-ES"/>
         </w:rPr>
-        <w:t>{lvfdt}</w:t>
-      </w:r>
-      <w:r>
-        <w:rPr>
-          <w:lang w:val="es-ES"/>
-        </w:rPr>
-        <w:t xml:space="preserve"> mseg, TRIV </w:t>
-      </w:r>
-      <w:r>
-        <w:rPr>
-          <w:lang w:val="es-ES"/>
-        </w:rPr>
-        <w:t>{lfivrt}</w:t>
-      </w:r>
-      <w:r>
-        <w:rPr>
-          <w:lang w:val="es-ES"/>
-        </w:rPr>
-        <w:t xml:space="preserve"> mseg, Doppler tisular del anillo mitral onda e septal</w:t>
+        <w:t>{</w:t>
+      </w:r>
+      <w:proofErr w:type="spellStart"/>
+      <w:r>
+        <w:rPr>
+          <w:lang w:val="es-ES"/>
+        </w:rPr>
+        <w:t>lvfdt</w:t>
+      </w:r>
+      <w:proofErr w:type="spellEnd"/>
+      <w:r>
+        <w:rPr>
+          <w:lang w:val="es-ES"/>
+        </w:rPr>
+        <w:t>}</w:t>
       </w:r>
       <w:r>
         <w:rPr>
@@ -1127,23 +1536,139 @@
         </w:rPr>
         <w:t xml:space="preserve"> </w:t>
       </w:r>
-      <w:r>
-        <w:rPr>
-          <w:lang w:val="es-ES"/>
-        </w:rPr>
-        <w:t>{ePrimeSeptal}</w:t>
-      </w:r>
-      <w:r>
-        <w:rPr>
-          <w:lang w:val="es-ES"/>
-        </w:rPr>
-        <w:t xml:space="preserve"> cm/s, onda e lateral </w:t>
-      </w:r>
-      <w:r>
-        <w:rPr>
-          <w:lang w:val="es-ES"/>
-        </w:rPr>
-        <w:t>{ePrimeLateral}</w:t>
+      <w:proofErr w:type="spellStart"/>
+      <w:r>
+        <w:rPr>
+          <w:lang w:val="es-ES"/>
+        </w:rPr>
+        <w:t>mseg</w:t>
+      </w:r>
+      <w:proofErr w:type="spellEnd"/>
+      <w:r>
+        <w:rPr>
+          <w:lang w:val="es-ES"/>
+        </w:rPr>
+        <w:t xml:space="preserve">, TRIV </w:t>
+      </w:r>
+      <w:r>
+        <w:rPr>
+          <w:lang w:val="es-ES"/>
+        </w:rPr>
+        <w:t>{</w:t>
+      </w:r>
+      <w:proofErr w:type="spellStart"/>
+      <w:r>
+        <w:rPr>
+          <w:lang w:val="es-ES"/>
+        </w:rPr>
+        <w:t>lfivrt</w:t>
+      </w:r>
+      <w:proofErr w:type="spellEnd"/>
+      <w:r>
+        <w:rPr>
+          <w:lang w:val="es-ES"/>
+        </w:rPr>
+        <w:t>}</w:t>
+      </w:r>
+      <w:r>
+        <w:rPr>
+          <w:lang w:val="es-ES"/>
+        </w:rPr>
+        <w:t xml:space="preserve"> </w:t>
+      </w:r>
+      <w:proofErr w:type="spellStart"/>
+      <w:r>
+        <w:rPr>
+          <w:lang w:val="es-ES"/>
+        </w:rPr>
+        <w:t>mseg</w:t>
+      </w:r>
+      <w:proofErr w:type="spellEnd"/>
+      <w:r>
+        <w:rPr>
+          <w:lang w:val="es-ES"/>
+        </w:rPr>
+        <w:t xml:space="preserve">, Doppler tisular del anillo mitral onda </w:t>
+      </w:r>
+      <w:proofErr w:type="gramStart"/>
+      <w:r>
+        <w:rPr>
+          <w:lang w:val="es-ES"/>
+        </w:rPr>
+        <w:t>e</w:t>
+      </w:r>
+      <w:proofErr w:type="gramEnd"/>
+      <w:r>
+        <w:rPr>
+          <w:lang w:val="es-ES"/>
+        </w:rPr>
+        <w:t xml:space="preserve"> septal</w:t>
+      </w:r>
+      <w:r>
+        <w:rPr>
+          <w:lang w:val="es-ES"/>
+        </w:rPr>
+        <w:t xml:space="preserve"> </w:t>
+      </w:r>
+      <w:r>
+        <w:rPr>
+          <w:lang w:val="es-ES"/>
+        </w:rPr>
+        <w:t>{</w:t>
+      </w:r>
+      <w:proofErr w:type="spellStart"/>
+      <w:r>
+        <w:rPr>
+          <w:lang w:val="es-ES"/>
+        </w:rPr>
+        <w:t>ePrimeSeptal</w:t>
+      </w:r>
+      <w:proofErr w:type="spellEnd"/>
+      <w:r>
+        <w:rPr>
+          <w:lang w:val="es-ES"/>
+        </w:rPr>
+        <w:t>}</w:t>
+      </w:r>
+      <w:r>
+        <w:rPr>
+          <w:lang w:val="es-ES"/>
+        </w:rPr>
+        <w:t xml:space="preserve"> cm/s, onda </w:t>
+      </w:r>
+      <w:proofErr w:type="gramStart"/>
+      <w:r>
+        <w:rPr>
+          <w:lang w:val="es-ES"/>
+        </w:rPr>
+        <w:t>e</w:t>
+      </w:r>
+      <w:proofErr w:type="gramEnd"/>
+      <w:r>
+        <w:rPr>
+          <w:lang w:val="es-ES"/>
+        </w:rPr>
+        <w:t xml:space="preserve"> lateral </w:t>
+      </w:r>
+      <w:r>
+        <w:rPr>
+          <w:lang w:val="es-ES"/>
+        </w:rPr>
+        <w:t>{</w:t>
+      </w:r>
+      <w:proofErr w:type="spellStart"/>
+      <w:r>
+        <w:rPr>
+          <w:lang w:val="es-ES"/>
+        </w:rPr>
+        <w:t>ePrimeLateral</w:t>
+      </w:r>
+      <w:proofErr w:type="spellEnd"/>
+      <w:r>
+        <w:rPr>
+          <w:lang w:val="es-ES"/>
+        </w:rPr>
+        <w:t>}</w:t>
       </w:r>
       <w:r>
         <w:rPr>
@@ -1167,7 +1692,21 @@
         <w:rPr>
           <w:lang w:val="es-ES"/>
         </w:rPr>
-        <w:t>{eRatio}</w:t>
+        <w:t>{</w:t>
+      </w:r>
+      <w:proofErr w:type="spellStart"/>
+      <w:r>
+        <w:rPr>
+          <w:lang w:val="es-ES"/>
+        </w:rPr>
+        <w:t>eRatio</w:t>
+      </w:r>
+      <w:proofErr w:type="spellEnd"/>
+      <w:r>
+        <w:rPr>
+          <w:lang w:val="es-ES"/>
+        </w:rPr>
+        <w:t>}</w:t>
       </w:r>
       <w:r>
         <w:rPr>
@@ -1197,7 +1736,21 @@
         <w:rPr>
           <w:lang w:val="es-ES"/>
         </w:rPr>
-        <w:t xml:space="preserve">{lvotd} </w:t>
+        <w:t>{</w:t>
+      </w:r>
+      <w:proofErr w:type="spellStart"/>
+      <w:r>
+        <w:rPr>
+          <w:lang w:val="es-ES"/>
+        </w:rPr>
+        <w:t>lvotd</w:t>
+      </w:r>
+      <w:proofErr w:type="spellEnd"/>
+      <w:r>
+        <w:rPr>
+          <w:lang w:val="es-ES"/>
+        </w:rPr>
+        <w:t xml:space="preserve">} </w:t>
       </w:r>
       <w:r>
         <w:rPr>
@@ -1209,7 +1762,21 @@
         <w:rPr>
           <w:lang w:val="es-ES"/>
         </w:rPr>
-        <w:t>{lvar}</w:t>
+        <w:t>{</w:t>
+      </w:r>
+      <w:proofErr w:type="spellStart"/>
+      <w:r>
+        <w:rPr>
+          <w:lang w:val="es-ES"/>
+        </w:rPr>
+        <w:t>lvar</w:t>
+      </w:r>
+      <w:proofErr w:type="spellEnd"/>
+      <w:r>
+        <w:rPr>
+          <w:lang w:val="es-ES"/>
+        </w:rPr>
+        <w:t>}</w:t>
       </w:r>
       <w:r>
         <w:rPr>
@@ -1223,12 +1790,14 @@
         </w:rPr>
         <w:t>{</w:t>
       </w:r>
+      <w:proofErr w:type="spellStart"/>
       <w:r>
         <w:rPr>
           <w:lang w:val="es-ES"/>
         </w:rPr>
         <w:t>ilvar</w:t>
       </w:r>
+      <w:proofErr w:type="spellEnd"/>
       <w:r>
         <w:rPr>
           <w:lang w:val="es-ES"/>
@@ -1252,13 +1821,41 @@
         <w:rPr>
           <w:lang w:val="es-ES"/>
         </w:rPr>
-        <w:t xml:space="preserve"> diámetro unión sinotubular </w:t>
-      </w:r>
-      <w:r>
-        <w:rPr>
-          <w:lang w:val="es-ES"/>
-        </w:rPr>
-        <w:t>{lvstj}</w:t>
+        <w:t xml:space="preserve"> diámetro unión </w:t>
+      </w:r>
+      <w:proofErr w:type="spellStart"/>
+      <w:r>
+        <w:rPr>
+          <w:lang w:val="es-ES"/>
+        </w:rPr>
+        <w:t>sinotubular</w:t>
+      </w:r>
+      <w:proofErr w:type="spellEnd"/>
+      <w:r>
+        <w:rPr>
+          <w:lang w:val="es-ES"/>
+        </w:rPr>
+        <w:t xml:space="preserve"> </w:t>
+      </w:r>
+      <w:r>
+        <w:rPr>
+          <w:lang w:val="es-ES"/>
+        </w:rPr>
+        <w:t>{</w:t>
+      </w:r>
+      <w:proofErr w:type="spellStart"/>
+      <w:r>
+        <w:rPr>
+          <w:lang w:val="es-ES"/>
+        </w:rPr>
+        <w:t>lvstj</w:t>
+      </w:r>
+      <w:proofErr w:type="spellEnd"/>
+      <w:r>
+        <w:rPr>
+          <w:lang w:val="es-ES"/>
+        </w:rPr>
+        <w:t>}</w:t>
       </w:r>
       <w:r>
         <w:rPr>
@@ -1270,7 +1867,21 @@
         <w:rPr>
           <w:lang w:val="es-ES"/>
         </w:rPr>
-        <w:t>{lvaad}</w:t>
+        <w:t>{</w:t>
+      </w:r>
+      <w:proofErr w:type="spellStart"/>
+      <w:r>
+        <w:rPr>
+          <w:lang w:val="es-ES"/>
+        </w:rPr>
+        <w:t>lvaad</w:t>
+      </w:r>
+      <w:proofErr w:type="spellEnd"/>
+      <w:r>
+        <w:rPr>
+          <w:lang w:val="es-ES"/>
+        </w:rPr>
+        <w:t>}</w:t>
       </w:r>
       <w:r>
         <w:rPr>
@@ -1284,12 +1895,14 @@
         </w:rPr>
         <w:t>, indexada {</w:t>
       </w:r>
+      <w:proofErr w:type="spellStart"/>
       <w:r>
         <w:rPr>
           <w:lang w:val="es-ES"/>
         </w:rPr>
         <w:t>ilvaad</w:t>
       </w:r>
+      <w:proofErr w:type="spellEnd"/>
       <w:r>
         <w:rPr>
           <w:lang w:val="es-ES"/>
@@ -1302,6 +1915,7 @@
         </w:rPr>
         <w:t>m</w:t>
       </w:r>
+      <w:proofErr w:type="gramStart"/>
       <w:r>
         <w:rPr>
           <w:rFonts w:cstheme="minorHAnsi"/>
@@ -1321,7 +1935,24 @@
           <w:rFonts w:cstheme="minorHAnsi"/>
           <w:lang w:val="es-ES"/>
         </w:rPr>
-        <w:t>{obLeftVentricle}</w:t>
+        <w:t>{</w:t>
+      </w:r>
+      <w:proofErr w:type="spellStart"/>
+      <w:proofErr w:type="gramEnd"/>
+      <w:r>
+        <w:rPr>
+          <w:rFonts w:cstheme="minorHAnsi"/>
+          <w:lang w:val="es-ES"/>
+        </w:rPr>
+        <w:t>obLeftVentricle</w:t>
+      </w:r>
+      <w:proofErr w:type="spellEnd"/>
+      <w:r>
+        <w:rPr>
+          <w:rFonts w:cstheme="minorHAnsi"/>
+          <w:lang w:val="es-ES"/>
+        </w:rPr>
+        <w:t>}</w:t>
       </w:r>
     </w:p>
     <w:p>
@@ -1370,7 +2001,21 @@
         <w:rPr>
           <w:lang w:val="es-ES"/>
         </w:rPr>
-        <w:t>{rvbd}</w:t>
+        <w:t>{</w:t>
+      </w:r>
+      <w:proofErr w:type="spellStart"/>
+      <w:r>
+        <w:rPr>
+          <w:lang w:val="es-ES"/>
+        </w:rPr>
+        <w:t>rvbd</w:t>
+      </w:r>
+      <w:proofErr w:type="spellEnd"/>
+      <w:r>
+        <w:rPr>
+          <w:lang w:val="es-ES"/>
+        </w:rPr>
+        <w:t>}</w:t>
       </w:r>
       <w:r>
         <w:rPr>
@@ -1418,7 +2063,21 @@
         <w:rPr>
           <w:lang w:val="es-ES"/>
         </w:rPr>
-        <w:t xml:space="preserve">S tricuspidea </w:t>
+        <w:t xml:space="preserve">S </w:t>
+      </w:r>
+      <w:proofErr w:type="spellStart"/>
+      <w:r>
+        <w:rPr>
+          <w:lang w:val="es-ES"/>
+        </w:rPr>
+        <w:t>tricuspidea</w:t>
+      </w:r>
+      <w:proofErr w:type="spellEnd"/>
+      <w:r>
+        <w:rPr>
+          <w:lang w:val="es-ES"/>
+        </w:rPr>
+        <w:t xml:space="preserve"> </w:t>
       </w:r>
       <w:r>
         <w:t>{sWave}</w:t>
@@ -1432,6 +2091,7 @@
       <w:r>
         <w:t xml:space="preserve">{rvtapse} </w:t>
       </w:r>
+      <w:proofErr w:type="spellStart"/>
       <w:r>
         <w:rPr>
           <w:lang w:val="es-ES"/>
@@ -1442,7 +2102,28 @@
         <w:rPr>
           <w:lang w:val="es-ES"/>
         </w:rPr>
-        <w:t>. Área telediastólica VD</w:t>
+        <w:t>.</w:t>
+      </w:r>
+      <w:proofErr w:type="spellEnd"/>
+      <w:r>
+        <w:rPr>
+          <w:lang w:val="es-ES"/>
+        </w:rPr>
+        <w:t xml:space="preserve"> Área </w:t>
+      </w:r>
+      <w:proofErr w:type="spellStart"/>
+      <w:r>
+        <w:rPr>
+          <w:lang w:val="es-ES"/>
+        </w:rPr>
+        <w:t>telediastólica</w:t>
+      </w:r>
+      <w:proofErr w:type="spellEnd"/>
+      <w:r>
+        <w:rPr>
+          <w:lang w:val="es-ES"/>
+        </w:rPr>
+        <w:t xml:space="preserve"> VD</w:t>
       </w:r>
       <w:r>
         <w:rPr>
@@ -1470,7 +2151,21 @@
         <w:rPr>
           <w:lang w:val="es-ES"/>
         </w:rPr>
-        <w:t xml:space="preserve"> área telesistólica VD </w:t>
+        <w:t xml:space="preserve"> área </w:t>
+      </w:r>
+      <w:proofErr w:type="spellStart"/>
+      <w:r>
+        <w:rPr>
+          <w:lang w:val="es-ES"/>
+        </w:rPr>
+        <w:t>telesistólica</w:t>
+      </w:r>
+      <w:proofErr w:type="spellEnd"/>
+      <w:r>
+        <w:rPr>
+          <w:lang w:val="es-ES"/>
+        </w:rPr>
+        <w:t xml:space="preserve"> VD </w:t>
       </w:r>
       <w:r>
         <w:t>{rvesa}</w:t>
@@ -1534,21 +2229,45 @@
         <w:rPr>
           <w:lang w:val="es-ES"/>
         </w:rPr>
-        <w:t xml:space="preserve"> mm.</w:t>
-      </w:r>
+        <w:t xml:space="preserve"> </w:t>
+      </w:r>
+      <w:proofErr w:type="spellStart"/>
+      <w:r>
+        <w:rPr>
+          <w:lang w:val="es-ES"/>
+        </w:rPr>
+        <w:t>mm.</w:t>
+      </w:r>
+      <w:proofErr w:type="spellEnd"/>
       <w:r>
         <w:rPr>
           <w:rFonts w:cstheme="minorHAnsi"/>
           <w:lang w:val="es-ES"/>
         </w:rPr>
-        <w:t>{ob</w:t>
-      </w:r>
+        <w:t>{</w:t>
+      </w:r>
+      <w:proofErr w:type="spellStart"/>
       <w:r>
         <w:rPr>
           <w:rFonts w:cstheme="minorHAnsi"/>
           <w:lang w:val="es-ES"/>
         </w:rPr>
-        <w:t>RightVentricle}</w:t>
+        <w:t>ob</w:t>
+      </w:r>
+      <w:r>
+        <w:rPr>
+          <w:rFonts w:cstheme="minorHAnsi"/>
+          <w:lang w:val="es-ES"/>
+        </w:rPr>
+        <w:t>RightVentricle</w:t>
+      </w:r>
+      <w:proofErr w:type="spellEnd"/>
+      <w:r>
+        <w:rPr>
+          <w:rFonts w:cstheme="minorHAnsi"/>
+          <w:lang w:val="es-ES"/>
+        </w:rPr>
+        <w:t>}</w:t>
       </w:r>
     </w:p>
     <w:p>
@@ -1597,7 +2316,21 @@
         <w:rPr>
           <w:lang w:val="es-ES"/>
         </w:rPr>
-        <w:t>{laapd}</w:t>
+        <w:t>{</w:t>
+      </w:r>
+      <w:proofErr w:type="spellStart"/>
+      <w:r>
+        <w:rPr>
+          <w:lang w:val="es-ES"/>
+        </w:rPr>
+        <w:t>laapd</w:t>
+      </w:r>
+      <w:proofErr w:type="spellEnd"/>
+      <w:r>
+        <w:rPr>
+          <w:lang w:val="es-ES"/>
+        </w:rPr>
+        <w:t>}</w:t>
       </w:r>
       <w:r>
         <w:rPr>
@@ -1652,21 +2385,45 @@
         <w:rPr>
           <w:lang w:val="es-ES"/>
         </w:rPr>
-        <w:t>. No trombos en su interior.</w:t>
+        <w:t xml:space="preserve">. No trombos en su </w:t>
+      </w:r>
+      <w:proofErr w:type="gramStart"/>
+      <w:r>
+        <w:rPr>
+          <w:lang w:val="es-ES"/>
+        </w:rPr>
+        <w:t>interior.</w:t>
       </w:r>
       <w:r>
         <w:rPr>
           <w:rFonts w:cstheme="minorHAnsi"/>
           <w:lang w:val="es-ES"/>
         </w:rPr>
-        <w:t>{ob</w:t>
-      </w:r>
+        <w:t>{</w:t>
+      </w:r>
+      <w:proofErr w:type="spellStart"/>
+      <w:proofErr w:type="gramEnd"/>
       <w:r>
         <w:rPr>
           <w:rFonts w:cstheme="minorHAnsi"/>
           <w:lang w:val="es-ES"/>
         </w:rPr>
-        <w:t>LeftAtrium}</w:t>
+        <w:t>ob</w:t>
+      </w:r>
+      <w:r>
+        <w:rPr>
+          <w:rFonts w:cstheme="minorHAnsi"/>
+          <w:lang w:val="es-ES"/>
+        </w:rPr>
+        <w:t>LeftAtrium</w:t>
+      </w:r>
+      <w:proofErr w:type="spellEnd"/>
+      <w:r>
+        <w:rPr>
+          <w:rFonts w:cstheme="minorHAnsi"/>
+          <w:lang w:val="es-ES"/>
+        </w:rPr>
+        <w:t>}</w:t>
       </w:r>
     </w:p>
     <w:p>
@@ -1709,7 +2466,21 @@
         <w:rPr>
           <w:lang w:val="es-ES"/>
         </w:rPr>
-        <w:t>{raa}</w:t>
+        <w:t>{</w:t>
+      </w:r>
+      <w:proofErr w:type="spellStart"/>
+      <w:r>
+        <w:rPr>
+          <w:lang w:val="es-ES"/>
+        </w:rPr>
+        <w:t>raa</w:t>
+      </w:r>
+      <w:proofErr w:type="spellEnd"/>
+      <w:r>
+        <w:rPr>
+          <w:lang w:val="es-ES"/>
+        </w:rPr>
+        <w:t>}</w:t>
       </w:r>
       <w:r>
         <w:rPr>
@@ -1753,21 +2524,45 @@
         <w:rPr>
           <w:lang w:val="es-ES"/>
         </w:rPr>
-        <w:t>. No trombos en su interior.</w:t>
+        <w:t xml:space="preserve">. No trombos en su </w:t>
+      </w:r>
+      <w:proofErr w:type="gramStart"/>
+      <w:r>
+        <w:rPr>
+          <w:lang w:val="es-ES"/>
+        </w:rPr>
+        <w:t>interior.</w:t>
       </w:r>
       <w:r>
         <w:rPr>
           <w:rFonts w:cstheme="minorHAnsi"/>
           <w:lang w:val="es-ES"/>
         </w:rPr>
-        <w:t>{ob</w:t>
-      </w:r>
+        <w:t>{</w:t>
+      </w:r>
+      <w:proofErr w:type="spellStart"/>
+      <w:proofErr w:type="gramEnd"/>
       <w:r>
         <w:rPr>
           <w:rFonts w:cstheme="minorHAnsi"/>
           <w:lang w:val="es-ES"/>
         </w:rPr>
-        <w:t>RightAtrium}</w:t>
+        <w:t>ob</w:t>
+      </w:r>
+      <w:r>
+        <w:rPr>
+          <w:rFonts w:cstheme="minorHAnsi"/>
+          <w:lang w:val="es-ES"/>
+        </w:rPr>
+        <w:t>RightAtrium</w:t>
+      </w:r>
+      <w:proofErr w:type="spellEnd"/>
+      <w:r>
+        <w:rPr>
+          <w:rFonts w:cstheme="minorHAnsi"/>
+          <w:lang w:val="es-ES"/>
+        </w:rPr>
+        <w:t>}</w:t>
       </w:r>
     </w:p>
     <w:p>
@@ -1849,14 +2644,30 @@
           <w:rFonts w:cstheme="minorHAnsi"/>
           <w:lang w:val="es-ES"/>
         </w:rPr>
-        <w:t>{ob</w:t>
-      </w:r>
+        <w:t>{</w:t>
+      </w:r>
+      <w:proofErr w:type="spellStart"/>
       <w:r>
         <w:rPr>
           <w:rFonts w:cstheme="minorHAnsi"/>
           <w:lang w:val="es-ES"/>
         </w:rPr>
-        <w:t>MitralValve}</w:t>
+        <w:t>ob</w:t>
+      </w:r>
+      <w:r>
+        <w:rPr>
+          <w:rFonts w:cstheme="minorHAnsi"/>
+          <w:lang w:val="es-ES"/>
+        </w:rPr>
+        <w:t>MitralValve</w:t>
+      </w:r>
+      <w:proofErr w:type="spellEnd"/>
+      <w:r>
+        <w:rPr>
+          <w:rFonts w:cstheme="minorHAnsi"/>
+          <w:lang w:val="es-ES"/>
+        </w:rPr>
+        <w:t>}</w:t>
       </w:r>
     </w:p>
     <w:p>
@@ -1986,14 +2797,30 @@
           <w:rFonts w:cstheme="minorHAnsi"/>
           <w:lang w:val="es-ES"/>
         </w:rPr>
-        <w:t>{ob</w:t>
-      </w:r>
+        <w:t>{</w:t>
+      </w:r>
+      <w:proofErr w:type="spellStart"/>
       <w:r>
         <w:rPr>
           <w:rFonts w:cstheme="minorHAnsi"/>
           <w:lang w:val="es-ES"/>
         </w:rPr>
-        <w:t>AorticValve}</w:t>
+        <w:t>ob</w:t>
+      </w:r>
+      <w:r>
+        <w:rPr>
+          <w:rFonts w:cstheme="minorHAnsi"/>
+          <w:lang w:val="es-ES"/>
+        </w:rPr>
+        <w:t>AorticValve</w:t>
+      </w:r>
+      <w:proofErr w:type="spellEnd"/>
+      <w:r>
+        <w:rPr>
+          <w:rFonts w:cstheme="minorHAnsi"/>
+          <w:lang w:val="es-ES"/>
+        </w:rPr>
+        <w:t>}</w:t>
       </w:r>
     </w:p>
     <w:p>
@@ -2023,20 +2850,52 @@
           <w:bCs/>
           <w:lang w:val="es-ES"/>
         </w:rPr>
-        <w:t xml:space="preserve">de morfología normal, sin alteraciones del flujo, Vmax VP </w:t>
-      </w:r>
+        <w:t xml:space="preserve">de morfología normal, sin alteraciones del flujo, </w:t>
+      </w:r>
+      <w:proofErr w:type="spellStart"/>
       <w:r>
         <w:rPr>
           <w:bCs/>
           <w:lang w:val="es-ES"/>
         </w:rPr>
-        <w:t>{pvvmax}</w:t>
-      </w:r>
+        <w:t>Vmax</w:t>
+      </w:r>
+      <w:proofErr w:type="spellEnd"/>
       <w:r>
         <w:rPr>
           <w:bCs/>
           <w:lang w:val="es-ES"/>
         </w:rPr>
+        <w:t xml:space="preserve"> VP </w:t>
+      </w:r>
+      <w:r>
+        <w:rPr>
+          <w:bCs/>
+          <w:lang w:val="es-ES"/>
+        </w:rPr>
+        <w:t>{</w:t>
+      </w:r>
+      <w:proofErr w:type="spellStart"/>
+      <w:r>
+        <w:rPr>
+          <w:bCs/>
+          <w:lang w:val="es-ES"/>
+        </w:rPr>
+        <w:t>pvvmax</w:t>
+      </w:r>
+      <w:proofErr w:type="spellEnd"/>
+      <w:r>
+        <w:rPr>
+          <w:bCs/>
+          <w:lang w:val="es-ES"/>
+        </w:rPr>
+        <w:t>}</w:t>
+      </w:r>
+      <w:r>
+        <w:rPr>
+          <w:bCs/>
+          <w:lang w:val="es-ES"/>
+        </w:rPr>
         <w:t xml:space="preserve"> cm/s, IVT TSVD</w:t>
       </w:r>
       <w:r>
@@ -2051,13 +2910,29 @@
           <w:bCs/>
           <w:lang w:val="es-ES"/>
         </w:rPr>
-        <w:t>{rvotvti}</w:t>
-      </w:r>
+        <w:t>{</w:t>
+      </w:r>
+      <w:proofErr w:type="spellStart"/>
       <w:r>
         <w:rPr>
           <w:bCs/>
           <w:lang w:val="es-ES"/>
         </w:rPr>
+        <w:t>rvotvti</w:t>
+      </w:r>
+      <w:proofErr w:type="spellEnd"/>
+      <w:r>
+        <w:rPr>
+          <w:bCs/>
+          <w:lang w:val="es-ES"/>
+        </w:rPr>
+        <w:t>}</w:t>
+      </w:r>
+      <w:r>
+        <w:rPr>
+          <w:bCs/>
+          <w:lang w:val="es-ES"/>
+        </w:rPr>
         <w:t xml:space="preserve"> </w:t>
       </w:r>
       <w:r>
@@ -2072,20 +2947,52 @@
           <w:bCs/>
           <w:lang w:val="es-ES"/>
         </w:rPr>
-        <w:t>{pvat}</w:t>
-      </w:r>
+        <w:t>{</w:t>
+      </w:r>
+      <w:proofErr w:type="spellStart"/>
       <w:r>
         <w:rPr>
           <w:bCs/>
           <w:lang w:val="es-ES"/>
         </w:rPr>
-        <w:t xml:space="preserve"> msegs. No estenosis. </w:t>
-      </w:r>
+        <w:t>pvat</w:t>
+      </w:r>
+      <w:proofErr w:type="spellEnd"/>
       <w:r>
         <w:rPr>
           <w:bCs/>
           <w:lang w:val="es-ES"/>
         </w:rPr>
+        <w:t>}</w:t>
+      </w:r>
+      <w:r>
+        <w:rPr>
+          <w:bCs/>
+          <w:lang w:val="es-ES"/>
+        </w:rPr>
+        <w:t xml:space="preserve"> </w:t>
+      </w:r>
+      <w:proofErr w:type="spellStart"/>
+      <w:r>
+        <w:rPr>
+          <w:bCs/>
+          <w:lang w:val="es-ES"/>
+        </w:rPr>
+        <w:t>msegs</w:t>
+      </w:r>
+      <w:proofErr w:type="spellEnd"/>
+      <w:r>
+        <w:rPr>
+          <w:bCs/>
+          <w:lang w:val="es-ES"/>
+        </w:rPr>
+        <w:t xml:space="preserve">. No estenosis. </w:t>
+      </w:r>
+      <w:r>
+        <w:rPr>
+          <w:bCs/>
+          <w:lang w:val="es-ES"/>
+        </w:rPr>
         <w:t xml:space="preserve">Arteria pulmonar principal </w:t>
       </w:r>
       <w:r>
@@ -2107,13 +3014,29 @@
           <w:bCs/>
           <w:lang w:val="es-ES"/>
         </w:rPr>
-        <w:t>{pvd}</w:t>
-      </w:r>
+        <w:t>{</w:t>
+      </w:r>
+      <w:proofErr w:type="spellStart"/>
       <w:r>
         <w:rPr>
           <w:bCs/>
           <w:lang w:val="es-ES"/>
         </w:rPr>
+        <w:t>pvd</w:t>
+      </w:r>
+      <w:proofErr w:type="spellEnd"/>
+      <w:r>
+        <w:rPr>
+          <w:bCs/>
+          <w:lang w:val="es-ES"/>
+        </w:rPr>
+        <w:t>}</w:t>
+      </w:r>
+      <w:r>
+        <w:rPr>
+          <w:bCs/>
+          <w:lang w:val="es-ES"/>
+        </w:rPr>
         <w:t xml:space="preserve"> </w:t>
       </w:r>
       <w:r>
@@ -2134,14 +3057,30 @@
           <w:rFonts w:cstheme="minorHAnsi"/>
           <w:lang w:val="es-ES"/>
         </w:rPr>
-        <w:t>{ob</w:t>
-      </w:r>
+        <w:t>{</w:t>
+      </w:r>
+      <w:proofErr w:type="spellStart"/>
       <w:r>
         <w:rPr>
           <w:rFonts w:cstheme="minorHAnsi"/>
           <w:lang w:val="es-ES"/>
         </w:rPr>
-        <w:t>PulmonaryValve}</w:t>
+        <w:t>ob</w:t>
+      </w:r>
+      <w:r>
+        <w:rPr>
+          <w:rFonts w:cstheme="minorHAnsi"/>
+          <w:lang w:val="es-ES"/>
+        </w:rPr>
+        <w:t>PulmonaryValve</w:t>
+      </w:r>
+      <w:proofErr w:type="spellEnd"/>
+      <w:r>
+        <w:rPr>
+          <w:rFonts w:cstheme="minorHAnsi"/>
+          <w:lang w:val="es-ES"/>
+        </w:rPr>
+        <w:t>}</w:t>
       </w:r>
     </w:p>
     <w:p>
@@ -2184,8 +3123,16 @@
         <w:rPr>
           <w:lang w:val="es-ES"/>
         </w:rPr>
-        <w:t>, Vmax</w:t>
-      </w:r>
+        <w:t xml:space="preserve">, </w:t>
+      </w:r>
+      <w:proofErr w:type="spellStart"/>
+      <w:r>
+        <w:rPr>
+          <w:lang w:val="es-ES"/>
+        </w:rPr>
+        <w:t>Vmax</w:t>
+      </w:r>
+      <w:proofErr w:type="spellEnd"/>
       <w:r>
         <w:rPr>
           <w:lang w:val="es-ES"/>
@@ -2202,7 +3149,21 @@
         <w:rPr>
           <w:lang w:val="es-ES"/>
         </w:rPr>
-        <w:t>{trvmax}</w:t>
+        <w:t>{</w:t>
+      </w:r>
+      <w:proofErr w:type="spellStart"/>
+      <w:r>
+        <w:rPr>
+          <w:lang w:val="es-ES"/>
+        </w:rPr>
+        <w:t>trvmax</w:t>
+      </w:r>
+      <w:proofErr w:type="spellEnd"/>
+      <w:r>
+        <w:rPr>
+          <w:lang w:val="es-ES"/>
+        </w:rPr>
+        <w:t>}</w:t>
       </w:r>
       <w:r>
         <w:rPr>
@@ -2214,13 +3175,41 @@
         <w:rPr>
           <w:lang w:val="es-ES"/>
         </w:rPr>
-        <w:t>{trMaxGrad}</w:t>
-      </w:r>
-      <w:r>
-        <w:rPr>
-          <w:lang w:val="es-ES"/>
-        </w:rPr>
-        <w:t xml:space="preserve"> mmHg, vena cava inferior </w:t>
+        <w:t>{</w:t>
+      </w:r>
+      <w:proofErr w:type="spellStart"/>
+      <w:r>
+        <w:rPr>
+          <w:lang w:val="es-ES"/>
+        </w:rPr>
+        <w:t>trMaxGrad</w:t>
+      </w:r>
+      <w:proofErr w:type="spellEnd"/>
+      <w:r>
+        <w:rPr>
+          <w:lang w:val="es-ES"/>
+        </w:rPr>
+        <w:t>}</w:t>
+      </w:r>
+      <w:r>
+        <w:rPr>
+          <w:lang w:val="es-ES"/>
+        </w:rPr>
+        <w:t xml:space="preserve"> </w:t>
+      </w:r>
+      <w:proofErr w:type="spellStart"/>
+      <w:r>
+        <w:rPr>
+          <w:lang w:val="es-ES"/>
+        </w:rPr>
+        <w:t>mmHg</w:t>
+      </w:r>
+      <w:proofErr w:type="spellEnd"/>
+      <w:r>
+        <w:rPr>
+          <w:lang w:val="es-ES"/>
+        </w:rPr>
+        <w:t xml:space="preserve">, vena cava inferior </w:t>
       </w:r>
       <w:r>
         <w:rPr>
@@ -2244,7 +3233,21 @@
         <w:rPr>
           <w:lang w:val="es-ES"/>
         </w:rPr>
-        <w:t>{ivcMaxDiam}</w:t>
+        <w:t>{</w:t>
+      </w:r>
+      <w:proofErr w:type="spellStart"/>
+      <w:r>
+        <w:rPr>
+          <w:lang w:val="es-ES"/>
+        </w:rPr>
+        <w:t>ivcMaxDiam</w:t>
+      </w:r>
+      <w:proofErr w:type="spellEnd"/>
+      <w:r>
+        <w:rPr>
+          <w:lang w:val="es-ES"/>
+        </w:rPr>
+        <w:t>}</w:t>
       </w:r>
       <w:r>
         <w:rPr>
@@ -2274,7 +3277,21 @@
         <w:rPr>
           <w:lang w:val="es-ES"/>
         </w:rPr>
-        <w:t xml:space="preserve">{ivcci} </w:t>
+        <w:t>{</w:t>
+      </w:r>
+      <w:proofErr w:type="spellStart"/>
+      <w:r>
+        <w:rPr>
+          <w:lang w:val="es-ES"/>
+        </w:rPr>
+        <w:t>ivcci</w:t>
+      </w:r>
+      <w:proofErr w:type="spellEnd"/>
+      <w:r>
+        <w:rPr>
+          <w:lang w:val="es-ES"/>
+        </w:rPr>
+        <w:t xml:space="preserve">} </w:t>
       </w:r>
       <w:r>
         <w:rPr>
@@ -2286,27 +3303,73 @@
         <w:rPr>
           <w:lang w:val="es-ES"/>
         </w:rPr>
-        <w:t>{psap}</w:t>
-      </w:r>
-      <w:r>
-        <w:rPr>
-          <w:lang w:val="es-ES"/>
-        </w:rPr>
-        <w:t xml:space="preserve"> mmHg.</w:t>
+        <w:t>{</w:t>
+      </w:r>
+      <w:proofErr w:type="spellStart"/>
+      <w:r>
+        <w:rPr>
+          <w:lang w:val="es-ES"/>
+        </w:rPr>
+        <w:t>psap</w:t>
+      </w:r>
+      <w:proofErr w:type="spellEnd"/>
+      <w:r>
+        <w:rPr>
+          <w:lang w:val="es-ES"/>
+        </w:rPr>
+        <w:t>}</w:t>
+      </w:r>
+      <w:r>
+        <w:rPr>
+          <w:lang w:val="es-ES"/>
+        </w:rPr>
+        <w:t xml:space="preserve"> </w:t>
+      </w:r>
+      <w:proofErr w:type="spellStart"/>
+      <w:proofErr w:type="gramStart"/>
+      <w:r>
+        <w:rPr>
+          <w:lang w:val="es-ES"/>
+        </w:rPr>
+        <w:t>mmHg</w:t>
+      </w:r>
+      <w:proofErr w:type="spellEnd"/>
+      <w:r>
+        <w:rPr>
+          <w:lang w:val="es-ES"/>
+        </w:rPr>
+        <w:t>.</w:t>
       </w:r>
       <w:r>
         <w:rPr>
           <w:rFonts w:cstheme="minorHAnsi"/>
           <w:lang w:val="es-ES"/>
         </w:rPr>
-        <w:t>{ob</w:t>
-      </w:r>
+        <w:t>{</w:t>
+      </w:r>
+      <w:proofErr w:type="spellStart"/>
+      <w:proofErr w:type="gramEnd"/>
       <w:r>
         <w:rPr>
           <w:rFonts w:cstheme="minorHAnsi"/>
           <w:lang w:val="es-ES"/>
         </w:rPr>
-        <w:t>TricuspideValve}</w:t>
+        <w:t>ob</w:t>
+      </w:r>
+      <w:r>
+        <w:rPr>
+          <w:rFonts w:cstheme="minorHAnsi"/>
+          <w:lang w:val="es-ES"/>
+        </w:rPr>
+        <w:t>TricuspidValve</w:t>
+      </w:r>
+      <w:proofErr w:type="spellEnd"/>
+      <w:r>
+        <w:rPr>
+          <w:rFonts w:cstheme="minorHAnsi"/>
+          <w:lang w:val="es-ES"/>
+        </w:rPr>
+        <w:t>}</w:t>
       </w:r>
     </w:p>
     <w:p>
@@ -2441,7 +3504,21 @@
         <w:rPr>
           <w:lang w:val="es-ES"/>
         </w:rPr>
-        <w:t>{lvefInt}</w:t>
+        <w:t>{</w:t>
+      </w:r>
+      <w:proofErr w:type="spellStart"/>
+      <w:r>
+        <w:rPr>
+          <w:lang w:val="es-ES"/>
+        </w:rPr>
+        <w:t>lvefInt</w:t>
+      </w:r>
+      <w:proofErr w:type="spellEnd"/>
+      <w:r>
+        <w:rPr>
+          <w:lang w:val="es-ES"/>
+        </w:rPr>
+        <w:t>}</w:t>
       </w:r>
       <w:r>
         <w:rPr>
@@ -2519,7 +3596,21 @@
         <w:rPr>
           <w:lang w:val="es-ES"/>
         </w:rPr>
-        <w:t>{rvtapse}</w:t>
+        <w:t>{</w:t>
+      </w:r>
+      <w:proofErr w:type="spellStart"/>
+      <w:r>
+        <w:rPr>
+          <w:lang w:val="es-ES"/>
+        </w:rPr>
+        <w:t>rvtapse</w:t>
+      </w:r>
+      <w:proofErr w:type="spellEnd"/>
+      <w:r>
+        <w:rPr>
+          <w:lang w:val="es-ES"/>
+        </w:rPr>
+        <w:t>}</w:t>
       </w:r>
       <w:r>
         <w:rPr>
@@ -2537,7 +3628,21 @@
         <w:rPr>
           <w:lang w:val="es-ES"/>
         </w:rPr>
-        <w:t>{sWave}</w:t>
+        <w:t>{</w:t>
+      </w:r>
+      <w:proofErr w:type="spellStart"/>
+      <w:r>
+        <w:rPr>
+          <w:lang w:val="es-ES"/>
+        </w:rPr>
+        <w:t>sWave</w:t>
+      </w:r>
+      <w:proofErr w:type="spellEnd"/>
+      <w:r>
+        <w:rPr>
+          <w:lang w:val="es-ES"/>
+        </w:rPr>
+        <w:t>}</w:t>
       </w:r>
       <w:r>
         <w:rPr>
@@ -2555,7 +3660,21 @@
         <w:rPr>
           <w:lang w:val="es-ES"/>
         </w:rPr>
-        <w:t>{rvfacInt}</w:t>
+        <w:t>{</w:t>
+      </w:r>
+      <w:proofErr w:type="spellStart"/>
+      <w:r>
+        <w:rPr>
+          <w:lang w:val="es-ES"/>
+        </w:rPr>
+        <w:t>rvfacInt</w:t>
+      </w:r>
+      <w:proofErr w:type="spellEnd"/>
+      <w:r>
+        <w:rPr>
+          <w:lang w:val="es-ES"/>
+        </w:rPr>
+        <w:t>}</w:t>
       </w:r>
       <w:r>
         <w:rPr>
@@ -2652,13 +3771,41 @@
         <w:rPr>
           <w:lang w:val="es-ES"/>
         </w:rPr>
-        <w:t>{pasp}</w:t>
-      </w:r>
-      <w:r>
-        <w:rPr>
-          <w:lang w:val="es-ES"/>
-        </w:rPr>
-        <w:t xml:space="preserve"> mmHg. </w:t>
+        <w:t>{</w:t>
+      </w:r>
+      <w:proofErr w:type="spellStart"/>
+      <w:r>
+        <w:rPr>
+          <w:lang w:val="es-ES"/>
+        </w:rPr>
+        <w:t>pasp</w:t>
+      </w:r>
+      <w:proofErr w:type="spellEnd"/>
+      <w:r>
+        <w:rPr>
+          <w:lang w:val="es-ES"/>
+        </w:rPr>
+        <w:t>}</w:t>
+      </w:r>
+      <w:r>
+        <w:rPr>
+          <w:lang w:val="es-ES"/>
+        </w:rPr>
+        <w:t xml:space="preserve"> </w:t>
+      </w:r>
+      <w:proofErr w:type="spellStart"/>
+      <w:r>
+        <w:rPr>
+          <w:lang w:val="es-ES"/>
+        </w:rPr>
+        <w:t>mmHg</w:t>
+      </w:r>
+      <w:proofErr w:type="spellEnd"/>
+      <w:r>
+        <w:rPr>
+          <w:lang w:val="es-ES"/>
+        </w:rPr>
+        <w:t xml:space="preserve">. </w:t>
       </w:r>
     </w:p>
     <w:p>
@@ -2747,10 +3894,10 @@
           <w:u w:val="single"/>
         </w:rPr>
         <w:drawing>
-          <wp:inline distT="0" distB="0" distL="0" distR="0" wp14:anchorId="1D7AD5F5" wp14:editId="0C6EEAA7">
-            <wp:extent cx="2860040" cy="1283970"/>
+          <wp:inline distT="0" distB="0" distL="0" distR="0" wp14:anchorId="1D7AD5F5" wp14:editId="6DB25C5F">
+            <wp:extent cx="1727694" cy="1283970"/>
             <wp:effectExtent l="0" t="0" r="0" b="0"/>
-            <wp:docPr id="9" name="Imagen 9" descr="Diagrama&#10;&#10;Descripción generada automáticamente"/>
+            <wp:docPr id="9" name="Imagen 9"/>
             <wp:cNvGraphicFramePr>
               <a:graphicFrameLocks xmlns:a="http://schemas.openxmlformats.org/drawingml/2006/main" noChangeAspect="1"/>
             </wp:cNvGraphicFramePr>
@@ -2758,20 +3905,19 @@
               <a:graphicData uri="http://schemas.openxmlformats.org/drawingml/2006/picture">
                 <pic:pic xmlns:pic="http://schemas.openxmlformats.org/drawingml/2006/picture">
                   <pic:nvPicPr>
-                    <pic:cNvPr id="9" name="Imagen 9" descr="Diagrama&#10;&#10;Descripción generada automáticamente"/>
+                    <pic:cNvPr id="9" name="Imagen 9"/>
                     <pic:cNvPicPr>
                       <a:picLocks noChangeAspect="1"/>
                     </pic:cNvPicPr>
                   </pic:nvPicPr>
                   <pic:blipFill>
-                    <a:blip r:embed="rId7">
+                    <a:blip r:embed="rId7" cstate="print">
                       <a:extLst>
                         <a:ext uri="{28A0092B-C50C-407E-A947-70E740481C1C}">
                           <a14:useLocalDpi xmlns:a14="http://schemas.microsoft.com/office/drawing/2010/main" val="0"/>
                         </a:ext>
                       </a:extLst>
                     </a:blip>
-                    <a:srcRect/>
                     <a:stretch>
                       <a:fillRect/>
                     </a:stretch>
@@ -2779,7 +3925,7 @@
                   <pic:spPr bwMode="auto">
                     <a:xfrm>
                       <a:off x="0" y="0"/>
-                      <a:ext cx="2860040" cy="1283970"/>
+                      <a:ext cx="1727694" cy="1283970"/>
                     </a:xfrm>
                     <a:prstGeom prst="rect">
                       <a:avLst/>
@@ -3081,6 +4227,7 @@
         <w:lang w:val="it-IT"/>
       </w:rPr>
     </w:pPr>
+    <w:proofErr w:type="spellStart"/>
     <w:r>
       <w:rPr>
         <w:rFonts w:ascii="Agency FB" w:hAnsi="Agency FB"/>
@@ -3090,7 +4237,19 @@
         <w:szCs w:val="18"/>
         <w:lang w:val="it-IT"/>
       </w:rPr>
-      <w:t>Citas al 54923219</w:t>
+      <w:t>Citas</w:t>
+    </w:r>
+    <w:proofErr w:type="spellEnd"/>
+    <w:r>
+      <w:rPr>
+        <w:rFonts w:ascii="Agency FB" w:hAnsi="Agency FB"/>
+        <w:b/>
+        <w:bCs/>
+        <w:sz w:val="18"/>
+        <w:szCs w:val="18"/>
+        <w:lang w:val="it-IT"/>
+      </w:rPr>
+      <w:t xml:space="preserve"> al 54923219</w:t>
     </w:r>
   </w:p>
 </w:ftr>
@@ -3874,7 +5033,27 @@
         <w:szCs w:val="48"/>
         <w:lang w:val="es-ES"/>
       </w:rPr>
-      <w:t>. Luis José Olá Ruiz</w:t>
+      <w:t xml:space="preserve">. Luis José </w:t>
+    </w:r>
+    <w:proofErr w:type="spellStart"/>
+    <w:r>
+      <w:rPr>
+        <w:rFonts w:ascii="Brush Script MT" w:hAnsi="Brush Script MT"/>
+        <w:sz w:val="48"/>
+        <w:szCs w:val="48"/>
+        <w:lang w:val="es-ES"/>
+      </w:rPr>
+      <w:t>Olá</w:t>
+    </w:r>
+    <w:proofErr w:type="spellEnd"/>
+    <w:r>
+      <w:rPr>
+        <w:rFonts w:ascii="Brush Script MT" w:hAnsi="Brush Script MT"/>
+        <w:sz w:val="48"/>
+        <w:szCs w:val="48"/>
+        <w:lang w:val="es-ES"/>
+      </w:rPr>
+      <w:t xml:space="preserve"> Ruiz</w:t>
     </w:r>
     <w:r>
       <w:rPr>

</xml_diff>